<commit_message>
Optimize answer space widths to match expected answer lengths
- §1 A/B: small boxes (1.8cm) for single-character ①②③ answers
- §1 C: wider word boxes (2.65cm/word) in 2-row layout for dictation blanks
- §3 A: 1-question-per-row (full 17.3cm) for complete sentence rearrangement answers
- §3 B: 2-column layout with 2.8cm boxes per word for 1-3 word fill-ins
- §5: full-width answer rows (8.3cm) in 2-column layout for sentence answers
- §6 Q1/2/5: compact 1.5cm answer cells for single-letter A/B/C/D selections
- §6 Q3: 1.6cm answer cells for single S/A letter answers

https://claude.ai/code/session_01H92aASVAdh5CWUTRq4hYds
</commit_message>
<xml_diff>
--- a/2026年度_論理表現Ⅱ_中間テスト_解答用紙.docx
+++ b/2026年度_論理表現Ⅱ_中間テスト_解答用紙.docx
@@ -132,6 +132,19 @@
         <w:t>１　（思考・判断・表現　14点）</w:t>
       </w:r>
     </w:p>
+    <w:p>
+      <w:pPr>
+        <w:spacing w:before="40" w:after="20"/>
+      </w:pPr>
+      <w:r>
+        <w:rPr>
+          <w:rFonts w:ascii="MS Gothic" w:hAnsi="MS Gothic" w:eastAsia="MS Gothic"/>
+          <w:b w:val="0"/>
+          <w:sz w:val="17"/>
+        </w:rPr>
+        <w:t>A（2点）　　　　　　　　　　　　　B（2点）　　各①〜③から選択</w:t>
+      </w:r>
+    </w:p>
     <w:tbl>
       <w:tblPr>
         <w:tblStyle w:val="TableGrid"/>
@@ -149,11 +162,11 @@
       </w:tblGrid>
       <w:tr>
         <w:trPr>
-          <w:trHeight w:val="249" w:hRule="exact"/>
+          <w:trHeight w:val="396" w:hRule="exact"/>
         </w:trPr>
         <w:tc>
           <w:tcPr>
-            <w:tcW w:type="dxa" w:w="1134"/>
+            <w:tcW w:type="dxa" w:w="1417"/>
             <w:vAlign w:val="center"/>
             <w:shd w:val="clear" w:color="auto" w:fill="D9D9D9"/>
           </w:tcPr>
@@ -168,13 +181,13 @@
                 <w:b/>
                 <w:sz w:val="16"/>
               </w:rPr>
-              <w:t>A（2点）</w:t>
+              <w:t>Aの答え</w:t>
             </w:r>
           </w:p>
         </w:tc>
         <w:tc>
           <w:tcPr>
-            <w:tcW w:type="dxa" w:w="1134"/>
+            <w:tcW w:type="dxa" w:w="1020"/>
             <w:vAlign w:val="center"/>
           </w:tcPr>
           <w:p>
@@ -193,7 +206,7 @@
         </w:tc>
         <w:tc>
           <w:tcPr>
-            <w:tcW w:type="dxa" w:w="227"/>
+            <w:tcW w:type="dxa" w:w="283"/>
             <w:tcBorders>
               <w:top w:val="none" w:sz="0" w:space="0" w:color="auto"/>
               <w:left w:val="none" w:sz="0" w:space="0" w:color="auto"/>
@@ -207,7 +220,7 @@
         </w:tc>
         <w:tc>
           <w:tcPr>
-            <w:tcW w:type="dxa" w:w="1134"/>
+            <w:tcW w:type="dxa" w:w="1417"/>
             <w:vAlign w:val="center"/>
             <w:shd w:val="clear" w:color="auto" w:fill="D9D9D9"/>
           </w:tcPr>
@@ -222,13 +235,13 @@
                 <w:b/>
                 <w:sz w:val="16"/>
               </w:rPr>
-              <w:t>B（2点）</w:t>
+              <w:t>Bの答え</w:t>
             </w:r>
           </w:p>
         </w:tc>
         <w:tc>
           <w:tcPr>
-            <w:tcW w:type="dxa" w:w="1134"/>
+            <w:tcW w:type="dxa" w:w="1020"/>
             <w:vAlign w:val="center"/>
           </w:tcPr>
           <w:p>
@@ -247,118 +260,7 @@
         </w:tc>
         <w:tc>
           <w:tcPr>
-            <w:tcW w:type="dxa" w:w="5443"/>
-            <w:tcBorders>
-              <w:top w:val="none" w:sz="0" w:space="0" w:color="auto"/>
-              <w:left w:val="none" w:sz="0" w:space="0" w:color="auto"/>
-              <w:bottom w:val="none" w:sz="0" w:space="0" w:color="auto"/>
-              <w:right w:val="none" w:sz="0" w:space="0" w:color="auto"/>
-              <w:insideH w:val="none" w:sz="0" w:space="0" w:color="auto"/>
-              <w:insideV w:val="none" w:sz="0" w:space="0" w:color="auto"/>
-            </w:tcBorders>
-          </w:tcPr>
-          <w:p/>
-        </w:tc>
-      </w:tr>
-      <w:tr>
-        <w:trPr>
-          <w:trHeight w:val="385" w:hRule="exact"/>
-        </w:trPr>
-        <w:tc>
-          <w:tcPr>
-            <w:tcW w:type="dxa" w:w="1134"/>
-            <w:vAlign w:val="center"/>
-          </w:tcPr>
-          <w:p>
-            <w:pPr>
-              <w:spacing w:before="0" w:after="0"/>
-              <w:jc w:val="center"/>
-            </w:pPr>
-            <w:r>
-              <w:rPr>
-                <w:rFonts w:ascii="MS Gothic" w:hAnsi="MS Gothic" w:eastAsia="MS Gothic"/>
-                <w:b w:val="0"/>
-                <w:sz w:val="15"/>
-              </w:rPr>
-              <w:t>答え</w:t>
-            </w:r>
-          </w:p>
-        </w:tc>
-        <w:tc>
-          <w:tcPr>
-            <w:tcW w:type="dxa" w:w="1134"/>
-            <w:vAlign w:val="center"/>
-          </w:tcPr>
-          <w:p>
-            <w:pPr>
-              <w:spacing w:before="0" w:after="0"/>
-              <w:jc w:val="center"/>
-            </w:pPr>
-            <w:r>
-              <w:rPr>
-                <w:rFonts w:ascii="MS Gothic" w:hAnsi="MS Gothic" w:eastAsia="MS Gothic"/>
-                <w:b w:val="0"/>
-                <w:sz w:val="18"/>
-              </w:rPr>
-            </w:r>
-          </w:p>
-        </w:tc>
-        <w:tc>
-          <w:tcPr>
-            <w:tcW w:type="dxa" w:w="227"/>
-            <w:tcBorders>
-              <w:top w:val="none" w:sz="0" w:space="0" w:color="auto"/>
-              <w:left w:val="none" w:sz="0" w:space="0" w:color="auto"/>
-              <w:bottom w:val="none" w:sz="0" w:space="0" w:color="auto"/>
-              <w:right w:val="none" w:sz="0" w:space="0" w:color="auto"/>
-              <w:insideH w:val="none" w:sz="0" w:space="0" w:color="auto"/>
-              <w:insideV w:val="none" w:sz="0" w:space="0" w:color="auto"/>
-            </w:tcBorders>
-          </w:tcPr>
-          <w:p/>
-        </w:tc>
-        <w:tc>
-          <w:tcPr>
-            <w:tcW w:type="dxa" w:w="1134"/>
-            <w:vAlign w:val="center"/>
-          </w:tcPr>
-          <w:p>
-            <w:pPr>
-              <w:spacing w:before="0" w:after="0"/>
-              <w:jc w:val="center"/>
-            </w:pPr>
-            <w:r>
-              <w:rPr>
-                <w:rFonts w:ascii="MS Gothic" w:hAnsi="MS Gothic" w:eastAsia="MS Gothic"/>
-                <w:b w:val="0"/>
-                <w:sz w:val="15"/>
-              </w:rPr>
-              <w:t>答え</w:t>
-            </w:r>
-          </w:p>
-        </w:tc>
-        <w:tc>
-          <w:tcPr>
-            <w:tcW w:type="dxa" w:w="1134"/>
-            <w:vAlign w:val="center"/>
-          </w:tcPr>
-          <w:p>
-            <w:pPr>
-              <w:spacing w:before="0" w:after="0"/>
-              <w:jc w:val="center"/>
-            </w:pPr>
-            <w:r>
-              <w:rPr>
-                <w:rFonts w:ascii="MS Gothic" w:hAnsi="MS Gothic" w:eastAsia="MS Gothic"/>
-                <w:b w:val="0"/>
-                <w:sz w:val="18"/>
-              </w:rPr>
-            </w:r>
-          </w:p>
-        </w:tc>
-        <w:tc>
-          <w:tcPr>
-            <w:tcW w:type="dxa" w:w="5443"/>
+            <w:tcW w:type="dxa" w:w="5046"/>
             <w:tcBorders>
               <w:top w:val="none" w:sz="0" w:space="0" w:color="auto"/>
               <w:left w:val="none" w:sz="0" w:space="0" w:color="auto"/>
@@ -393,26 +295,15 @@
         <w:tblLook w:firstColumn="1" w:firstRow="1" w:lastColumn="0" w:lastRow="0" w:noHBand="0" w:noVBand="1" w:val="04A0"/>
       </w:tblPr>
       <w:tblGrid>
-        <w:gridCol w:w="510"/>
-        <w:gridCol w:w="510"/>
-        <w:gridCol w:w="510"/>
-        <w:gridCol w:w="510"/>
-        <w:gridCol w:w="510"/>
-        <w:gridCol w:w="510"/>
-        <w:gridCol w:w="510"/>
-        <w:gridCol w:w="510"/>
-        <w:gridCol w:w="510"/>
-        <w:gridCol w:w="510"/>
-        <w:gridCol w:w="510"/>
-        <w:gridCol w:w="510"/>
-        <w:gridCol w:w="510"/>
-        <w:gridCol w:w="510"/>
-        <w:gridCol w:w="510"/>
-        <w:gridCol w:w="510"/>
-        <w:gridCol w:w="510"/>
-        <w:gridCol w:w="510"/>
-        <w:gridCol w:w="510"/>
-        <w:gridCol w:w="510"/>
+        <w:gridCol w:w="1134"/>
+        <w:gridCol w:w="1134"/>
+        <w:gridCol w:w="1134"/>
+        <w:gridCol w:w="1134"/>
+        <w:gridCol w:w="1134"/>
+        <w:gridCol w:w="1134"/>
+        <w:gridCol w:w="1134"/>
+        <w:gridCol w:w="1134"/>
+        <w:gridCol w:w="1134"/>
       </w:tblGrid>
       <w:tr>
         <w:trPr>
@@ -420,7 +311,7 @@
         </w:trPr>
         <w:tc>
           <w:tcPr>
-            <w:tcW w:type="dxa" w:w="510"/>
+            <w:tcW w:type="dxa" w:w="397"/>
             <w:vAlign w:val="center"/>
             <w:shd w:val="clear" w:color="auto" w:fill="D9D9D9"/>
           </w:tcPr>
@@ -441,7 +332,7 @@
         </w:tc>
         <w:tc>
           <w:tcPr>
-            <w:tcW w:type="dxa" w:w="510"/>
+            <w:tcW w:type="dxa" w:w="1502"/>
             <w:vAlign w:val="center"/>
           </w:tcPr>
           <w:p>
@@ -453,14 +344,14 @@
               <w:rPr>
                 <w:rFonts w:ascii="MS Gothic" w:hAnsi="MS Gothic" w:eastAsia="MS Gothic"/>
                 <w:b w:val="0"/>
-                <w:sz w:val="14"/>
+                <w:sz w:val="18"/>
               </w:rPr>
             </w:r>
           </w:p>
         </w:tc>
         <w:tc>
           <w:tcPr>
-            <w:tcW w:type="dxa" w:w="510"/>
+            <w:tcW w:type="dxa" w:w="1502"/>
             <w:vAlign w:val="center"/>
           </w:tcPr>
           <w:p>
@@ -472,14 +363,14 @@
               <w:rPr>
                 <w:rFonts w:ascii="MS Gothic" w:hAnsi="MS Gothic" w:eastAsia="MS Gothic"/>
                 <w:b w:val="0"/>
-                <w:sz w:val="14"/>
+                <w:sz w:val="18"/>
               </w:rPr>
             </w:r>
           </w:p>
         </w:tc>
         <w:tc>
           <w:tcPr>
-            <w:tcW w:type="dxa" w:w="510"/>
+            <w:tcW w:type="dxa" w:w="1502"/>
             <w:vAlign w:val="center"/>
           </w:tcPr>
           <w:p>
@@ -491,14 +382,14 @@
               <w:rPr>
                 <w:rFonts w:ascii="MS Gothic" w:hAnsi="MS Gothic" w:eastAsia="MS Gothic"/>
                 <w:b w:val="0"/>
-                <w:sz w:val="14"/>
+                <w:sz w:val="18"/>
               </w:rPr>
             </w:r>
           </w:p>
         </w:tc>
         <w:tc>
           <w:tcPr>
-            <w:tcW w:type="dxa" w:w="510"/>
+            <w:tcW w:type="dxa" w:w="397"/>
             <w:vAlign w:val="center"/>
             <w:shd w:val="clear" w:color="auto" w:fill="D9D9D9"/>
           </w:tcPr>
@@ -519,7 +410,7 @@
         </w:tc>
         <w:tc>
           <w:tcPr>
-            <w:tcW w:type="dxa" w:w="510"/>
+            <w:tcW w:type="dxa" w:w="1502"/>
             <w:vAlign w:val="center"/>
           </w:tcPr>
           <w:p>
@@ -531,14 +422,14 @@
               <w:rPr>
                 <w:rFonts w:ascii="MS Gothic" w:hAnsi="MS Gothic" w:eastAsia="MS Gothic"/>
                 <w:b w:val="0"/>
-                <w:sz w:val="14"/>
+                <w:sz w:val="18"/>
               </w:rPr>
             </w:r>
           </w:p>
         </w:tc>
         <w:tc>
           <w:tcPr>
-            <w:tcW w:type="dxa" w:w="510"/>
+            <w:tcW w:type="dxa" w:w="1502"/>
             <w:vAlign w:val="center"/>
           </w:tcPr>
           <w:p>
@@ -550,28 +441,14 @@
               <w:rPr>
                 <w:rFonts w:ascii="MS Gothic" w:hAnsi="MS Gothic" w:eastAsia="MS Gothic"/>
                 <w:b w:val="0"/>
-                <w:sz w:val="14"/>
+                <w:sz w:val="18"/>
               </w:rPr>
             </w:r>
           </w:p>
         </w:tc>
         <w:tc>
           <w:tcPr>
-            <w:tcW w:type="dxa" w:w="510"/>
-            <w:tcBorders>
-              <w:top w:val="none" w:sz="0" w:space="0" w:color="auto"/>
-              <w:left w:val="none" w:sz="0" w:space="0" w:color="auto"/>
-              <w:bottom w:val="none" w:sz="0" w:space="0" w:color="auto"/>
-              <w:right w:val="none" w:sz="0" w:space="0" w:color="auto"/>
-              <w:insideH w:val="none" w:sz="0" w:space="0" w:color="auto"/>
-              <w:insideV w:val="none" w:sz="0" w:space="0" w:color="auto"/>
-            </w:tcBorders>
-          </w:tcPr>
-          <w:p/>
-        </w:tc>
-        <w:tc>
-          <w:tcPr>
-            <w:tcW w:type="dxa" w:w="510"/>
+            <w:tcW w:type="dxa" w:w="397"/>
             <w:vAlign w:val="center"/>
             <w:shd w:val="clear" w:color="auto" w:fill="D9D9D9"/>
           </w:tcPr>
@@ -592,7 +469,7 @@
         </w:tc>
         <w:tc>
           <w:tcPr>
-            <w:tcW w:type="dxa" w:w="510"/>
+            <w:tcW w:type="dxa" w:w="1502"/>
             <w:vAlign w:val="center"/>
           </w:tcPr>
           <w:p>
@@ -604,14 +481,19 @@
               <w:rPr>
                 <w:rFonts w:ascii="MS Gothic" w:hAnsi="MS Gothic" w:eastAsia="MS Gothic"/>
                 <w:b w:val="0"/>
-                <w:sz w:val="14"/>
+                <w:sz w:val="18"/>
               </w:rPr>
             </w:r>
           </w:p>
         </w:tc>
+      </w:tr>
+      <w:tr>
+        <w:trPr>
+          <w:trHeight w:val="396" w:hRule="exact"/>
+        </w:trPr>
         <w:tc>
           <w:tcPr>
-            <w:tcW w:type="dxa" w:w="510"/>
+            <w:tcW w:type="dxa" w:w="397"/>
             <w:tcBorders>
               <w:top w:val="none" w:sz="0" w:space="0" w:color="auto"/>
               <w:left w:val="none" w:sz="0" w:space="0" w:color="auto"/>
@@ -625,7 +507,64 @@
         </w:tc>
         <w:tc>
           <w:tcPr>
-            <w:tcW w:type="dxa" w:w="510"/>
+            <w:tcW w:type="dxa" w:w="1502"/>
+            <w:vAlign w:val="center"/>
+          </w:tcPr>
+          <w:p>
+            <w:pPr>
+              <w:spacing w:before="0" w:after="0"/>
+              <w:jc w:val="center"/>
+            </w:pPr>
+            <w:r>
+              <w:rPr>
+                <w:rFonts w:ascii="MS Gothic" w:hAnsi="MS Gothic" w:eastAsia="MS Gothic"/>
+                <w:b w:val="0"/>
+                <w:sz w:val="18"/>
+              </w:rPr>
+            </w:r>
+          </w:p>
+        </w:tc>
+        <w:tc>
+          <w:tcPr>
+            <w:tcW w:type="dxa" w:w="1502"/>
+            <w:vAlign w:val="center"/>
+          </w:tcPr>
+          <w:p>
+            <w:pPr>
+              <w:spacing w:before="0" w:after="0"/>
+              <w:jc w:val="center"/>
+            </w:pPr>
+            <w:r>
+              <w:rPr>
+                <w:rFonts w:ascii="MS Gothic" w:hAnsi="MS Gothic" w:eastAsia="MS Gothic"/>
+                <w:b w:val="0"/>
+                <w:sz w:val="18"/>
+              </w:rPr>
+            </w:r>
+          </w:p>
+        </w:tc>
+        <w:tc>
+          <w:tcPr>
+            <w:tcW w:type="dxa" w:w="1502"/>
+            <w:vAlign w:val="center"/>
+          </w:tcPr>
+          <w:p>
+            <w:pPr>
+              <w:spacing w:before="0" w:after="0"/>
+              <w:jc w:val="center"/>
+            </w:pPr>
+            <w:r>
+              <w:rPr>
+                <w:rFonts w:ascii="MS Gothic" w:hAnsi="MS Gothic" w:eastAsia="MS Gothic"/>
+                <w:b w:val="0"/>
+                <w:sz w:val="18"/>
+              </w:rPr>
+            </w:r>
+          </w:p>
+        </w:tc>
+        <w:tc>
+          <w:tcPr>
+            <w:tcW w:type="dxa" w:w="397"/>
             <w:tcBorders>
               <w:top w:val="none" w:sz="0" w:space="0" w:color="auto"/>
               <w:left w:val="none" w:sz="0" w:space="0" w:color="auto"/>
@@ -639,7 +578,102 @@
         </w:tc>
         <w:tc>
           <w:tcPr>
-            <w:tcW w:type="dxa" w:w="510"/>
+            <w:tcW w:type="dxa" w:w="1502"/>
+            <w:vAlign w:val="center"/>
+          </w:tcPr>
+          <w:p>
+            <w:pPr>
+              <w:spacing w:before="0" w:after="0"/>
+              <w:jc w:val="center"/>
+            </w:pPr>
+            <w:r>
+              <w:rPr>
+                <w:rFonts w:ascii="MS Gothic" w:hAnsi="MS Gothic" w:eastAsia="MS Gothic"/>
+                <w:b w:val="0"/>
+                <w:sz w:val="18"/>
+              </w:rPr>
+            </w:r>
+          </w:p>
+        </w:tc>
+        <w:tc>
+          <w:tcPr>
+            <w:tcW w:type="dxa" w:w="1502"/>
+            <w:vAlign w:val="center"/>
+          </w:tcPr>
+          <w:p>
+            <w:pPr>
+              <w:spacing w:before="0" w:after="0"/>
+              <w:jc w:val="center"/>
+            </w:pPr>
+            <w:r>
+              <w:rPr>
+                <w:rFonts w:ascii="MS Gothic" w:hAnsi="MS Gothic" w:eastAsia="MS Gothic"/>
+                <w:b w:val="0"/>
+                <w:sz w:val="18"/>
+              </w:rPr>
+            </w:r>
+          </w:p>
+        </w:tc>
+        <w:tc>
+          <w:tcPr>
+            <w:tcW w:type="dxa" w:w="397"/>
+            <w:tcBorders>
+              <w:top w:val="none" w:sz="0" w:space="0" w:color="auto"/>
+              <w:left w:val="none" w:sz="0" w:space="0" w:color="auto"/>
+              <w:bottom w:val="none" w:sz="0" w:space="0" w:color="auto"/>
+              <w:right w:val="none" w:sz="0" w:space="0" w:color="auto"/>
+              <w:insideH w:val="none" w:sz="0" w:space="0" w:color="auto"/>
+              <w:insideV w:val="none" w:sz="0" w:space="0" w:color="auto"/>
+            </w:tcBorders>
+          </w:tcPr>
+          <w:p/>
+        </w:tc>
+        <w:tc>
+          <w:tcPr>
+            <w:tcW w:type="dxa" w:w="1502"/>
+            <w:vAlign w:val="center"/>
+          </w:tcPr>
+          <w:p>
+            <w:pPr>
+              <w:spacing w:before="0" w:after="0"/>
+              <w:jc w:val="center"/>
+            </w:pPr>
+            <w:r>
+              <w:rPr>
+                <w:rFonts w:ascii="MS Gothic" w:hAnsi="MS Gothic" w:eastAsia="MS Gothic"/>
+                <w:b w:val="0"/>
+                <w:sz w:val="18"/>
+              </w:rPr>
+            </w:r>
+          </w:p>
+        </w:tc>
+      </w:tr>
+    </w:tbl>
+    <w:tbl>
+      <w:tblPr>
+        <w:tblStyle w:val="TableGrid"/>
+        <w:tblW w:type="auto" w:w="0"/>
+        <w:jc w:val="left"/>
+        <w:tblLook w:firstColumn="1" w:firstRow="1" w:lastColumn="0" w:lastRow="0" w:noHBand="0" w:noVBand="1" w:val="04A0"/>
+      </w:tblPr>
+      <w:tblGrid>
+        <w:gridCol w:w="1134"/>
+        <w:gridCol w:w="1134"/>
+        <w:gridCol w:w="1134"/>
+        <w:gridCol w:w="1134"/>
+        <w:gridCol w:w="1134"/>
+        <w:gridCol w:w="1134"/>
+        <w:gridCol w:w="1134"/>
+        <w:gridCol w:w="1134"/>
+        <w:gridCol w:w="1134"/>
+      </w:tblGrid>
+      <w:tr>
+        <w:trPr>
+          <w:trHeight w:val="249" w:hRule="exact"/>
+        </w:trPr>
+        <w:tc>
+          <w:tcPr>
+            <w:tcW w:type="dxa" w:w="397"/>
             <w:vAlign w:val="center"/>
             <w:shd w:val="clear" w:color="auto" w:fill="D9D9D9"/>
           </w:tcPr>
@@ -660,7 +694,7 @@
         </w:tc>
         <w:tc>
           <w:tcPr>
-            <w:tcW w:type="dxa" w:w="510"/>
+            <w:tcW w:type="dxa" w:w="1502"/>
             <w:vAlign w:val="center"/>
           </w:tcPr>
           <w:p>
@@ -672,14 +706,14 @@
               <w:rPr>
                 <w:rFonts w:ascii="MS Gothic" w:hAnsi="MS Gothic" w:eastAsia="MS Gothic"/>
                 <w:b w:val="0"/>
-                <w:sz w:val="14"/>
+                <w:sz w:val="18"/>
               </w:rPr>
             </w:r>
           </w:p>
         </w:tc>
         <w:tc>
           <w:tcPr>
-            <w:tcW w:type="dxa" w:w="510"/>
+            <w:tcW w:type="dxa" w:w="1502"/>
             <w:vAlign w:val="center"/>
           </w:tcPr>
           <w:p>
@@ -691,14 +725,14 @@
               <w:rPr>
                 <w:rFonts w:ascii="MS Gothic" w:hAnsi="MS Gothic" w:eastAsia="MS Gothic"/>
                 <w:b w:val="0"/>
-                <w:sz w:val="14"/>
+                <w:sz w:val="18"/>
               </w:rPr>
             </w:r>
           </w:p>
         </w:tc>
         <w:tc>
           <w:tcPr>
-            <w:tcW w:type="dxa" w:w="510"/>
+            <w:tcW w:type="dxa" w:w="1502"/>
             <w:vAlign w:val="center"/>
           </w:tcPr>
           <w:p>
@@ -710,14 +744,14 @@
               <w:rPr>
                 <w:rFonts w:ascii="MS Gothic" w:hAnsi="MS Gothic" w:eastAsia="MS Gothic"/>
                 <w:b w:val="0"/>
-                <w:sz w:val="14"/>
+                <w:sz w:val="18"/>
               </w:rPr>
             </w:r>
           </w:p>
         </w:tc>
         <w:tc>
           <w:tcPr>
-            <w:tcW w:type="dxa" w:w="510"/>
+            <w:tcW w:type="dxa" w:w="397"/>
             <w:vAlign w:val="center"/>
             <w:shd w:val="clear" w:color="auto" w:fill="D9D9D9"/>
           </w:tcPr>
@@ -738,83 +772,7 @@
         </w:tc>
         <w:tc>
           <w:tcPr>
-            <w:tcW w:type="dxa" w:w="510"/>
-            <w:vAlign w:val="center"/>
-          </w:tcPr>
-          <w:p>
-            <w:pPr>
-              <w:spacing w:before="0" w:after="0"/>
-              <w:jc w:val="center"/>
-            </w:pPr>
-            <w:r>
-              <w:rPr>
-                <w:rFonts w:ascii="MS Gothic" w:hAnsi="MS Gothic" w:eastAsia="MS Gothic"/>
-                <w:b w:val="0"/>
-                <w:sz w:val="14"/>
-              </w:rPr>
-            </w:r>
-          </w:p>
-        </w:tc>
-        <w:tc>
-          <w:tcPr>
-            <w:tcW w:type="dxa" w:w="510"/>
-            <w:vAlign w:val="center"/>
-          </w:tcPr>
-          <w:p>
-            <w:pPr>
-              <w:spacing w:before="0" w:after="0"/>
-              <w:jc w:val="center"/>
-            </w:pPr>
-            <w:r>
-              <w:rPr>
-                <w:rFonts w:ascii="MS Gothic" w:hAnsi="MS Gothic" w:eastAsia="MS Gothic"/>
-                <w:b w:val="0"/>
-                <w:sz w:val="14"/>
-              </w:rPr>
-            </w:r>
-          </w:p>
-        </w:tc>
-        <w:tc>
-          <w:tcPr>
-            <w:tcW w:type="dxa" w:w="510"/>
-            <w:vAlign w:val="center"/>
-          </w:tcPr>
-          <w:p>
-            <w:pPr>
-              <w:spacing w:before="0" w:after="0"/>
-              <w:jc w:val="center"/>
-            </w:pPr>
-            <w:r>
-              <w:rPr>
-                <w:rFonts w:ascii="MS Gothic" w:hAnsi="MS Gothic" w:eastAsia="MS Gothic"/>
-                <w:b w:val="0"/>
-                <w:sz w:val="14"/>
-              </w:rPr>
-            </w:r>
-          </w:p>
-        </w:tc>
-      </w:tr>
-      <w:tr>
-        <w:trPr>
-          <w:trHeight w:val="385" w:hRule="exact"/>
-        </w:trPr>
-        <w:tc>
-          <w:tcPr>
-            <w:tcW w:type="dxa" w:w="510"/>
-            <w:tcBorders>
-              <w:top w:val="none" w:sz="0" w:space="0" w:color="auto"/>
-              <w:left w:val="none" w:sz="0" w:space="0" w:color="auto"/>
-              <w:bottom w:val="none" w:sz="0" w:space="0" w:color="auto"/>
-              <w:right w:val="none" w:sz="0" w:space="0" w:color="auto"/>
-              <w:insideH w:val="none" w:sz="0" w:space="0" w:color="auto"/>
-              <w:insideV w:val="none" w:sz="0" w:space="0" w:color="auto"/>
-            </w:tcBorders>
-          </w:tcPr>
-          <w:p/>
-        </w:tc>
-        <w:tc>
-          <w:tcPr>
-            <w:tcW w:type="dxa" w:w="510"/>
+            <w:tcW w:type="dxa" w:w="1502"/>
             <w:vAlign w:val="center"/>
           </w:tcPr>
           <w:p>
@@ -833,7 +791,7 @@
         </w:tc>
         <w:tc>
           <w:tcPr>
-            <w:tcW w:type="dxa" w:w="510"/>
+            <w:tcW w:type="dxa" w:w="1502"/>
             <w:vAlign w:val="center"/>
           </w:tcPr>
           <w:p>
@@ -852,7 +810,7 @@
         </w:tc>
         <w:tc>
           <w:tcPr>
-            <w:tcW w:type="dxa" w:w="510"/>
+            <w:tcW w:type="dxa" w:w="1502"/>
             <w:vAlign w:val="center"/>
           </w:tcPr>
           <w:p>
@@ -871,7 +829,26 @@
         </w:tc>
         <w:tc>
           <w:tcPr>
-            <w:tcW w:type="dxa" w:w="510"/>
+            <w:tcW w:type="dxa" w:w="397"/>
+            <w:tcBorders>
+              <w:top w:val="none" w:sz="0" w:space="0" w:color="auto"/>
+              <w:left w:val="none" w:sz="0" w:space="0" w:color="auto"/>
+              <w:bottom w:val="none" w:sz="0" w:space="0" w:color="auto"/>
+              <w:right w:val="none" w:sz="0" w:space="0" w:color="auto"/>
+              <w:insideH w:val="none" w:sz="0" w:space="0" w:color="auto"/>
+              <w:insideV w:val="none" w:sz="0" w:space="0" w:color="auto"/>
+            </w:tcBorders>
+          </w:tcPr>
+          <w:p/>
+        </w:tc>
+      </w:tr>
+      <w:tr>
+        <w:trPr>
+          <w:trHeight w:val="396" w:hRule="exact"/>
+        </w:trPr>
+        <w:tc>
+          <w:tcPr>
+            <w:tcW w:type="dxa" w:w="397"/>
             <w:tcBorders>
               <w:top w:val="none" w:sz="0" w:space="0" w:color="auto"/>
               <w:left w:val="none" w:sz="0" w:space="0" w:color="auto"/>
@@ -885,7 +862,7 @@
         </w:tc>
         <w:tc>
           <w:tcPr>
-            <w:tcW w:type="dxa" w:w="510"/>
+            <w:tcW w:type="dxa" w:w="1502"/>
             <w:vAlign w:val="center"/>
           </w:tcPr>
           <w:p>
@@ -904,7 +881,7 @@
         </w:tc>
         <w:tc>
           <w:tcPr>
-            <w:tcW w:type="dxa" w:w="510"/>
+            <w:tcW w:type="dxa" w:w="1502"/>
             <w:vAlign w:val="center"/>
           </w:tcPr>
           <w:p>
@@ -923,35 +900,7 @@
         </w:tc>
         <w:tc>
           <w:tcPr>
-            <w:tcW w:type="dxa" w:w="510"/>
-            <w:tcBorders>
-              <w:top w:val="none" w:sz="0" w:space="0" w:color="auto"/>
-              <w:left w:val="none" w:sz="0" w:space="0" w:color="auto"/>
-              <w:bottom w:val="none" w:sz="0" w:space="0" w:color="auto"/>
-              <w:right w:val="none" w:sz="0" w:space="0" w:color="auto"/>
-              <w:insideH w:val="none" w:sz="0" w:space="0" w:color="auto"/>
-              <w:insideV w:val="none" w:sz="0" w:space="0" w:color="auto"/>
-            </w:tcBorders>
-          </w:tcPr>
-          <w:p/>
-        </w:tc>
-        <w:tc>
-          <w:tcPr>
-            <w:tcW w:type="dxa" w:w="510"/>
-            <w:tcBorders>
-              <w:top w:val="none" w:sz="0" w:space="0" w:color="auto"/>
-              <w:left w:val="none" w:sz="0" w:space="0" w:color="auto"/>
-              <w:bottom w:val="none" w:sz="0" w:space="0" w:color="auto"/>
-              <w:right w:val="none" w:sz="0" w:space="0" w:color="auto"/>
-              <w:insideH w:val="none" w:sz="0" w:space="0" w:color="auto"/>
-              <w:insideV w:val="none" w:sz="0" w:space="0" w:color="auto"/>
-            </w:tcBorders>
-          </w:tcPr>
-          <w:p/>
-        </w:tc>
-        <w:tc>
-          <w:tcPr>
-            <w:tcW w:type="dxa" w:w="510"/>
+            <w:tcW w:type="dxa" w:w="1502"/>
             <w:vAlign w:val="center"/>
           </w:tcPr>
           <w:p>
@@ -970,7 +919,7 @@
         </w:tc>
         <w:tc>
           <w:tcPr>
-            <w:tcW w:type="dxa" w:w="510"/>
+            <w:tcW w:type="dxa" w:w="397"/>
             <w:tcBorders>
               <w:top w:val="none" w:sz="0" w:space="0" w:color="auto"/>
               <w:left w:val="none" w:sz="0" w:space="0" w:color="auto"/>
@@ -984,35 +933,7 @@
         </w:tc>
         <w:tc>
           <w:tcPr>
-            <w:tcW w:type="dxa" w:w="510"/>
-            <w:tcBorders>
-              <w:top w:val="none" w:sz="0" w:space="0" w:color="auto"/>
-              <w:left w:val="none" w:sz="0" w:space="0" w:color="auto"/>
-              <w:bottom w:val="none" w:sz="0" w:space="0" w:color="auto"/>
-              <w:right w:val="none" w:sz="0" w:space="0" w:color="auto"/>
-              <w:insideH w:val="none" w:sz="0" w:space="0" w:color="auto"/>
-              <w:insideV w:val="none" w:sz="0" w:space="0" w:color="auto"/>
-            </w:tcBorders>
-          </w:tcPr>
-          <w:p/>
-        </w:tc>
-        <w:tc>
-          <w:tcPr>
-            <w:tcW w:type="dxa" w:w="510"/>
-            <w:tcBorders>
-              <w:top w:val="none" w:sz="0" w:space="0" w:color="auto"/>
-              <w:left w:val="none" w:sz="0" w:space="0" w:color="auto"/>
-              <w:bottom w:val="none" w:sz="0" w:space="0" w:color="auto"/>
-              <w:right w:val="none" w:sz="0" w:space="0" w:color="auto"/>
-              <w:insideH w:val="none" w:sz="0" w:space="0" w:color="auto"/>
-              <w:insideV w:val="none" w:sz="0" w:space="0" w:color="auto"/>
-            </w:tcBorders>
-          </w:tcPr>
-          <w:p/>
-        </w:tc>
-        <w:tc>
-          <w:tcPr>
-            <w:tcW w:type="dxa" w:w="510"/>
+            <w:tcW w:type="dxa" w:w="1502"/>
             <w:vAlign w:val="center"/>
           </w:tcPr>
           <w:p>
@@ -1031,7 +952,7 @@
         </w:tc>
         <w:tc>
           <w:tcPr>
-            <w:tcW w:type="dxa" w:w="510"/>
+            <w:tcW w:type="dxa" w:w="1502"/>
             <w:vAlign w:val="center"/>
           </w:tcPr>
           <w:p>
@@ -1050,7 +971,7 @@
         </w:tc>
         <w:tc>
           <w:tcPr>
-            <w:tcW w:type="dxa" w:w="510"/>
+            <w:tcW w:type="dxa" w:w="1502"/>
             <w:vAlign w:val="center"/>
           </w:tcPr>
           <w:p>
@@ -1069,7 +990,7 @@
         </w:tc>
         <w:tc>
           <w:tcPr>
-            <w:tcW w:type="dxa" w:w="510"/>
+            <w:tcW w:type="dxa" w:w="397"/>
             <w:tcBorders>
               <w:top w:val="none" w:sz="0" w:space="0" w:color="auto"/>
               <w:left w:val="none" w:sz="0" w:space="0" w:color="auto"/>
@@ -1081,68 +1002,11 @@
           </w:tcPr>
           <w:p/>
         </w:tc>
-        <w:tc>
-          <w:tcPr>
-            <w:tcW w:type="dxa" w:w="510"/>
-            <w:vAlign w:val="center"/>
-          </w:tcPr>
-          <w:p>
-            <w:pPr>
-              <w:spacing w:before="0" w:after="0"/>
-              <w:jc w:val="center"/>
-            </w:pPr>
-            <w:r>
-              <w:rPr>
-                <w:rFonts w:ascii="MS Gothic" w:hAnsi="MS Gothic" w:eastAsia="MS Gothic"/>
-                <w:b w:val="0"/>
-                <w:sz w:val="18"/>
-              </w:rPr>
-            </w:r>
-          </w:p>
-        </w:tc>
-        <w:tc>
-          <w:tcPr>
-            <w:tcW w:type="dxa" w:w="510"/>
-            <w:vAlign w:val="center"/>
-          </w:tcPr>
-          <w:p>
-            <w:pPr>
-              <w:spacing w:before="0" w:after="0"/>
-              <w:jc w:val="center"/>
-            </w:pPr>
-            <w:r>
-              <w:rPr>
-                <w:rFonts w:ascii="MS Gothic" w:hAnsi="MS Gothic" w:eastAsia="MS Gothic"/>
-                <w:b w:val="0"/>
-                <w:sz w:val="18"/>
-              </w:rPr>
-            </w:r>
-          </w:p>
-        </w:tc>
-        <w:tc>
-          <w:tcPr>
-            <w:tcW w:type="dxa" w:w="510"/>
-            <w:vAlign w:val="center"/>
-          </w:tcPr>
-          <w:p>
-            <w:pPr>
-              <w:spacing w:before="0" w:after="0"/>
-              <w:jc w:val="center"/>
-            </w:pPr>
-            <w:r>
-              <w:rPr>
-                <w:rFonts w:ascii="MS Gothic" w:hAnsi="MS Gothic" w:eastAsia="MS Gothic"/>
-                <w:b w:val="0"/>
-                <w:sz w:val="18"/>
-              </w:rPr>
-            </w:r>
-          </w:p>
-        </w:tc>
       </w:tr>
     </w:tbl>
     <w:p>
       <w:pPr>
-        <w:spacing w:before="80" w:after="20"/>
+        <w:spacing w:before="100" w:after="20"/>
       </w:pPr>
       <w:r>
         <w:rPr>
@@ -1163,7 +1027,7 @@
           <w:b w:val="0"/>
           <w:sz w:val="17"/>
         </w:rPr>
-        <w:t>A（1×10=10点）</w:t>
+        <w:t>A（1×10=10点）　　各選択（A・B・C・D）</w:t>
       </w:r>
     </w:p>
     <w:tbl>
@@ -1606,7 +1470,7 @@
           <w:b w:val="0"/>
           <w:sz w:val="17"/>
         </w:rPr>
-        <w:t>B（1×5=5点）</w:t>
+        <w:t>B（1×5=5点）　　英単語1語</w:t>
       </w:r>
     </w:p>
     <w:tbl>
@@ -1735,7 +1599,7 @@
       </w:tr>
       <w:tr>
         <w:trPr>
-          <w:trHeight w:val="385" w:hRule="exact"/>
+          <w:trHeight w:val="396" w:hRule="exact"/>
         </w:trPr>
         <w:tc>
           <w:tcPr>
@@ -1836,7 +1700,7 @@
     </w:tbl>
     <w:p>
       <w:pPr>
-        <w:spacing w:before="80" w:after="20"/>
+        <w:spacing w:before="100" w:after="20"/>
       </w:pPr>
       <w:r>
         <w:rPr>
@@ -1868,14 +1732,12 @@
         <w:tblLook w:firstColumn="1" w:firstRow="1" w:lastColumn="0" w:lastRow="0" w:noHBand="0" w:noVBand="1" w:val="04A0"/>
       </w:tblPr>
       <w:tblGrid>
-        <w:gridCol w:w="2551"/>
-        <w:gridCol w:w="2551"/>
-        <w:gridCol w:w="2551"/>
-        <w:gridCol w:w="2551"/>
+        <w:gridCol w:w="5103"/>
+        <w:gridCol w:w="5103"/>
       </w:tblGrid>
       <w:tr>
         <w:trPr>
-          <w:trHeight w:val="396" w:hRule="exact"/>
+          <w:trHeight w:val="408" w:hRule="exact"/>
         </w:trPr>
         <w:tc>
           <w:tcPr>
@@ -1900,7 +1762,7 @@
         </w:tc>
         <w:tc>
           <w:tcPr>
-            <w:tcW w:type="dxa" w:w="4706"/>
+            <w:tcW w:type="dxa" w:w="9808"/>
             <w:vAlign w:val="center"/>
           </w:tcPr>
           <w:p>
@@ -1917,6 +1779,11 @@
             </w:r>
           </w:p>
         </w:tc>
+      </w:tr>
+      <w:tr>
+        <w:trPr>
+          <w:trHeight w:val="408" w:hRule="exact"/>
+        </w:trPr>
         <w:tc>
           <w:tcPr>
             <w:tcW w:type="dxa" w:w="397"/>
@@ -1940,7 +1807,7 @@
         </w:tc>
         <w:tc>
           <w:tcPr>
-            <w:tcW w:type="dxa" w:w="4706"/>
+            <w:tcW w:type="dxa" w:w="9808"/>
             <w:vAlign w:val="center"/>
           </w:tcPr>
           <w:p>
@@ -1960,7 +1827,7 @@
       </w:tr>
       <w:tr>
         <w:trPr>
-          <w:trHeight w:val="396" w:hRule="exact"/>
+          <w:trHeight w:val="408" w:hRule="exact"/>
         </w:trPr>
         <w:tc>
           <w:tcPr>
@@ -1985,7 +1852,7 @@
         </w:tc>
         <w:tc>
           <w:tcPr>
-            <w:tcW w:type="dxa" w:w="4706"/>
+            <w:tcW w:type="dxa" w:w="9808"/>
             <w:vAlign w:val="center"/>
           </w:tcPr>
           <w:p>
@@ -2002,6 +1869,11 @@
             </w:r>
           </w:p>
         </w:tc>
+      </w:tr>
+      <w:tr>
+        <w:trPr>
+          <w:trHeight w:val="408" w:hRule="exact"/>
+        </w:trPr>
         <w:tc>
           <w:tcPr>
             <w:tcW w:type="dxa" w:w="397"/>
@@ -2025,7 +1897,7 @@
         </w:tc>
         <w:tc>
           <w:tcPr>
-            <w:tcW w:type="dxa" w:w="4706"/>
+            <w:tcW w:type="dxa" w:w="9808"/>
             <w:vAlign w:val="center"/>
           </w:tcPr>
           <w:p>
@@ -2045,7 +1917,7 @@
       </w:tr>
       <w:tr>
         <w:trPr>
-          <w:trHeight w:val="396" w:hRule="exact"/>
+          <w:trHeight w:val="408" w:hRule="exact"/>
         </w:trPr>
         <w:tc>
           <w:tcPr>
@@ -2070,7 +1942,7 @@
         </w:tc>
         <w:tc>
           <w:tcPr>
-            <w:tcW w:type="dxa" w:w="4706"/>
+            <w:tcW w:type="dxa" w:w="9808"/>
             <w:vAlign w:val="center"/>
           </w:tcPr>
           <w:p>
@@ -2087,6 +1959,11 @@
             </w:r>
           </w:p>
         </w:tc>
+      </w:tr>
+      <w:tr>
+        <w:trPr>
+          <w:trHeight w:val="408" w:hRule="exact"/>
+        </w:trPr>
         <w:tc>
           <w:tcPr>
             <w:tcW w:type="dxa" w:w="397"/>
@@ -2110,7 +1987,7 @@
         </w:tc>
         <w:tc>
           <w:tcPr>
-            <w:tcW w:type="dxa" w:w="4706"/>
+            <w:tcW w:type="dxa" w:w="9808"/>
             <w:vAlign w:val="center"/>
           </w:tcPr>
           <w:p>
@@ -2130,7 +2007,7 @@
       </w:tr>
       <w:tr>
         <w:trPr>
-          <w:trHeight w:val="396" w:hRule="exact"/>
+          <w:trHeight w:val="408" w:hRule="exact"/>
         </w:trPr>
         <w:tc>
           <w:tcPr>
@@ -2155,7 +2032,7 @@
         </w:tc>
         <w:tc>
           <w:tcPr>
-            <w:tcW w:type="dxa" w:w="4706"/>
+            <w:tcW w:type="dxa" w:w="9808"/>
             <w:vAlign w:val="center"/>
           </w:tcPr>
           <w:p>
@@ -2172,6 +2049,11 @@
             </w:r>
           </w:p>
         </w:tc>
+      </w:tr>
+      <w:tr>
+        <w:trPr>
+          <w:trHeight w:val="408" w:hRule="exact"/>
+        </w:trPr>
         <w:tc>
           <w:tcPr>
             <w:tcW w:type="dxa" w:w="397"/>
@@ -2195,7 +2077,7 @@
         </w:tc>
         <w:tc>
           <w:tcPr>
-            <w:tcW w:type="dxa" w:w="4706"/>
+            <w:tcW w:type="dxa" w:w="9808"/>
             <w:vAlign w:val="center"/>
           </w:tcPr>
           <w:p>
@@ -2215,7 +2097,7 @@
       </w:tr>
       <w:tr>
         <w:trPr>
-          <w:trHeight w:val="396" w:hRule="exact"/>
+          <w:trHeight w:val="408" w:hRule="exact"/>
         </w:trPr>
         <w:tc>
           <w:tcPr>
@@ -2240,7 +2122,7 @@
         </w:tc>
         <w:tc>
           <w:tcPr>
-            <w:tcW w:type="dxa" w:w="4706"/>
+            <w:tcW w:type="dxa" w:w="9808"/>
             <w:vAlign w:val="center"/>
           </w:tcPr>
           <w:p>
@@ -2257,6 +2139,11 @@
             </w:r>
           </w:p>
         </w:tc>
+      </w:tr>
+      <w:tr>
+        <w:trPr>
+          <w:trHeight w:val="408" w:hRule="exact"/>
+        </w:trPr>
         <w:tc>
           <w:tcPr>
             <w:tcW w:type="dxa" w:w="397"/>
@@ -2280,7 +2167,7 @@
         </w:tc>
         <w:tc>
           <w:tcPr>
-            <w:tcW w:type="dxa" w:w="4706"/>
+            <w:tcW w:type="dxa" w:w="9808"/>
             <w:vAlign w:val="center"/>
           </w:tcPr>
           <w:p>
@@ -3397,7 +3284,7 @@
       </w:tr>
       <w:tr>
         <w:trPr>
-          <w:trHeight w:val="385" w:hRule="exact"/>
+          <w:trHeight w:val="396" w:hRule="exact"/>
         </w:trPr>
         <w:tc>
           <w:tcPr>
@@ -3549,7 +3436,7 @@
       </w:tblGrid>
       <w:tr>
         <w:trPr>
-          <w:trHeight w:val="464" w:hRule="exact"/>
+          <w:trHeight w:val="481" w:hRule="exact"/>
         </w:trPr>
         <w:tc>
           <w:tcPr>
@@ -3594,7 +3481,7 @@
       </w:tr>
       <w:tr>
         <w:trPr>
-          <w:trHeight w:val="464" w:hRule="exact"/>
+          <w:trHeight w:val="481" w:hRule="exact"/>
         </w:trPr>
         <w:tc>
           <w:tcPr>
@@ -3639,7 +3526,7 @@
       </w:tr>
       <w:tr>
         <w:trPr>
-          <w:trHeight w:val="464" w:hRule="exact"/>
+          <w:trHeight w:val="481" w:hRule="exact"/>
         </w:trPr>
         <w:tc>
           <w:tcPr>
@@ -3684,7 +3571,7 @@
       </w:tr>
       <w:tr>
         <w:trPr>
-          <w:trHeight w:val="464" w:hRule="exact"/>
+          <w:trHeight w:val="481" w:hRule="exact"/>
         </w:trPr>
         <w:tc>
           <w:tcPr>
@@ -3729,7 +3616,7 @@
       </w:tr>
       <w:tr>
         <w:trPr>
-          <w:trHeight w:val="464" w:hRule="exact"/>
+          <w:trHeight w:val="481" w:hRule="exact"/>
         </w:trPr>
         <w:tc>
           <w:tcPr>
@@ -3774,7 +3661,7 @@
       </w:tr>
       <w:tr>
         <w:trPr>
-          <w:trHeight w:val="464" w:hRule="exact"/>
+          <w:trHeight w:val="481" w:hRule="exact"/>
         </w:trPr>
         <w:tc>
           <w:tcPr>
@@ -3820,7 +3707,7 @@
     </w:tbl>
     <w:p>
       <w:pPr>
-        <w:spacing w:before="80" w:after="20"/>
+        <w:spacing w:before="100" w:after="20"/>
       </w:pPr>
       <w:r>
         <w:rPr>
@@ -3841,7 +3728,7 @@
           <w:b w:val="0"/>
           <w:sz w:val="17"/>
         </w:rPr>
-        <w:t>A（1×5=5点）　　　　　　　　　　　　　B（1×5=5点）</w:t>
+        <w:t>A（1×5=5点）　　　　　　　　　　　　B（1×5=5点）</w:t>
       </w:r>
     </w:p>
     <w:tbl>
@@ -3859,7 +3746,7 @@
       </w:tblGrid>
       <w:tr>
         <w:trPr>
-          <w:trHeight w:val="396" w:hRule="exact"/>
+          <w:trHeight w:val="453" w:hRule="exact"/>
         </w:trPr>
         <w:tc>
           <w:tcPr>
@@ -3944,7 +3831,7 @@
       </w:tr>
       <w:tr>
         <w:trPr>
-          <w:trHeight w:val="396" w:hRule="exact"/>
+          <w:trHeight w:val="453" w:hRule="exact"/>
         </w:trPr>
         <w:tc>
           <w:tcPr>
@@ -4029,7 +3916,7 @@
       </w:tr>
       <w:tr>
         <w:trPr>
-          <w:trHeight w:val="396" w:hRule="exact"/>
+          <w:trHeight w:val="453" w:hRule="exact"/>
         </w:trPr>
         <w:tc>
           <w:tcPr>
@@ -4114,7 +4001,7 @@
       </w:tr>
       <w:tr>
         <w:trPr>
-          <w:trHeight w:val="396" w:hRule="exact"/>
+          <w:trHeight w:val="453" w:hRule="exact"/>
         </w:trPr>
         <w:tc>
           <w:tcPr>
@@ -4199,7 +4086,7 @@
       </w:tr>
       <w:tr>
         <w:trPr>
-          <w:trHeight w:val="396" w:hRule="exact"/>
+          <w:trHeight w:val="453" w:hRule="exact"/>
         </w:trPr>
         <w:tc>
           <w:tcPr>
@@ -4285,7 +4172,7 @@
     </w:tbl>
     <w:p>
       <w:pPr>
-        <w:spacing w:before="80" w:after="20"/>
+        <w:spacing w:before="100" w:after="20"/>
       </w:pPr>
       <w:r>
         <w:rPr>
@@ -4306,7 +4193,7 @@
           <w:b w:val="0"/>
           <w:sz w:val="17"/>
         </w:rPr>
-        <w:t>問1（1点）　問2（2点）　問5（2点）　　各選択（A・B・C・D）</w:t>
+        <w:t>問1（1点）　問2（2点）　問5（2点）　　各 A・B・C・D から選択</w:t>
       </w:r>
     </w:p>
     <w:tbl>
@@ -4317,12 +4204,16 @@
         <w:tblLook w:firstColumn="1" w:firstRow="1" w:lastColumn="0" w:lastRow="0" w:noHBand="0" w:noVBand="1" w:val="04A0"/>
       </w:tblPr>
       <w:tblGrid>
-        <w:gridCol w:w="1701"/>
-        <w:gridCol w:w="1701"/>
-        <w:gridCol w:w="1701"/>
-        <w:gridCol w:w="1701"/>
-        <w:gridCol w:w="1701"/>
-        <w:gridCol w:w="1701"/>
+        <w:gridCol w:w="1021"/>
+        <w:gridCol w:w="1021"/>
+        <w:gridCol w:w="1021"/>
+        <w:gridCol w:w="1021"/>
+        <w:gridCol w:w="1021"/>
+        <w:gridCol w:w="1021"/>
+        <w:gridCol w:w="1021"/>
+        <w:gridCol w:w="1021"/>
+        <w:gridCol w:w="1021"/>
+        <w:gridCol w:w="1021"/>
       </w:tblGrid>
       <w:tr>
         <w:trPr>
@@ -4330,7 +4221,7 @@
         </w:trPr>
         <w:tc>
           <w:tcPr>
-            <w:tcW w:type="dxa" w:w="1247"/>
+            <w:tcW w:type="dxa" w:w="1587"/>
             <w:vAlign w:val="center"/>
             <w:shd w:val="clear" w:color="auto" w:fill="D9D9D9"/>
           </w:tcPr>
@@ -4345,13 +4236,13 @@
                 <w:b/>
                 <w:sz w:val="16"/>
               </w:rPr>
-              <w:t>問1</w:t>
+              <w:t>問1（1点）</w:t>
             </w:r>
           </w:p>
         </w:tc>
         <w:tc>
           <w:tcPr>
-            <w:tcW w:type="dxa" w:w="1474"/>
+            <w:tcW w:type="dxa" w:w="850"/>
             <w:vAlign w:val="center"/>
           </w:tcPr>
           <w:p>
@@ -4370,7 +4261,21 @@
         </w:tc>
         <w:tc>
           <w:tcPr>
-            <w:tcW w:type="dxa" w:w="1247"/>
+            <w:tcW w:type="dxa" w:w="227"/>
+            <w:tcBorders>
+              <w:top w:val="none" w:sz="0" w:space="0" w:color="auto"/>
+              <w:left w:val="none" w:sz="0" w:space="0" w:color="auto"/>
+              <w:bottom w:val="none" w:sz="0" w:space="0" w:color="auto"/>
+              <w:right w:val="none" w:sz="0" w:space="0" w:color="auto"/>
+              <w:insideH w:val="none" w:sz="0" w:space="0" w:color="auto"/>
+              <w:insideV w:val="none" w:sz="0" w:space="0" w:color="auto"/>
+            </w:tcBorders>
+          </w:tcPr>
+          <w:p/>
+        </w:tc>
+        <w:tc>
+          <w:tcPr>
+            <w:tcW w:type="dxa" w:w="1587"/>
             <w:vAlign w:val="center"/>
             <w:shd w:val="clear" w:color="auto" w:fill="D9D9D9"/>
           </w:tcPr>
@@ -4385,13 +4290,13 @@
                 <w:b/>
                 <w:sz w:val="16"/>
               </w:rPr>
-              <w:t>問2</w:t>
+              <w:t>問2（2点）</w:t>
             </w:r>
           </w:p>
         </w:tc>
         <w:tc>
           <w:tcPr>
-            <w:tcW w:type="dxa" w:w="1474"/>
+            <w:tcW w:type="dxa" w:w="850"/>
             <w:vAlign w:val="center"/>
           </w:tcPr>
           <w:p>
@@ -4410,7 +4315,21 @@
         </w:tc>
         <w:tc>
           <w:tcPr>
-            <w:tcW w:type="dxa" w:w="1247"/>
+            <w:tcW w:type="dxa" w:w="227"/>
+            <w:tcBorders>
+              <w:top w:val="none" w:sz="0" w:space="0" w:color="auto"/>
+              <w:left w:val="none" w:sz="0" w:space="0" w:color="auto"/>
+              <w:bottom w:val="none" w:sz="0" w:space="0" w:color="auto"/>
+              <w:right w:val="none" w:sz="0" w:space="0" w:color="auto"/>
+              <w:insideH w:val="none" w:sz="0" w:space="0" w:color="auto"/>
+              <w:insideV w:val="none" w:sz="0" w:space="0" w:color="auto"/>
+            </w:tcBorders>
+          </w:tcPr>
+          <w:p/>
+        </w:tc>
+        <w:tc>
+          <w:tcPr>
+            <w:tcW w:type="dxa" w:w="1587"/>
             <w:vAlign w:val="center"/>
             <w:shd w:val="clear" w:color="auto" w:fill="D9D9D9"/>
           </w:tcPr>
@@ -4425,14 +4344,32 @@
                 <w:b/>
                 <w:sz w:val="16"/>
               </w:rPr>
-              <w:t>問5</w:t>
+              <w:t>問5（2点）</w:t>
             </w:r>
           </w:p>
         </w:tc>
         <w:tc>
           <w:tcPr>
-            <w:tcW w:type="dxa" w:w="3515"/>
+            <w:tcW w:type="dxa" w:w="850"/>
             <w:vAlign w:val="center"/>
+          </w:tcPr>
+          <w:p>
+            <w:pPr>
+              <w:spacing w:before="0" w:after="0"/>
+              <w:jc w:val="center"/>
+            </w:pPr>
+            <w:r>
+              <w:rPr>
+                <w:rFonts w:ascii="MS Gothic" w:hAnsi="MS Gothic" w:eastAsia="MS Gothic"/>
+                <w:b w:val="0"/>
+                <w:sz w:val="18"/>
+              </w:rPr>
+            </w:r>
+          </w:p>
+        </w:tc>
+        <w:tc>
+          <w:tcPr>
+            <w:tcW w:type="dxa" w:w="227"/>
             <w:tcBorders>
               <w:top w:val="none" w:sz="0" w:space="0" w:color="auto"/>
               <w:left w:val="none" w:sz="0" w:space="0" w:color="auto"/>
@@ -4441,6 +4378,424 @@
               <w:insideH w:val="none" w:sz="0" w:space="0" w:color="auto"/>
               <w:insideV w:val="none" w:sz="0" w:space="0" w:color="auto"/>
             </w:tcBorders>
+          </w:tcPr>
+          <w:p/>
+        </w:tc>
+        <w:tc>
+          <w:tcPr>
+            <w:tcW w:type="dxa" w:w="2211"/>
+            <w:tcBorders>
+              <w:top w:val="none" w:sz="0" w:space="0" w:color="auto"/>
+              <w:left w:val="none" w:sz="0" w:space="0" w:color="auto"/>
+              <w:bottom w:val="none" w:sz="0" w:space="0" w:color="auto"/>
+              <w:right w:val="none" w:sz="0" w:space="0" w:color="auto"/>
+              <w:insideH w:val="none" w:sz="0" w:space="0" w:color="auto"/>
+              <w:insideV w:val="none" w:sz="0" w:space="0" w:color="auto"/>
+            </w:tcBorders>
+          </w:tcPr>
+          <w:p/>
+        </w:tc>
+      </w:tr>
+      <w:tr>
+        <w:trPr>
+          <w:trHeight w:val="385" w:hRule="exact"/>
+        </w:trPr>
+        <w:tc>
+          <w:tcPr>
+            <w:tcW w:type="dxa" w:w="1587"/>
+            <w:vAlign w:val="center"/>
+          </w:tcPr>
+          <w:p>
+            <w:pPr>
+              <w:spacing w:before="0" w:after="0"/>
+              <w:jc w:val="center"/>
+            </w:pPr>
+            <w:r>
+              <w:rPr>
+                <w:rFonts w:ascii="MS Gothic" w:hAnsi="MS Gothic" w:eastAsia="MS Gothic"/>
+                <w:b w:val="0"/>
+                <w:sz w:val="15"/>
+              </w:rPr>
+              <w:t>答え</w:t>
+            </w:r>
+          </w:p>
+        </w:tc>
+        <w:tc>
+          <w:tcPr>
+            <w:tcW w:type="dxa" w:w="850"/>
+            <w:vAlign w:val="center"/>
+          </w:tcPr>
+          <w:p>
+            <w:pPr>
+              <w:spacing w:before="0" w:after="0"/>
+              <w:jc w:val="center"/>
+            </w:pPr>
+            <w:r>
+              <w:rPr>
+                <w:rFonts w:ascii="MS Gothic" w:hAnsi="MS Gothic" w:eastAsia="MS Gothic"/>
+                <w:b w:val="0"/>
+                <w:sz w:val="18"/>
+              </w:rPr>
+            </w:r>
+          </w:p>
+        </w:tc>
+        <w:tc>
+          <w:tcPr>
+            <w:tcW w:type="dxa" w:w="227"/>
+            <w:tcBorders>
+              <w:top w:val="none" w:sz="0" w:space="0" w:color="auto"/>
+              <w:left w:val="none" w:sz="0" w:space="0" w:color="auto"/>
+              <w:bottom w:val="none" w:sz="0" w:space="0" w:color="auto"/>
+              <w:right w:val="none" w:sz="0" w:space="0" w:color="auto"/>
+              <w:insideH w:val="none" w:sz="0" w:space="0" w:color="auto"/>
+              <w:insideV w:val="none" w:sz="0" w:space="0" w:color="auto"/>
+            </w:tcBorders>
+          </w:tcPr>
+          <w:p/>
+        </w:tc>
+        <w:tc>
+          <w:tcPr>
+            <w:tcW w:type="dxa" w:w="1587"/>
+            <w:vAlign w:val="center"/>
+          </w:tcPr>
+          <w:p>
+            <w:pPr>
+              <w:spacing w:before="0" w:after="0"/>
+              <w:jc w:val="center"/>
+            </w:pPr>
+            <w:r>
+              <w:rPr>
+                <w:rFonts w:ascii="MS Gothic" w:hAnsi="MS Gothic" w:eastAsia="MS Gothic"/>
+                <w:b w:val="0"/>
+                <w:sz w:val="15"/>
+              </w:rPr>
+              <w:t>答え</w:t>
+            </w:r>
+          </w:p>
+        </w:tc>
+        <w:tc>
+          <w:tcPr>
+            <w:tcW w:type="dxa" w:w="850"/>
+            <w:vAlign w:val="center"/>
+          </w:tcPr>
+          <w:p>
+            <w:pPr>
+              <w:spacing w:before="0" w:after="0"/>
+              <w:jc w:val="center"/>
+            </w:pPr>
+            <w:r>
+              <w:rPr>
+                <w:rFonts w:ascii="MS Gothic" w:hAnsi="MS Gothic" w:eastAsia="MS Gothic"/>
+                <w:b w:val="0"/>
+                <w:sz w:val="18"/>
+              </w:rPr>
+            </w:r>
+          </w:p>
+        </w:tc>
+        <w:tc>
+          <w:tcPr>
+            <w:tcW w:type="dxa" w:w="227"/>
+            <w:tcBorders>
+              <w:top w:val="none" w:sz="0" w:space="0" w:color="auto"/>
+              <w:left w:val="none" w:sz="0" w:space="0" w:color="auto"/>
+              <w:bottom w:val="none" w:sz="0" w:space="0" w:color="auto"/>
+              <w:right w:val="none" w:sz="0" w:space="0" w:color="auto"/>
+              <w:insideH w:val="none" w:sz="0" w:space="0" w:color="auto"/>
+              <w:insideV w:val="none" w:sz="0" w:space="0" w:color="auto"/>
+            </w:tcBorders>
+          </w:tcPr>
+          <w:p/>
+        </w:tc>
+        <w:tc>
+          <w:tcPr>
+            <w:tcW w:type="dxa" w:w="1587"/>
+            <w:vAlign w:val="center"/>
+          </w:tcPr>
+          <w:p>
+            <w:pPr>
+              <w:spacing w:before="0" w:after="0"/>
+              <w:jc w:val="center"/>
+            </w:pPr>
+            <w:r>
+              <w:rPr>
+                <w:rFonts w:ascii="MS Gothic" w:hAnsi="MS Gothic" w:eastAsia="MS Gothic"/>
+                <w:b w:val="0"/>
+                <w:sz w:val="15"/>
+              </w:rPr>
+              <w:t>答え</w:t>
+            </w:r>
+          </w:p>
+        </w:tc>
+        <w:tc>
+          <w:tcPr>
+            <w:tcW w:type="dxa" w:w="850"/>
+            <w:vAlign w:val="center"/>
+          </w:tcPr>
+          <w:p>
+            <w:pPr>
+              <w:spacing w:before="0" w:after="0"/>
+              <w:jc w:val="center"/>
+            </w:pPr>
+            <w:r>
+              <w:rPr>
+                <w:rFonts w:ascii="MS Gothic" w:hAnsi="MS Gothic" w:eastAsia="MS Gothic"/>
+                <w:b w:val="0"/>
+                <w:sz w:val="18"/>
+              </w:rPr>
+            </w:r>
+          </w:p>
+        </w:tc>
+        <w:tc>
+          <w:tcPr>
+            <w:tcW w:type="dxa" w:w="227"/>
+            <w:tcBorders>
+              <w:top w:val="none" w:sz="0" w:space="0" w:color="auto"/>
+              <w:left w:val="none" w:sz="0" w:space="0" w:color="auto"/>
+              <w:bottom w:val="none" w:sz="0" w:space="0" w:color="auto"/>
+              <w:right w:val="none" w:sz="0" w:space="0" w:color="auto"/>
+              <w:insideH w:val="none" w:sz="0" w:space="0" w:color="auto"/>
+              <w:insideV w:val="none" w:sz="0" w:space="0" w:color="auto"/>
+            </w:tcBorders>
+          </w:tcPr>
+          <w:p/>
+        </w:tc>
+        <w:tc>
+          <w:tcPr>
+            <w:tcW w:type="dxa" w:w="2211"/>
+            <w:tcBorders>
+              <w:top w:val="none" w:sz="0" w:space="0" w:color="auto"/>
+              <w:left w:val="none" w:sz="0" w:space="0" w:color="auto"/>
+              <w:bottom w:val="none" w:sz="0" w:space="0" w:color="auto"/>
+              <w:right w:val="none" w:sz="0" w:space="0" w:color="auto"/>
+              <w:insideH w:val="none" w:sz="0" w:space="0" w:color="auto"/>
+              <w:insideV w:val="none" w:sz="0" w:space="0" w:color="auto"/>
+            </w:tcBorders>
+          </w:tcPr>
+          <w:p/>
+        </w:tc>
+      </w:tr>
+    </w:tbl>
+    <w:p>
+      <w:pPr>
+        <w:spacing w:before="40" w:after="20"/>
+      </w:pPr>
+      <w:r>
+        <w:rPr>
+          <w:rFonts w:ascii="MS Gothic" w:hAnsi="MS Gothic" w:eastAsia="MS Gothic"/>
+          <w:b w:val="0"/>
+          <w:sz w:val="17"/>
+        </w:rPr>
+        <w:t>問3（1×5=5点）　　S＝スパルタ　A＝アテネ</w:t>
+      </w:r>
+    </w:p>
+    <w:tbl>
+      <w:tblPr>
+        <w:tblStyle w:val="TableGrid"/>
+        <w:tblW w:type="auto" w:w="0"/>
+        <w:jc w:val="left"/>
+        <w:tblLook w:firstColumn="1" w:firstRow="1" w:lastColumn="0" w:lastRow="0" w:noHBand="0" w:noVBand="1" w:val="04A0"/>
+      </w:tblPr>
+      <w:tblGrid>
+        <w:gridCol w:w="1021"/>
+        <w:gridCol w:w="1021"/>
+        <w:gridCol w:w="1021"/>
+        <w:gridCol w:w="1021"/>
+        <w:gridCol w:w="1021"/>
+        <w:gridCol w:w="1021"/>
+        <w:gridCol w:w="1021"/>
+        <w:gridCol w:w="1021"/>
+        <w:gridCol w:w="1021"/>
+        <w:gridCol w:w="1021"/>
+      </w:tblGrid>
+      <w:tr>
+        <w:trPr>
+          <w:trHeight w:val="249" w:hRule="exact"/>
+        </w:trPr>
+        <w:tc>
+          <w:tcPr>
+            <w:tcW w:type="dxa" w:w="1134"/>
+            <w:vAlign w:val="center"/>
+            <w:shd w:val="clear" w:color="auto" w:fill="D9D9D9"/>
+          </w:tcPr>
+          <w:p>
+            <w:pPr>
+              <w:spacing w:before="0" w:after="0"/>
+              <w:jc w:val="center"/>
+            </w:pPr>
+            <w:r>
+              <w:rPr>
+                <w:rFonts w:ascii="MS Gothic" w:hAnsi="MS Gothic" w:eastAsia="MS Gothic"/>
+                <w:b/>
+                <w:sz w:val="16"/>
+              </w:rPr>
+              <w:t>(i)</w:t>
+            </w:r>
+          </w:p>
+        </w:tc>
+        <w:tc>
+          <w:tcPr>
+            <w:tcW w:type="dxa" w:w="907"/>
+            <w:vAlign w:val="center"/>
+          </w:tcPr>
+          <w:p>
+            <w:pPr>
+              <w:spacing w:before="0" w:after="0"/>
+              <w:jc w:val="center"/>
+            </w:pPr>
+            <w:r>
+              <w:rPr>
+                <w:rFonts w:ascii="MS Gothic" w:hAnsi="MS Gothic" w:eastAsia="MS Gothic"/>
+                <w:b w:val="0"/>
+                <w:sz w:val="18"/>
+              </w:rPr>
+            </w:r>
+          </w:p>
+        </w:tc>
+        <w:tc>
+          <w:tcPr>
+            <w:tcW w:type="dxa" w:w="1134"/>
+            <w:vAlign w:val="center"/>
+            <w:shd w:val="clear" w:color="auto" w:fill="D9D9D9"/>
+          </w:tcPr>
+          <w:p>
+            <w:pPr>
+              <w:spacing w:before="0" w:after="0"/>
+              <w:jc w:val="center"/>
+            </w:pPr>
+            <w:r>
+              <w:rPr>
+                <w:rFonts w:ascii="MS Gothic" w:hAnsi="MS Gothic" w:eastAsia="MS Gothic"/>
+                <w:b/>
+                <w:sz w:val="16"/>
+              </w:rPr>
+              <w:t>(ii)</w:t>
+            </w:r>
+          </w:p>
+        </w:tc>
+        <w:tc>
+          <w:tcPr>
+            <w:tcW w:type="dxa" w:w="907"/>
+            <w:vAlign w:val="center"/>
+          </w:tcPr>
+          <w:p>
+            <w:pPr>
+              <w:spacing w:before="0" w:after="0"/>
+              <w:jc w:val="center"/>
+            </w:pPr>
+            <w:r>
+              <w:rPr>
+                <w:rFonts w:ascii="MS Gothic" w:hAnsi="MS Gothic" w:eastAsia="MS Gothic"/>
+                <w:b w:val="0"/>
+                <w:sz w:val="18"/>
+              </w:rPr>
+            </w:r>
+          </w:p>
+        </w:tc>
+        <w:tc>
+          <w:tcPr>
+            <w:tcW w:type="dxa" w:w="1134"/>
+            <w:vAlign w:val="center"/>
+            <w:shd w:val="clear" w:color="auto" w:fill="D9D9D9"/>
+          </w:tcPr>
+          <w:p>
+            <w:pPr>
+              <w:spacing w:before="0" w:after="0"/>
+              <w:jc w:val="center"/>
+            </w:pPr>
+            <w:r>
+              <w:rPr>
+                <w:rFonts w:ascii="MS Gothic" w:hAnsi="MS Gothic" w:eastAsia="MS Gothic"/>
+                <w:b/>
+                <w:sz w:val="16"/>
+              </w:rPr>
+              <w:t>(iii)</w:t>
+            </w:r>
+          </w:p>
+        </w:tc>
+        <w:tc>
+          <w:tcPr>
+            <w:tcW w:type="dxa" w:w="907"/>
+            <w:vAlign w:val="center"/>
+          </w:tcPr>
+          <w:p>
+            <w:pPr>
+              <w:spacing w:before="0" w:after="0"/>
+              <w:jc w:val="center"/>
+            </w:pPr>
+            <w:r>
+              <w:rPr>
+                <w:rFonts w:ascii="MS Gothic" w:hAnsi="MS Gothic" w:eastAsia="MS Gothic"/>
+                <w:b w:val="0"/>
+                <w:sz w:val="18"/>
+              </w:rPr>
+            </w:r>
+          </w:p>
+        </w:tc>
+        <w:tc>
+          <w:tcPr>
+            <w:tcW w:type="dxa" w:w="1134"/>
+            <w:vAlign w:val="center"/>
+            <w:shd w:val="clear" w:color="auto" w:fill="D9D9D9"/>
+          </w:tcPr>
+          <w:p>
+            <w:pPr>
+              <w:spacing w:before="0" w:after="0"/>
+              <w:jc w:val="center"/>
+            </w:pPr>
+            <w:r>
+              <w:rPr>
+                <w:rFonts w:ascii="MS Gothic" w:hAnsi="MS Gothic" w:eastAsia="MS Gothic"/>
+                <w:b/>
+                <w:sz w:val="16"/>
+              </w:rPr>
+              <w:t>(iv)</w:t>
+            </w:r>
+          </w:p>
+        </w:tc>
+        <w:tc>
+          <w:tcPr>
+            <w:tcW w:type="dxa" w:w="907"/>
+            <w:vAlign w:val="center"/>
+          </w:tcPr>
+          <w:p>
+            <w:pPr>
+              <w:spacing w:before="0" w:after="0"/>
+              <w:jc w:val="center"/>
+            </w:pPr>
+            <w:r>
+              <w:rPr>
+                <w:rFonts w:ascii="MS Gothic" w:hAnsi="MS Gothic" w:eastAsia="MS Gothic"/>
+                <w:b w:val="0"/>
+                <w:sz w:val="18"/>
+              </w:rPr>
+            </w:r>
+          </w:p>
+        </w:tc>
+        <w:tc>
+          <w:tcPr>
+            <w:tcW w:type="dxa" w:w="1134"/>
+            <w:vAlign w:val="center"/>
+            <w:shd w:val="clear" w:color="auto" w:fill="D9D9D9"/>
+          </w:tcPr>
+          <w:p>
+            <w:pPr>
+              <w:spacing w:before="0" w:after="0"/>
+              <w:jc w:val="center"/>
+            </w:pPr>
+            <w:r>
+              <w:rPr>
+                <w:rFonts w:ascii="MS Gothic" w:hAnsi="MS Gothic" w:eastAsia="MS Gothic"/>
+                <w:b/>
+                <w:sz w:val="16"/>
+              </w:rPr>
+              <w:t>(v)</w:t>
+            </w:r>
+          </w:p>
+        </w:tc>
+        <w:tc>
+          <w:tcPr>
+            <w:tcW w:type="dxa" w:w="907"/>
+            <w:vAlign w:val="center"/>
           </w:tcPr>
           <w:p>
             <w:pPr>
@@ -4463,27 +4818,7 @@
         </w:trPr>
         <w:tc>
           <w:tcPr>
-            <w:tcW w:type="dxa" w:w="1247"/>
-            <w:vAlign w:val="center"/>
-          </w:tcPr>
-          <w:p>
-            <w:pPr>
-              <w:spacing w:before="0" w:after="0"/>
-              <w:jc w:val="center"/>
-            </w:pPr>
-            <w:r>
-              <w:rPr>
-                <w:rFonts w:ascii="MS Gothic" w:hAnsi="MS Gothic" w:eastAsia="MS Gothic"/>
-                <w:b w:val="0"/>
-                <w:sz w:val="15"/>
-              </w:rPr>
-              <w:t>答え</w:t>
-            </w:r>
-          </w:p>
-        </w:tc>
-        <w:tc>
-          <w:tcPr>
-            <w:tcW w:type="dxa" w:w="1474"/>
+            <w:tcW w:type="dxa" w:w="1134"/>
             <w:vAlign w:val="center"/>
           </w:tcPr>
           <w:p>
@@ -4502,27 +4837,7 @@
         </w:tc>
         <w:tc>
           <w:tcPr>
-            <w:tcW w:type="dxa" w:w="1247"/>
-            <w:vAlign w:val="center"/>
-          </w:tcPr>
-          <w:p>
-            <w:pPr>
-              <w:spacing w:before="0" w:after="0"/>
-              <w:jc w:val="center"/>
-            </w:pPr>
-            <w:r>
-              <w:rPr>
-                <w:rFonts w:ascii="MS Gothic" w:hAnsi="MS Gothic" w:eastAsia="MS Gothic"/>
-                <w:b w:val="0"/>
-                <w:sz w:val="15"/>
-              </w:rPr>
-              <w:t>答え</w:t>
-            </w:r>
-          </w:p>
-        </w:tc>
-        <w:tc>
-          <w:tcPr>
-            <w:tcW w:type="dxa" w:w="1474"/>
+            <w:tcW w:type="dxa" w:w="907"/>
             <w:vAlign w:val="center"/>
           </w:tcPr>
           <w:p>
@@ -4541,197 +4856,7 @@
         </w:tc>
         <w:tc>
           <w:tcPr>
-            <w:tcW w:type="dxa" w:w="1247"/>
-            <w:vAlign w:val="center"/>
-          </w:tcPr>
-          <w:p>
-            <w:pPr>
-              <w:spacing w:before="0" w:after="0"/>
-              <w:jc w:val="center"/>
-            </w:pPr>
-            <w:r>
-              <w:rPr>
-                <w:rFonts w:ascii="MS Gothic" w:hAnsi="MS Gothic" w:eastAsia="MS Gothic"/>
-                <w:b w:val="0"/>
-                <w:sz w:val="15"/>
-              </w:rPr>
-              <w:t>答え</w:t>
-            </w:r>
-          </w:p>
-        </w:tc>
-        <w:tc>
-          <w:tcPr>
-            <w:tcW w:type="dxa" w:w="3515"/>
-            <w:vAlign w:val="center"/>
-            <w:tcBorders>
-              <w:top w:val="none" w:sz="0" w:space="0" w:color="auto"/>
-              <w:left w:val="none" w:sz="0" w:space="0" w:color="auto"/>
-              <w:bottom w:val="none" w:sz="0" w:space="0" w:color="auto"/>
-              <w:right w:val="none" w:sz="0" w:space="0" w:color="auto"/>
-              <w:insideH w:val="none" w:sz="0" w:space="0" w:color="auto"/>
-              <w:insideV w:val="none" w:sz="0" w:space="0" w:color="auto"/>
-            </w:tcBorders>
-          </w:tcPr>
-          <w:p>
-            <w:pPr>
-              <w:spacing w:before="0" w:after="0"/>
-              <w:jc w:val="center"/>
-            </w:pPr>
-            <w:r>
-              <w:rPr>
-                <w:rFonts w:ascii="MS Gothic" w:hAnsi="MS Gothic" w:eastAsia="MS Gothic"/>
-                <w:b w:val="0"/>
-                <w:sz w:val="18"/>
-              </w:rPr>
-            </w:r>
-          </w:p>
-        </w:tc>
-      </w:tr>
-    </w:tbl>
-    <w:p>
-      <w:pPr>
-        <w:spacing w:before="40" w:after="20"/>
-      </w:pPr>
-      <w:r>
-        <w:rPr>
-          <w:rFonts w:ascii="MS Gothic" w:hAnsi="MS Gothic" w:eastAsia="MS Gothic"/>
-          <w:b w:val="0"/>
-          <w:sz w:val="17"/>
-        </w:rPr>
-        <w:t>問3（1×5=5点）　　SはスパルタのS、AはアテネのA</w:t>
-      </w:r>
-    </w:p>
-    <w:tbl>
-      <w:tblPr>
-        <w:tblStyle w:val="TableGrid"/>
-        <w:tblW w:type="auto" w:w="0"/>
-        <w:jc w:val="left"/>
-        <w:tblLook w:firstColumn="1" w:firstRow="1" w:lastColumn="0" w:lastRow="0" w:noHBand="0" w:noVBand="1" w:val="04A0"/>
-      </w:tblPr>
-      <w:tblGrid>
-        <w:gridCol w:w="2041"/>
-        <w:gridCol w:w="2041"/>
-        <w:gridCol w:w="2041"/>
-        <w:gridCol w:w="2041"/>
-        <w:gridCol w:w="2041"/>
-      </w:tblGrid>
-      <w:tr>
-        <w:trPr>
-          <w:trHeight w:val="249" w:hRule="exact"/>
-        </w:trPr>
-        <w:tc>
-          <w:tcPr>
-            <w:tcW w:type="dxa" w:w="2041"/>
-            <w:vAlign w:val="center"/>
-            <w:shd w:val="clear" w:color="auto" w:fill="D9D9D9"/>
-          </w:tcPr>
-          <w:p>
-            <w:pPr>
-              <w:spacing w:before="0" w:after="0"/>
-              <w:jc w:val="center"/>
-            </w:pPr>
-            <w:r>
-              <w:rPr>
-                <w:rFonts w:ascii="MS Gothic" w:hAnsi="MS Gothic" w:eastAsia="MS Gothic"/>
-                <w:b/>
-                <w:sz w:val="16"/>
-              </w:rPr>
-              <w:t>(i)</w:t>
-            </w:r>
-          </w:p>
-        </w:tc>
-        <w:tc>
-          <w:tcPr>
-            <w:tcW w:type="dxa" w:w="2041"/>
-            <w:vAlign w:val="center"/>
-            <w:shd w:val="clear" w:color="auto" w:fill="D9D9D9"/>
-          </w:tcPr>
-          <w:p>
-            <w:pPr>
-              <w:spacing w:before="0" w:after="0"/>
-              <w:jc w:val="center"/>
-            </w:pPr>
-            <w:r>
-              <w:rPr>
-                <w:rFonts w:ascii="MS Gothic" w:hAnsi="MS Gothic" w:eastAsia="MS Gothic"/>
-                <w:b/>
-                <w:sz w:val="16"/>
-              </w:rPr>
-              <w:t>(ii)</w:t>
-            </w:r>
-          </w:p>
-        </w:tc>
-        <w:tc>
-          <w:tcPr>
-            <w:tcW w:type="dxa" w:w="2041"/>
-            <w:vAlign w:val="center"/>
-            <w:shd w:val="clear" w:color="auto" w:fill="D9D9D9"/>
-          </w:tcPr>
-          <w:p>
-            <w:pPr>
-              <w:spacing w:before="0" w:after="0"/>
-              <w:jc w:val="center"/>
-            </w:pPr>
-            <w:r>
-              <w:rPr>
-                <w:rFonts w:ascii="MS Gothic" w:hAnsi="MS Gothic" w:eastAsia="MS Gothic"/>
-                <w:b/>
-                <w:sz w:val="16"/>
-              </w:rPr>
-              <w:t>(iii)</w:t>
-            </w:r>
-          </w:p>
-        </w:tc>
-        <w:tc>
-          <w:tcPr>
-            <w:tcW w:type="dxa" w:w="2041"/>
-            <w:vAlign w:val="center"/>
-            <w:shd w:val="clear" w:color="auto" w:fill="D9D9D9"/>
-          </w:tcPr>
-          <w:p>
-            <w:pPr>
-              <w:spacing w:before="0" w:after="0"/>
-              <w:jc w:val="center"/>
-            </w:pPr>
-            <w:r>
-              <w:rPr>
-                <w:rFonts w:ascii="MS Gothic" w:hAnsi="MS Gothic" w:eastAsia="MS Gothic"/>
-                <w:b/>
-                <w:sz w:val="16"/>
-              </w:rPr>
-              <w:t>(iv)</w:t>
-            </w:r>
-          </w:p>
-        </w:tc>
-        <w:tc>
-          <w:tcPr>
-            <w:tcW w:type="dxa" w:w="2041"/>
-            <w:vAlign w:val="center"/>
-            <w:shd w:val="clear" w:color="auto" w:fill="D9D9D9"/>
-          </w:tcPr>
-          <w:p>
-            <w:pPr>
-              <w:spacing w:before="0" w:after="0"/>
-              <w:jc w:val="center"/>
-            </w:pPr>
-            <w:r>
-              <w:rPr>
-                <w:rFonts w:ascii="MS Gothic" w:hAnsi="MS Gothic" w:eastAsia="MS Gothic"/>
-                <w:b/>
-                <w:sz w:val="16"/>
-              </w:rPr>
-              <w:t>(v)</w:t>
-            </w:r>
-          </w:p>
-        </w:tc>
-      </w:tr>
-      <w:tr>
-        <w:trPr>
-          <w:trHeight w:val="385" w:hRule="exact"/>
-        </w:trPr>
-        <w:tc>
-          <w:tcPr>
-            <w:tcW w:type="dxa" w:w="2041"/>
+            <w:tcW w:type="dxa" w:w="1134"/>
             <w:vAlign w:val="center"/>
           </w:tcPr>
           <w:p>
@@ -4750,7 +4875,7 @@
         </w:tc>
         <w:tc>
           <w:tcPr>
-            <w:tcW w:type="dxa" w:w="2041"/>
+            <w:tcW w:type="dxa" w:w="907"/>
             <w:vAlign w:val="center"/>
           </w:tcPr>
           <w:p>
@@ -4769,7 +4894,7 @@
         </w:tc>
         <w:tc>
           <w:tcPr>
-            <w:tcW w:type="dxa" w:w="2041"/>
+            <w:tcW w:type="dxa" w:w="1134"/>
             <w:vAlign w:val="center"/>
           </w:tcPr>
           <w:p>
@@ -4788,7 +4913,7 @@
         </w:tc>
         <w:tc>
           <w:tcPr>
-            <w:tcW w:type="dxa" w:w="2041"/>
+            <w:tcW w:type="dxa" w:w="907"/>
             <w:vAlign w:val="center"/>
           </w:tcPr>
           <w:p>
@@ -4807,7 +4932,64 @@
         </w:tc>
         <w:tc>
           <w:tcPr>
-            <w:tcW w:type="dxa" w:w="2041"/>
+            <w:tcW w:type="dxa" w:w="1134"/>
+            <w:vAlign w:val="center"/>
+          </w:tcPr>
+          <w:p>
+            <w:pPr>
+              <w:spacing w:before="0" w:after="0"/>
+              <w:jc w:val="center"/>
+            </w:pPr>
+            <w:r>
+              <w:rPr>
+                <w:rFonts w:ascii="MS Gothic" w:hAnsi="MS Gothic" w:eastAsia="MS Gothic"/>
+                <w:b w:val="0"/>
+                <w:sz w:val="18"/>
+              </w:rPr>
+            </w:r>
+          </w:p>
+        </w:tc>
+        <w:tc>
+          <w:tcPr>
+            <w:tcW w:type="dxa" w:w="907"/>
+            <w:vAlign w:val="center"/>
+          </w:tcPr>
+          <w:p>
+            <w:pPr>
+              <w:spacing w:before="0" w:after="0"/>
+              <w:jc w:val="center"/>
+            </w:pPr>
+            <w:r>
+              <w:rPr>
+                <w:rFonts w:ascii="MS Gothic" w:hAnsi="MS Gothic" w:eastAsia="MS Gothic"/>
+                <w:b w:val="0"/>
+                <w:sz w:val="18"/>
+              </w:rPr>
+            </w:r>
+          </w:p>
+        </w:tc>
+        <w:tc>
+          <w:tcPr>
+            <w:tcW w:type="dxa" w:w="1134"/>
+            <w:vAlign w:val="center"/>
+          </w:tcPr>
+          <w:p>
+            <w:pPr>
+              <w:spacing w:before="0" w:after="0"/>
+              <w:jc w:val="center"/>
+            </w:pPr>
+            <w:r>
+              <w:rPr>
+                <w:rFonts w:ascii="MS Gothic" w:hAnsi="MS Gothic" w:eastAsia="MS Gothic"/>
+                <w:b w:val="0"/>
+                <w:sz w:val="18"/>
+              </w:rPr>
+            </w:r>
+          </w:p>
+        </w:tc>
+        <w:tc>
+          <w:tcPr>
+            <w:tcW w:type="dxa" w:w="907"/>
             <w:vAlign w:val="center"/>
           </w:tcPr>
           <w:p>
@@ -4837,150 +5019,6 @@
           <w:sz w:val="17"/>
         </w:rPr>
         <w:t>問4（2点）　スパルタの女性がアテネの女性より「自由」を得られた理由（日本語）</w:t>
-      </w:r>
-    </w:p>
-    <w:tbl>
-      <w:tblPr>
-        <w:tblStyle w:val="TableGrid"/>
-        <w:tblW w:type="auto" w:w="0"/>
-        <w:jc w:val="left"/>
-        <w:tblLook w:firstColumn="1" w:firstRow="1" w:lastColumn="0" w:lastRow="0" w:noHBand="0" w:noVBand="1" w:val="04A0"/>
-      </w:tblPr>
-      <w:tblGrid>
-        <w:gridCol w:w="10206"/>
-      </w:tblGrid>
-      <w:tr>
-        <w:trPr>
-          <w:trHeight w:val="453" w:hRule="exact"/>
-        </w:trPr>
-        <w:tc>
-          <w:tcPr>
-            <w:tcW w:type="dxa" w:w="10205"/>
-            <w:vAlign w:val="center"/>
-          </w:tcPr>
-          <w:p>
-            <w:pPr>
-              <w:spacing w:before="0" w:after="0"/>
-              <w:jc w:val="center"/>
-            </w:pPr>
-            <w:r>
-              <w:rPr>
-                <w:rFonts w:ascii="MS Gothic" w:hAnsi="MS Gothic" w:eastAsia="MS Gothic"/>
-                <w:b w:val="0"/>
-                <w:sz w:val="18"/>
-              </w:rPr>
-            </w:r>
-          </w:p>
-        </w:tc>
-      </w:tr>
-      <w:tr>
-        <w:trPr>
-          <w:trHeight w:val="453" w:hRule="exact"/>
-        </w:trPr>
-        <w:tc>
-          <w:tcPr>
-            <w:tcW w:type="dxa" w:w="10205"/>
-            <w:vAlign w:val="center"/>
-          </w:tcPr>
-          <w:p>
-            <w:pPr>
-              <w:spacing w:before="0" w:after="0"/>
-              <w:jc w:val="center"/>
-            </w:pPr>
-            <w:r>
-              <w:rPr>
-                <w:rFonts w:ascii="MS Gothic" w:hAnsi="MS Gothic" w:eastAsia="MS Gothic"/>
-                <w:b w:val="0"/>
-                <w:sz w:val="18"/>
-              </w:rPr>
-            </w:r>
-          </w:p>
-        </w:tc>
-      </w:tr>
-    </w:tbl>
-    <w:p>
-      <w:pPr>
-        <w:spacing w:before="40" w:after="20"/>
-      </w:pPr>
-      <w:r>
-        <w:rPr>
-          <w:rFonts w:ascii="MS Gothic" w:hAnsi="MS Gothic" w:eastAsia="MS Gothic"/>
-          <w:b w:val="0"/>
-          <w:sz w:val="17"/>
-        </w:rPr>
-        <w:t>問6（3点）　下線部(2)を日本語にしなさい</w:t>
-      </w:r>
-    </w:p>
-    <w:tbl>
-      <w:tblPr>
-        <w:tblStyle w:val="TableGrid"/>
-        <w:tblW w:type="auto" w:w="0"/>
-        <w:jc w:val="left"/>
-        <w:tblLook w:firstColumn="1" w:firstRow="1" w:lastColumn="0" w:lastRow="0" w:noHBand="0" w:noVBand="1" w:val="04A0"/>
-      </w:tblPr>
-      <w:tblGrid>
-        <w:gridCol w:w="10206"/>
-      </w:tblGrid>
-      <w:tr>
-        <w:trPr>
-          <w:trHeight w:val="453" w:hRule="exact"/>
-        </w:trPr>
-        <w:tc>
-          <w:tcPr>
-            <w:tcW w:type="dxa" w:w="10205"/>
-            <w:vAlign w:val="center"/>
-          </w:tcPr>
-          <w:p>
-            <w:pPr>
-              <w:spacing w:before="0" w:after="0"/>
-              <w:jc w:val="center"/>
-            </w:pPr>
-            <w:r>
-              <w:rPr>
-                <w:rFonts w:ascii="MS Gothic" w:hAnsi="MS Gothic" w:eastAsia="MS Gothic"/>
-                <w:b w:val="0"/>
-                <w:sz w:val="18"/>
-              </w:rPr>
-            </w:r>
-          </w:p>
-        </w:tc>
-      </w:tr>
-      <w:tr>
-        <w:trPr>
-          <w:trHeight w:val="453" w:hRule="exact"/>
-        </w:trPr>
-        <w:tc>
-          <w:tcPr>
-            <w:tcW w:type="dxa" w:w="10205"/>
-            <w:vAlign w:val="center"/>
-          </w:tcPr>
-          <w:p>
-            <w:pPr>
-              <w:spacing w:before="0" w:after="0"/>
-              <w:jc w:val="center"/>
-            </w:pPr>
-            <w:r>
-              <w:rPr>
-                <w:rFonts w:ascii="MS Gothic" w:hAnsi="MS Gothic" w:eastAsia="MS Gothic"/>
-                <w:b w:val="0"/>
-                <w:sz w:val="18"/>
-              </w:rPr>
-            </w:r>
-          </w:p>
-        </w:tc>
-      </w:tr>
-    </w:tbl>
-    <w:p>
-      <w:pPr>
-        <w:spacing w:before="80" w:after="20"/>
-      </w:pPr>
-      <w:r>
-        <w:rPr>
-          <w:rFonts w:ascii="MS Gothic" w:hAnsi="MS Gothic" w:eastAsia="MS Gothic"/>
-          <w:b/>
-          <w:sz w:val="18"/>
-        </w:rPr>
-        <w:t>７　（思考・判断・表現　6点）　50語以上で書くこと</w:t>
       </w:r>
     </w:p>
     <w:tbl>
@@ -5041,54 +5079,30 @@
           </w:p>
         </w:tc>
       </w:tr>
-      <w:tr>
-        <w:trPr>
-          <w:trHeight w:val="464" w:hRule="exact"/>
-        </w:trPr>
-        <w:tc>
-          <w:tcPr>
-            <w:tcW w:type="dxa" w:w="10205"/>
-            <w:vAlign w:val="center"/>
-          </w:tcPr>
-          <w:p>
-            <w:pPr>
-              <w:spacing w:before="0" w:after="0"/>
-              <w:jc w:val="center"/>
-            </w:pPr>
-            <w:r>
-              <w:rPr>
-                <w:rFonts w:ascii="MS Gothic" w:hAnsi="MS Gothic" w:eastAsia="MS Gothic"/>
-                <w:b w:val="0"/>
-                <w:sz w:val="18"/>
-              </w:rPr>
-            </w:r>
-          </w:p>
-        </w:tc>
-      </w:tr>
-      <w:tr>
-        <w:trPr>
-          <w:trHeight w:val="464" w:hRule="exact"/>
-        </w:trPr>
-        <w:tc>
-          <w:tcPr>
-            <w:tcW w:type="dxa" w:w="10205"/>
-            <w:vAlign w:val="center"/>
-          </w:tcPr>
-          <w:p>
-            <w:pPr>
-              <w:spacing w:before="0" w:after="0"/>
-              <w:jc w:val="center"/>
-            </w:pPr>
-            <w:r>
-              <w:rPr>
-                <w:rFonts w:ascii="MS Gothic" w:hAnsi="MS Gothic" w:eastAsia="MS Gothic"/>
-                <w:b w:val="0"/>
-                <w:sz w:val="18"/>
-              </w:rPr>
-            </w:r>
-          </w:p>
-        </w:tc>
-      </w:tr>
+    </w:tbl>
+    <w:p>
+      <w:pPr>
+        <w:spacing w:before="40" w:after="20"/>
+      </w:pPr>
+      <w:r>
+        <w:rPr>
+          <w:rFonts w:ascii="MS Gothic" w:hAnsi="MS Gothic" w:eastAsia="MS Gothic"/>
+          <w:b w:val="0"/>
+          <w:sz w:val="17"/>
+        </w:rPr>
+        <w:t>問6（3点）　下線部(2)を日本語にしなさい</w:t>
+      </w:r>
+    </w:p>
+    <w:tbl>
+      <w:tblPr>
+        <w:tblStyle w:val="TableGrid"/>
+        <w:tblW w:type="auto" w:w="0"/>
+        <w:jc w:val="left"/>
+        <w:tblLook w:firstColumn="1" w:firstRow="1" w:lastColumn="0" w:lastRow="0" w:noHBand="0" w:noVBand="1" w:val="04A0"/>
+      </w:tblPr>
+      <w:tblGrid>
+        <w:gridCol w:w="10206"/>
+      </w:tblGrid>
       <w:tr>
         <w:trPr>
           <w:trHeight w:val="464" w:hRule="exact"/>
@@ -5148,6 +5162,174 @@
           <w:b/>
           <w:sz w:val="18"/>
         </w:rPr>
+        <w:t>７　（思考・判断・表現　6点）　50語以上で書くこと</w:t>
+      </w:r>
+    </w:p>
+    <w:tbl>
+      <w:tblPr>
+        <w:tblStyle w:val="TableGrid"/>
+        <w:tblW w:type="auto" w:w="0"/>
+        <w:jc w:val="left"/>
+        <w:tblLook w:firstColumn="1" w:firstRow="1" w:lastColumn="0" w:lastRow="0" w:noHBand="0" w:noVBand="1" w:val="04A0"/>
+      </w:tblPr>
+      <w:tblGrid>
+        <w:gridCol w:w="10206"/>
+      </w:tblGrid>
+      <w:tr>
+        <w:trPr>
+          <w:trHeight w:val="470" w:hRule="exact"/>
+        </w:trPr>
+        <w:tc>
+          <w:tcPr>
+            <w:tcW w:type="dxa" w:w="10205"/>
+            <w:vAlign w:val="center"/>
+          </w:tcPr>
+          <w:p>
+            <w:pPr>
+              <w:spacing w:before="0" w:after="0"/>
+              <w:jc w:val="center"/>
+            </w:pPr>
+            <w:r>
+              <w:rPr>
+                <w:rFonts w:ascii="MS Gothic" w:hAnsi="MS Gothic" w:eastAsia="MS Gothic"/>
+                <w:b w:val="0"/>
+                <w:sz w:val="18"/>
+              </w:rPr>
+            </w:r>
+          </w:p>
+        </w:tc>
+      </w:tr>
+      <w:tr>
+        <w:trPr>
+          <w:trHeight w:val="470" w:hRule="exact"/>
+        </w:trPr>
+        <w:tc>
+          <w:tcPr>
+            <w:tcW w:type="dxa" w:w="10205"/>
+            <w:vAlign w:val="center"/>
+          </w:tcPr>
+          <w:p>
+            <w:pPr>
+              <w:spacing w:before="0" w:after="0"/>
+              <w:jc w:val="center"/>
+            </w:pPr>
+            <w:r>
+              <w:rPr>
+                <w:rFonts w:ascii="MS Gothic" w:hAnsi="MS Gothic" w:eastAsia="MS Gothic"/>
+                <w:b w:val="0"/>
+                <w:sz w:val="18"/>
+              </w:rPr>
+            </w:r>
+          </w:p>
+        </w:tc>
+      </w:tr>
+      <w:tr>
+        <w:trPr>
+          <w:trHeight w:val="470" w:hRule="exact"/>
+        </w:trPr>
+        <w:tc>
+          <w:tcPr>
+            <w:tcW w:type="dxa" w:w="10205"/>
+            <w:vAlign w:val="center"/>
+          </w:tcPr>
+          <w:p>
+            <w:pPr>
+              <w:spacing w:before="0" w:after="0"/>
+              <w:jc w:val="center"/>
+            </w:pPr>
+            <w:r>
+              <w:rPr>
+                <w:rFonts w:ascii="MS Gothic" w:hAnsi="MS Gothic" w:eastAsia="MS Gothic"/>
+                <w:b w:val="0"/>
+                <w:sz w:val="18"/>
+              </w:rPr>
+            </w:r>
+          </w:p>
+        </w:tc>
+      </w:tr>
+      <w:tr>
+        <w:trPr>
+          <w:trHeight w:val="470" w:hRule="exact"/>
+        </w:trPr>
+        <w:tc>
+          <w:tcPr>
+            <w:tcW w:type="dxa" w:w="10205"/>
+            <w:vAlign w:val="center"/>
+          </w:tcPr>
+          <w:p>
+            <w:pPr>
+              <w:spacing w:before="0" w:after="0"/>
+              <w:jc w:val="center"/>
+            </w:pPr>
+            <w:r>
+              <w:rPr>
+                <w:rFonts w:ascii="MS Gothic" w:hAnsi="MS Gothic" w:eastAsia="MS Gothic"/>
+                <w:b w:val="0"/>
+                <w:sz w:val="18"/>
+              </w:rPr>
+            </w:r>
+          </w:p>
+        </w:tc>
+      </w:tr>
+      <w:tr>
+        <w:trPr>
+          <w:trHeight w:val="470" w:hRule="exact"/>
+        </w:trPr>
+        <w:tc>
+          <w:tcPr>
+            <w:tcW w:type="dxa" w:w="10205"/>
+            <w:vAlign w:val="center"/>
+          </w:tcPr>
+          <w:p>
+            <w:pPr>
+              <w:spacing w:before="0" w:after="0"/>
+              <w:jc w:val="center"/>
+            </w:pPr>
+            <w:r>
+              <w:rPr>
+                <w:rFonts w:ascii="MS Gothic" w:hAnsi="MS Gothic" w:eastAsia="MS Gothic"/>
+                <w:b w:val="0"/>
+                <w:sz w:val="18"/>
+              </w:rPr>
+            </w:r>
+          </w:p>
+        </w:tc>
+      </w:tr>
+      <w:tr>
+        <w:trPr>
+          <w:trHeight w:val="470" w:hRule="exact"/>
+        </w:trPr>
+        <w:tc>
+          <w:tcPr>
+            <w:tcW w:type="dxa" w:w="10205"/>
+            <w:vAlign w:val="center"/>
+          </w:tcPr>
+          <w:p>
+            <w:pPr>
+              <w:spacing w:before="0" w:after="0"/>
+              <w:jc w:val="center"/>
+            </w:pPr>
+            <w:r>
+              <w:rPr>
+                <w:rFonts w:ascii="MS Gothic" w:hAnsi="MS Gothic" w:eastAsia="MS Gothic"/>
+                <w:b w:val="0"/>
+                <w:sz w:val="18"/>
+              </w:rPr>
+            </w:r>
+          </w:p>
+        </w:tc>
+      </w:tr>
+    </w:tbl>
+    <w:p>
+      <w:pPr>
+        <w:spacing w:before="100" w:after="20"/>
+      </w:pPr>
+      <w:r>
+        <w:rPr>
+          <w:rFonts w:ascii="MS Gothic" w:hAnsi="MS Gothic" w:eastAsia="MS Gothic"/>
+          <w:b/>
+          <w:sz w:val="18"/>
+        </w:rPr>
         <w:t>得点集計</w:t>
       </w:r>
     </w:p>
@@ -5159,10 +5341,9 @@
         <w:tblLook w:firstColumn="1" w:firstRow="1" w:lastColumn="0" w:lastRow="0" w:noHBand="0" w:noVBand="1" w:val="04A0"/>
       </w:tblPr>
       <w:tblGrid>
-        <w:gridCol w:w="2551"/>
-        <w:gridCol w:w="2551"/>
-        <w:gridCol w:w="2551"/>
-        <w:gridCol w:w="2551"/>
+        <w:gridCol w:w="3402"/>
+        <w:gridCol w:w="3402"/>
+        <w:gridCol w:w="3402"/>
       </w:tblGrid>
       <w:tr>
         <w:trPr>
@@ -5185,7 +5366,7 @@
                 <w:b/>
                 <w:sz w:val="16"/>
               </w:rPr>
-              <w:t>１〜３（知識・技能）　/43</w:t>
+              <w:t>２・３（知識・技能）　/43</w:t>
             </w:r>
           </w:p>
         </w:tc>
@@ -5212,7 +5393,7 @@
         </w:tc>
         <w:tc>
           <w:tcPr>
-            <w:tcW w:type="dxa" w:w="2268"/>
+            <w:tcW w:type="dxa" w:w="3402"/>
             <w:vAlign w:val="center"/>
             <w:shd w:val="clear" w:color="auto" w:fill="D9D9D9"/>
           </w:tcPr>
@@ -5230,20 +5411,6 @@
               <w:t>合計　/100</w:t>
             </w:r>
           </w:p>
-        </w:tc>
-        <w:tc>
-          <w:tcPr>
-            <w:tcW w:type="dxa" w:w="1134"/>
-            <w:tcBorders>
-              <w:top w:val="none" w:sz="0" w:space="0" w:color="auto"/>
-              <w:left w:val="none" w:sz="0" w:space="0" w:color="auto"/>
-              <w:bottom w:val="none" w:sz="0" w:space="0" w:color="auto"/>
-              <w:right w:val="none" w:sz="0" w:space="0" w:color="auto"/>
-              <w:insideH w:val="none" w:sz="0" w:space="0" w:color="auto"/>
-              <w:insideV w:val="none" w:sz="0" w:space="0" w:color="auto"/>
-            </w:tcBorders>
-          </w:tcPr>
-          <w:p/>
         </w:tc>
       </w:tr>
       <w:tr>
@@ -5290,7 +5457,7 @@
         </w:tc>
         <w:tc>
           <w:tcPr>
-            <w:tcW w:type="dxa" w:w="2268"/>
+            <w:tcW w:type="dxa" w:w="3402"/>
             <w:vAlign w:val="center"/>
           </w:tcPr>
           <w:p>
@@ -5306,20 +5473,6 @@
               </w:rPr>
             </w:r>
           </w:p>
-        </w:tc>
-        <w:tc>
-          <w:tcPr>
-            <w:tcW w:type="dxa" w:w="1134"/>
-            <w:tcBorders>
-              <w:top w:val="none" w:sz="0" w:space="0" w:color="auto"/>
-              <w:left w:val="none" w:sz="0" w:space="0" w:color="auto"/>
-              <w:bottom w:val="none" w:sz="0" w:space="0" w:color="auto"/>
-              <w:right w:val="none" w:sz="0" w:space="0" w:color="auto"/>
-              <w:insideH w:val="none" w:sz="0" w:space="0" w:color="auto"/>
-              <w:insideV w:val="none" w:sz="0" w:space="0" w:color="auto"/>
-            </w:tcBorders>
-          </w:tcPr>
-          <w:p/>
         </w:tc>
       </w:tr>
     </w:tbl>

</xml_diff>

<commit_message>
Regenerate answer sheet and add answer key; compress to 2 A4 pages
- Reduce margins to 1.2cm to fit content in 2 pages per document
- §3A returns to 2-questions/row (0.82cm height); answer key uses atLeast
  height so long sentence answers can wrap without overflowing the page
- Create answer key (解答例) with same layout, answers in red text
- Consolidate v2/v3 scripts; single v4 script generates both files

https://claude.ai/code/session_01H92aASVAdh5CWUTRq4hYds
</commit_message>
<xml_diff>
--- a/2026年度_論理表現Ⅱ_中間テスト_解答用紙.docx
+++ b/2026年度_論理表現Ⅱ_中間テスト_解答用紙.docx
@@ -24,14 +24,14 @@
         <w:tblLook w:firstColumn="1" w:firstRow="1" w:lastColumn="0" w:lastRow="0" w:noHBand="0" w:noVBand="1" w:val="04A0"/>
       </w:tblPr>
       <w:tblGrid>
-        <w:gridCol w:w="2551"/>
-        <w:gridCol w:w="2551"/>
-        <w:gridCol w:w="2551"/>
-        <w:gridCol w:w="2551"/>
+        <w:gridCol w:w="2636"/>
+        <w:gridCol w:w="2636"/>
+        <w:gridCol w:w="2636"/>
+        <w:gridCol w:w="2636"/>
       </w:tblGrid>
       <w:tr>
         <w:trPr>
-          <w:trHeight w:val="368" w:hRule="exact"/>
+          <w:trHeight w:val="340" w:hRule="exact"/>
         </w:trPr>
         <w:tc>
           <w:tcPr>
@@ -81,14 +81,14 @@
         </w:tc>
         <w:tc>
           <w:tcPr>
-            <w:tcW w:type="dxa" w:w="6009"/>
+            <w:tcW w:type="dxa" w:w="6350"/>
           </w:tcPr>
           <w:p/>
         </w:tc>
       </w:tr>
       <w:tr>
         <w:trPr>
-          <w:trHeight w:val="368" w:hRule="exact"/>
+          <w:trHeight w:val="340" w:hRule="exact"/>
         </w:trPr>
         <w:tc>
           <w:tcPr>
@@ -112,7 +112,7 @@
         </w:tc>
         <w:tc>
           <w:tcPr>
-            <w:tcW w:type="dxa" w:w="8957"/>
+            <w:tcW w:type="dxa" w:w="9298"/>
             <w:gridSpan w:val="3"/>
           </w:tcPr>
           <w:p/>
@@ -153,16 +153,16 @@
         <w:tblLook w:firstColumn="1" w:firstRow="1" w:lastColumn="0" w:lastRow="0" w:noHBand="0" w:noVBand="1" w:val="04A0"/>
       </w:tblPr>
       <w:tblGrid>
-        <w:gridCol w:w="1701"/>
-        <w:gridCol w:w="1701"/>
-        <w:gridCol w:w="1701"/>
-        <w:gridCol w:w="1701"/>
-        <w:gridCol w:w="1701"/>
-        <w:gridCol w:w="1701"/>
+        <w:gridCol w:w="1758"/>
+        <w:gridCol w:w="1758"/>
+        <w:gridCol w:w="1758"/>
+        <w:gridCol w:w="1758"/>
+        <w:gridCol w:w="1758"/>
+        <w:gridCol w:w="1758"/>
       </w:tblGrid>
       <w:tr>
         <w:trPr>
-          <w:trHeight w:val="396" w:hRule="exact"/>
+          <w:trHeight w:val="385" w:hRule="exact"/>
         </w:trPr>
         <w:tc>
           <w:tcPr>
@@ -260,7 +260,7 @@
         </w:tc>
         <w:tc>
           <w:tcPr>
-            <w:tcW w:type="dxa" w:w="5046"/>
+            <w:tcW w:type="dxa" w:w="5386"/>
             <w:tcBorders>
               <w:top w:val="none" w:sz="0" w:space="0" w:color="auto"/>
               <w:left w:val="none" w:sz="0" w:space="0" w:color="auto"/>
@@ -295,19 +295,19 @@
         <w:tblLook w:firstColumn="1" w:firstRow="1" w:lastColumn="0" w:lastRow="0" w:noHBand="0" w:noVBand="1" w:val="04A0"/>
       </w:tblPr>
       <w:tblGrid>
-        <w:gridCol w:w="1134"/>
-        <w:gridCol w:w="1134"/>
-        <w:gridCol w:w="1134"/>
-        <w:gridCol w:w="1134"/>
-        <w:gridCol w:w="1134"/>
-        <w:gridCol w:w="1134"/>
-        <w:gridCol w:w="1134"/>
-        <w:gridCol w:w="1134"/>
-        <w:gridCol w:w="1134"/>
+        <w:gridCol w:w="1172"/>
+        <w:gridCol w:w="1172"/>
+        <w:gridCol w:w="1172"/>
+        <w:gridCol w:w="1172"/>
+        <w:gridCol w:w="1172"/>
+        <w:gridCol w:w="1172"/>
+        <w:gridCol w:w="1172"/>
+        <w:gridCol w:w="1172"/>
+        <w:gridCol w:w="1172"/>
       </w:tblGrid>
       <w:tr>
         <w:trPr>
-          <w:trHeight w:val="249" w:hRule="exact"/>
+          <w:trHeight w:val="238" w:hRule="exact"/>
         </w:trPr>
         <w:tc>
           <w:tcPr>
@@ -332,7 +332,7 @@
         </w:tc>
         <w:tc>
           <w:tcPr>
-            <w:tcW w:type="dxa" w:w="1502"/>
+            <w:tcW w:type="dxa" w:w="1559"/>
             <w:vAlign w:val="center"/>
           </w:tcPr>
           <w:p>
@@ -351,7 +351,7 @@
         </w:tc>
         <w:tc>
           <w:tcPr>
-            <w:tcW w:type="dxa" w:w="1502"/>
+            <w:tcW w:type="dxa" w:w="1559"/>
             <w:vAlign w:val="center"/>
           </w:tcPr>
           <w:p>
@@ -370,7 +370,7 @@
         </w:tc>
         <w:tc>
           <w:tcPr>
-            <w:tcW w:type="dxa" w:w="1502"/>
+            <w:tcW w:type="dxa" w:w="1559"/>
             <w:vAlign w:val="center"/>
           </w:tcPr>
           <w:p>
@@ -410,7 +410,7 @@
         </w:tc>
         <w:tc>
           <w:tcPr>
-            <w:tcW w:type="dxa" w:w="1502"/>
+            <w:tcW w:type="dxa" w:w="1559"/>
             <w:vAlign w:val="center"/>
           </w:tcPr>
           <w:p>
@@ -429,7 +429,7 @@
         </w:tc>
         <w:tc>
           <w:tcPr>
-            <w:tcW w:type="dxa" w:w="1502"/>
+            <w:tcW w:type="dxa" w:w="1559"/>
             <w:vAlign w:val="center"/>
           </w:tcPr>
           <w:p>
@@ -469,7 +469,7 @@
         </w:tc>
         <w:tc>
           <w:tcPr>
-            <w:tcW w:type="dxa" w:w="1502"/>
+            <w:tcW w:type="dxa" w:w="1559"/>
             <w:vAlign w:val="center"/>
           </w:tcPr>
           <w:p>
@@ -489,7 +489,7 @@
       </w:tr>
       <w:tr>
         <w:trPr>
-          <w:trHeight w:val="396" w:hRule="exact"/>
+          <w:trHeight w:val="385" w:hRule="exact"/>
         </w:trPr>
         <w:tc>
           <w:tcPr>
@@ -507,7 +507,7 @@
         </w:tc>
         <w:tc>
           <w:tcPr>
-            <w:tcW w:type="dxa" w:w="1502"/>
+            <w:tcW w:type="dxa" w:w="1559"/>
             <w:vAlign w:val="center"/>
           </w:tcPr>
           <w:p>
@@ -526,7 +526,7 @@
         </w:tc>
         <w:tc>
           <w:tcPr>
-            <w:tcW w:type="dxa" w:w="1502"/>
+            <w:tcW w:type="dxa" w:w="1559"/>
             <w:vAlign w:val="center"/>
           </w:tcPr>
           <w:p>
@@ -545,7 +545,7 @@
         </w:tc>
         <w:tc>
           <w:tcPr>
-            <w:tcW w:type="dxa" w:w="1502"/>
+            <w:tcW w:type="dxa" w:w="1559"/>
             <w:vAlign w:val="center"/>
           </w:tcPr>
           <w:p>
@@ -578,7 +578,7 @@
         </w:tc>
         <w:tc>
           <w:tcPr>
-            <w:tcW w:type="dxa" w:w="1502"/>
+            <w:tcW w:type="dxa" w:w="1559"/>
             <w:vAlign w:val="center"/>
           </w:tcPr>
           <w:p>
@@ -597,7 +597,7 @@
         </w:tc>
         <w:tc>
           <w:tcPr>
-            <w:tcW w:type="dxa" w:w="1502"/>
+            <w:tcW w:type="dxa" w:w="1559"/>
             <w:vAlign w:val="center"/>
           </w:tcPr>
           <w:p>
@@ -630,7 +630,7 @@
         </w:tc>
         <w:tc>
           <w:tcPr>
-            <w:tcW w:type="dxa" w:w="1502"/>
+            <w:tcW w:type="dxa" w:w="1559"/>
             <w:vAlign w:val="center"/>
           </w:tcPr>
           <w:p>
@@ -657,19 +657,19 @@
         <w:tblLook w:firstColumn="1" w:firstRow="1" w:lastColumn="0" w:lastRow="0" w:noHBand="0" w:noVBand="1" w:val="04A0"/>
       </w:tblPr>
       <w:tblGrid>
-        <w:gridCol w:w="1134"/>
-        <w:gridCol w:w="1134"/>
-        <w:gridCol w:w="1134"/>
-        <w:gridCol w:w="1134"/>
-        <w:gridCol w:w="1134"/>
-        <w:gridCol w:w="1134"/>
-        <w:gridCol w:w="1134"/>
-        <w:gridCol w:w="1134"/>
-        <w:gridCol w:w="1134"/>
+        <w:gridCol w:w="1172"/>
+        <w:gridCol w:w="1172"/>
+        <w:gridCol w:w="1172"/>
+        <w:gridCol w:w="1172"/>
+        <w:gridCol w:w="1172"/>
+        <w:gridCol w:w="1172"/>
+        <w:gridCol w:w="1172"/>
+        <w:gridCol w:w="1172"/>
+        <w:gridCol w:w="1172"/>
       </w:tblGrid>
       <w:tr>
         <w:trPr>
-          <w:trHeight w:val="249" w:hRule="exact"/>
+          <w:trHeight w:val="238" w:hRule="exact"/>
         </w:trPr>
         <w:tc>
           <w:tcPr>
@@ -694,7 +694,7 @@
         </w:tc>
         <w:tc>
           <w:tcPr>
-            <w:tcW w:type="dxa" w:w="1502"/>
+            <w:tcW w:type="dxa" w:w="1559"/>
             <w:vAlign w:val="center"/>
           </w:tcPr>
           <w:p>
@@ -713,7 +713,7 @@
         </w:tc>
         <w:tc>
           <w:tcPr>
-            <w:tcW w:type="dxa" w:w="1502"/>
+            <w:tcW w:type="dxa" w:w="1559"/>
             <w:vAlign w:val="center"/>
           </w:tcPr>
           <w:p>
@@ -732,7 +732,7 @@
         </w:tc>
         <w:tc>
           <w:tcPr>
-            <w:tcW w:type="dxa" w:w="1502"/>
+            <w:tcW w:type="dxa" w:w="1559"/>
             <w:vAlign w:val="center"/>
           </w:tcPr>
           <w:p>
@@ -772,7 +772,7 @@
         </w:tc>
         <w:tc>
           <w:tcPr>
-            <w:tcW w:type="dxa" w:w="1502"/>
+            <w:tcW w:type="dxa" w:w="1559"/>
             <w:vAlign w:val="center"/>
           </w:tcPr>
           <w:p>
@@ -791,7 +791,7 @@
         </w:tc>
         <w:tc>
           <w:tcPr>
-            <w:tcW w:type="dxa" w:w="1502"/>
+            <w:tcW w:type="dxa" w:w="1559"/>
             <w:vAlign w:val="center"/>
           </w:tcPr>
           <w:p>
@@ -810,7 +810,7 @@
         </w:tc>
         <w:tc>
           <w:tcPr>
-            <w:tcW w:type="dxa" w:w="1502"/>
+            <w:tcW w:type="dxa" w:w="1559"/>
             <w:vAlign w:val="center"/>
           </w:tcPr>
           <w:p>
@@ -844,7 +844,7 @@
       </w:tr>
       <w:tr>
         <w:trPr>
-          <w:trHeight w:val="396" w:hRule="exact"/>
+          <w:trHeight w:val="385" w:hRule="exact"/>
         </w:trPr>
         <w:tc>
           <w:tcPr>
@@ -862,7 +862,7 @@
         </w:tc>
         <w:tc>
           <w:tcPr>
-            <w:tcW w:type="dxa" w:w="1502"/>
+            <w:tcW w:type="dxa" w:w="1559"/>
             <w:vAlign w:val="center"/>
           </w:tcPr>
           <w:p>
@@ -881,7 +881,7 @@
         </w:tc>
         <w:tc>
           <w:tcPr>
-            <w:tcW w:type="dxa" w:w="1502"/>
+            <w:tcW w:type="dxa" w:w="1559"/>
             <w:vAlign w:val="center"/>
           </w:tcPr>
           <w:p>
@@ -900,7 +900,7 @@
         </w:tc>
         <w:tc>
           <w:tcPr>
-            <w:tcW w:type="dxa" w:w="1502"/>
+            <w:tcW w:type="dxa" w:w="1559"/>
             <w:vAlign w:val="center"/>
           </w:tcPr>
           <w:p>
@@ -933,7 +933,7 @@
         </w:tc>
         <w:tc>
           <w:tcPr>
-            <w:tcW w:type="dxa" w:w="1502"/>
+            <w:tcW w:type="dxa" w:w="1559"/>
             <w:vAlign w:val="center"/>
           </w:tcPr>
           <w:p>
@@ -952,7 +952,7 @@
         </w:tc>
         <w:tc>
           <w:tcPr>
-            <w:tcW w:type="dxa" w:w="1502"/>
+            <w:tcW w:type="dxa" w:w="1559"/>
             <w:vAlign w:val="center"/>
           </w:tcPr>
           <w:p>
@@ -971,7 +971,7 @@
         </w:tc>
         <w:tc>
           <w:tcPr>
-            <w:tcW w:type="dxa" w:w="1502"/>
+            <w:tcW w:type="dxa" w:w="1559"/>
             <w:vAlign w:val="center"/>
           </w:tcPr>
           <w:p>
@@ -1038,24 +1038,24 @@
         <w:tblLook w:firstColumn="1" w:firstRow="1" w:lastColumn="0" w:lastRow="0" w:noHBand="0" w:noVBand="1" w:val="04A0"/>
       </w:tblPr>
       <w:tblGrid>
-        <w:gridCol w:w="1021"/>
-        <w:gridCol w:w="1021"/>
-        <w:gridCol w:w="1021"/>
-        <w:gridCol w:w="1021"/>
-        <w:gridCol w:w="1021"/>
-        <w:gridCol w:w="1021"/>
-        <w:gridCol w:w="1021"/>
-        <w:gridCol w:w="1021"/>
-        <w:gridCol w:w="1021"/>
-        <w:gridCol w:w="1021"/>
+        <w:gridCol w:w="1055"/>
+        <w:gridCol w:w="1055"/>
+        <w:gridCol w:w="1055"/>
+        <w:gridCol w:w="1055"/>
+        <w:gridCol w:w="1055"/>
+        <w:gridCol w:w="1055"/>
+        <w:gridCol w:w="1055"/>
+        <w:gridCol w:w="1055"/>
+        <w:gridCol w:w="1055"/>
+        <w:gridCol w:w="1055"/>
       </w:tblGrid>
       <w:tr>
         <w:trPr>
-          <w:trHeight w:val="249" w:hRule="exact"/>
+          <w:trHeight w:val="238" w:hRule="exact"/>
         </w:trPr>
         <w:tc>
           <w:tcPr>
-            <w:tcW w:type="dxa" w:w="1020"/>
+            <w:tcW w:type="dxa" w:w="1054"/>
             <w:vAlign w:val="center"/>
             <w:shd w:val="clear" w:color="auto" w:fill="D9D9D9"/>
           </w:tcPr>
@@ -1076,7 +1076,7 @@
         </w:tc>
         <w:tc>
           <w:tcPr>
-            <w:tcW w:type="dxa" w:w="1020"/>
+            <w:tcW w:type="dxa" w:w="1054"/>
             <w:vAlign w:val="center"/>
             <w:shd w:val="clear" w:color="auto" w:fill="D9D9D9"/>
           </w:tcPr>
@@ -1097,7 +1097,7 @@
         </w:tc>
         <w:tc>
           <w:tcPr>
-            <w:tcW w:type="dxa" w:w="1020"/>
+            <w:tcW w:type="dxa" w:w="1054"/>
             <w:vAlign w:val="center"/>
             <w:shd w:val="clear" w:color="auto" w:fill="D9D9D9"/>
           </w:tcPr>
@@ -1118,7 +1118,7 @@
         </w:tc>
         <w:tc>
           <w:tcPr>
-            <w:tcW w:type="dxa" w:w="1020"/>
+            <w:tcW w:type="dxa" w:w="1054"/>
             <w:vAlign w:val="center"/>
             <w:shd w:val="clear" w:color="auto" w:fill="D9D9D9"/>
           </w:tcPr>
@@ -1139,7 +1139,7 @@
         </w:tc>
         <w:tc>
           <w:tcPr>
-            <w:tcW w:type="dxa" w:w="1020"/>
+            <w:tcW w:type="dxa" w:w="1054"/>
             <w:vAlign w:val="center"/>
             <w:shd w:val="clear" w:color="auto" w:fill="D9D9D9"/>
           </w:tcPr>
@@ -1160,7 +1160,7 @@
         </w:tc>
         <w:tc>
           <w:tcPr>
-            <w:tcW w:type="dxa" w:w="1020"/>
+            <w:tcW w:type="dxa" w:w="1054"/>
             <w:vAlign w:val="center"/>
             <w:shd w:val="clear" w:color="auto" w:fill="D9D9D9"/>
           </w:tcPr>
@@ -1181,7 +1181,7 @@
         </w:tc>
         <w:tc>
           <w:tcPr>
-            <w:tcW w:type="dxa" w:w="1020"/>
+            <w:tcW w:type="dxa" w:w="1054"/>
             <w:vAlign w:val="center"/>
             <w:shd w:val="clear" w:color="auto" w:fill="D9D9D9"/>
           </w:tcPr>
@@ -1202,7 +1202,7 @@
         </w:tc>
         <w:tc>
           <w:tcPr>
-            <w:tcW w:type="dxa" w:w="1020"/>
+            <w:tcW w:type="dxa" w:w="1054"/>
             <w:vAlign w:val="center"/>
             <w:shd w:val="clear" w:color="auto" w:fill="D9D9D9"/>
           </w:tcPr>
@@ -1223,7 +1223,7 @@
         </w:tc>
         <w:tc>
           <w:tcPr>
-            <w:tcW w:type="dxa" w:w="1020"/>
+            <w:tcW w:type="dxa" w:w="1054"/>
             <w:vAlign w:val="center"/>
             <w:shd w:val="clear" w:color="auto" w:fill="D9D9D9"/>
           </w:tcPr>
@@ -1244,7 +1244,7 @@
         </w:tc>
         <w:tc>
           <w:tcPr>
-            <w:tcW w:type="dxa" w:w="1020"/>
+            <w:tcW w:type="dxa" w:w="1054"/>
             <w:vAlign w:val="center"/>
             <w:shd w:val="clear" w:color="auto" w:fill="D9D9D9"/>
           </w:tcPr>
@@ -1266,11 +1266,11 @@
       </w:tr>
       <w:tr>
         <w:trPr>
-          <w:trHeight w:val="385" w:hRule="exact"/>
+          <w:trHeight w:val="374" w:hRule="exact"/>
         </w:trPr>
         <w:tc>
           <w:tcPr>
-            <w:tcW w:type="dxa" w:w="1020"/>
+            <w:tcW w:type="dxa" w:w="1054"/>
             <w:vAlign w:val="center"/>
           </w:tcPr>
           <w:p>
@@ -1289,7 +1289,7 @@
         </w:tc>
         <w:tc>
           <w:tcPr>
-            <w:tcW w:type="dxa" w:w="1020"/>
+            <w:tcW w:type="dxa" w:w="1054"/>
             <w:vAlign w:val="center"/>
           </w:tcPr>
           <w:p>
@@ -1308,7 +1308,7 @@
         </w:tc>
         <w:tc>
           <w:tcPr>
-            <w:tcW w:type="dxa" w:w="1020"/>
+            <w:tcW w:type="dxa" w:w="1054"/>
             <w:vAlign w:val="center"/>
           </w:tcPr>
           <w:p>
@@ -1327,7 +1327,7 @@
         </w:tc>
         <w:tc>
           <w:tcPr>
-            <w:tcW w:type="dxa" w:w="1020"/>
+            <w:tcW w:type="dxa" w:w="1054"/>
             <w:vAlign w:val="center"/>
           </w:tcPr>
           <w:p>
@@ -1346,7 +1346,7 @@
         </w:tc>
         <w:tc>
           <w:tcPr>
-            <w:tcW w:type="dxa" w:w="1020"/>
+            <w:tcW w:type="dxa" w:w="1054"/>
             <w:vAlign w:val="center"/>
           </w:tcPr>
           <w:p>
@@ -1365,7 +1365,7 @@
         </w:tc>
         <w:tc>
           <w:tcPr>
-            <w:tcW w:type="dxa" w:w="1020"/>
+            <w:tcW w:type="dxa" w:w="1054"/>
             <w:vAlign w:val="center"/>
           </w:tcPr>
           <w:p>
@@ -1384,7 +1384,7 @@
         </w:tc>
         <w:tc>
           <w:tcPr>
-            <w:tcW w:type="dxa" w:w="1020"/>
+            <w:tcW w:type="dxa" w:w="1054"/>
             <w:vAlign w:val="center"/>
           </w:tcPr>
           <w:p>
@@ -1403,7 +1403,7 @@
         </w:tc>
         <w:tc>
           <w:tcPr>
-            <w:tcW w:type="dxa" w:w="1020"/>
+            <w:tcW w:type="dxa" w:w="1054"/>
             <w:vAlign w:val="center"/>
           </w:tcPr>
           <w:p>
@@ -1422,7 +1422,7 @@
         </w:tc>
         <w:tc>
           <w:tcPr>
-            <w:tcW w:type="dxa" w:w="1020"/>
+            <w:tcW w:type="dxa" w:w="1054"/>
             <w:vAlign w:val="center"/>
           </w:tcPr>
           <w:p>
@@ -1441,7 +1441,7 @@
         </w:tc>
         <w:tc>
           <w:tcPr>
-            <w:tcW w:type="dxa" w:w="1020"/>
+            <w:tcW w:type="dxa" w:w="1054"/>
             <w:vAlign w:val="center"/>
           </w:tcPr>
           <w:p>
@@ -1481,19 +1481,19 @@
         <w:tblLook w:firstColumn="1" w:firstRow="1" w:lastColumn="0" w:lastRow="0" w:noHBand="0" w:noVBand="1" w:val="04A0"/>
       </w:tblPr>
       <w:tblGrid>
-        <w:gridCol w:w="2041"/>
-        <w:gridCol w:w="2041"/>
-        <w:gridCol w:w="2041"/>
-        <w:gridCol w:w="2041"/>
-        <w:gridCol w:w="2041"/>
+        <w:gridCol w:w="2109"/>
+        <w:gridCol w:w="2109"/>
+        <w:gridCol w:w="2109"/>
+        <w:gridCol w:w="2109"/>
+        <w:gridCol w:w="2109"/>
       </w:tblGrid>
       <w:tr>
         <w:trPr>
-          <w:trHeight w:val="249" w:hRule="exact"/>
+          <w:trHeight w:val="238" w:hRule="exact"/>
         </w:trPr>
         <w:tc>
           <w:tcPr>
-            <w:tcW w:type="dxa" w:w="2041"/>
+            <w:tcW w:type="dxa" w:w="2109"/>
             <w:vAlign w:val="center"/>
             <w:shd w:val="clear" w:color="auto" w:fill="D9D9D9"/>
           </w:tcPr>
@@ -1514,7 +1514,7 @@
         </w:tc>
         <w:tc>
           <w:tcPr>
-            <w:tcW w:type="dxa" w:w="2041"/>
+            <w:tcW w:type="dxa" w:w="2109"/>
             <w:vAlign w:val="center"/>
             <w:shd w:val="clear" w:color="auto" w:fill="D9D9D9"/>
           </w:tcPr>
@@ -1535,7 +1535,7 @@
         </w:tc>
         <w:tc>
           <w:tcPr>
-            <w:tcW w:type="dxa" w:w="2041"/>
+            <w:tcW w:type="dxa" w:w="2109"/>
             <w:vAlign w:val="center"/>
             <w:shd w:val="clear" w:color="auto" w:fill="D9D9D9"/>
           </w:tcPr>
@@ -1556,7 +1556,7 @@
         </w:tc>
         <w:tc>
           <w:tcPr>
-            <w:tcW w:type="dxa" w:w="2041"/>
+            <w:tcW w:type="dxa" w:w="2109"/>
             <w:vAlign w:val="center"/>
             <w:shd w:val="clear" w:color="auto" w:fill="D9D9D9"/>
           </w:tcPr>
@@ -1577,7 +1577,7 @@
         </w:tc>
         <w:tc>
           <w:tcPr>
-            <w:tcW w:type="dxa" w:w="2041"/>
+            <w:tcW w:type="dxa" w:w="2109"/>
             <w:vAlign w:val="center"/>
             <w:shd w:val="clear" w:color="auto" w:fill="D9D9D9"/>
           </w:tcPr>
@@ -1599,11 +1599,11 @@
       </w:tr>
       <w:tr>
         <w:trPr>
-          <w:trHeight w:val="396" w:hRule="exact"/>
+          <w:trHeight w:val="385" w:hRule="exact"/>
         </w:trPr>
         <w:tc>
           <w:tcPr>
-            <w:tcW w:type="dxa" w:w="2041"/>
+            <w:tcW w:type="dxa" w:w="2109"/>
             <w:vAlign w:val="center"/>
           </w:tcPr>
           <w:p>
@@ -1622,7 +1622,7 @@
         </w:tc>
         <w:tc>
           <w:tcPr>
-            <w:tcW w:type="dxa" w:w="2041"/>
+            <w:tcW w:type="dxa" w:w="2109"/>
             <w:vAlign w:val="center"/>
           </w:tcPr>
           <w:p>
@@ -1641,7 +1641,7 @@
         </w:tc>
         <w:tc>
           <w:tcPr>
-            <w:tcW w:type="dxa" w:w="2041"/>
+            <w:tcW w:type="dxa" w:w="2109"/>
             <w:vAlign w:val="center"/>
           </w:tcPr>
           <w:p>
@@ -1660,7 +1660,7 @@
         </w:tc>
         <w:tc>
           <w:tcPr>
-            <w:tcW w:type="dxa" w:w="2041"/>
+            <w:tcW w:type="dxa" w:w="2109"/>
             <w:vAlign w:val="center"/>
           </w:tcPr>
           <w:p>
@@ -1679,7 +1679,7 @@
         </w:tc>
         <w:tc>
           <w:tcPr>
-            <w:tcW w:type="dxa" w:w="2041"/>
+            <w:tcW w:type="dxa" w:w="2109"/>
             <w:vAlign w:val="center"/>
           </w:tcPr>
           <w:p>
@@ -1732,12 +1732,14 @@
         <w:tblLook w:firstColumn="1" w:firstRow="1" w:lastColumn="0" w:lastRow="0" w:noHBand="0" w:noVBand="1" w:val="04A0"/>
       </w:tblPr>
       <w:tblGrid>
-        <w:gridCol w:w="5103"/>
-        <w:gridCol w:w="5103"/>
+        <w:gridCol w:w="2636"/>
+        <w:gridCol w:w="2636"/>
+        <w:gridCol w:w="2636"/>
+        <w:gridCol w:w="2636"/>
       </w:tblGrid>
       <w:tr>
         <w:trPr>
-          <w:trHeight w:val="408" w:hRule="exact"/>
+          <w:trHeight w:val="464" w:hRule="exact"/>
         </w:trPr>
         <w:tc>
           <w:tcPr>
@@ -1762,13 +1764,13 @@
         </w:tc>
         <w:tc>
           <w:tcPr>
-            <w:tcW w:type="dxa" w:w="9808"/>
+            <w:tcW w:type="dxa" w:w="4876"/>
             <w:vAlign w:val="center"/>
           </w:tcPr>
           <w:p>
             <w:pPr>
               <w:spacing w:before="0" w:after="0"/>
-              <w:jc w:val="left"/>
+              <w:jc w:val="center"/>
             </w:pPr>
             <w:r>
               <w:rPr>
@@ -1779,11 +1781,6 @@
             </w:r>
           </w:p>
         </w:tc>
-      </w:tr>
-      <w:tr>
-        <w:trPr>
-          <w:trHeight w:val="408" w:hRule="exact"/>
-        </w:trPr>
         <w:tc>
           <w:tcPr>
             <w:tcW w:type="dxa" w:w="397"/>
@@ -1807,13 +1804,13 @@
         </w:tc>
         <w:tc>
           <w:tcPr>
-            <w:tcW w:type="dxa" w:w="9808"/>
+            <w:tcW w:type="dxa" w:w="4876"/>
             <w:vAlign w:val="center"/>
           </w:tcPr>
           <w:p>
             <w:pPr>
               <w:spacing w:before="0" w:after="0"/>
-              <w:jc w:val="left"/>
+              <w:jc w:val="center"/>
             </w:pPr>
             <w:r>
               <w:rPr>
@@ -1827,7 +1824,7 @@
       </w:tr>
       <w:tr>
         <w:trPr>
-          <w:trHeight w:val="408" w:hRule="exact"/>
+          <w:trHeight w:val="464" w:hRule="exact"/>
         </w:trPr>
         <w:tc>
           <w:tcPr>
@@ -1852,13 +1849,13 @@
         </w:tc>
         <w:tc>
           <w:tcPr>
-            <w:tcW w:type="dxa" w:w="9808"/>
+            <w:tcW w:type="dxa" w:w="4876"/>
             <w:vAlign w:val="center"/>
           </w:tcPr>
           <w:p>
             <w:pPr>
               <w:spacing w:before="0" w:after="0"/>
-              <w:jc w:val="left"/>
+              <w:jc w:val="center"/>
             </w:pPr>
             <w:r>
               <w:rPr>
@@ -1869,11 +1866,6 @@
             </w:r>
           </w:p>
         </w:tc>
-      </w:tr>
-      <w:tr>
-        <w:trPr>
-          <w:trHeight w:val="408" w:hRule="exact"/>
-        </w:trPr>
         <w:tc>
           <w:tcPr>
             <w:tcW w:type="dxa" w:w="397"/>
@@ -1897,13 +1889,13 @@
         </w:tc>
         <w:tc>
           <w:tcPr>
-            <w:tcW w:type="dxa" w:w="9808"/>
+            <w:tcW w:type="dxa" w:w="4876"/>
             <w:vAlign w:val="center"/>
           </w:tcPr>
           <w:p>
             <w:pPr>
               <w:spacing w:before="0" w:after="0"/>
-              <w:jc w:val="left"/>
+              <w:jc w:val="center"/>
             </w:pPr>
             <w:r>
               <w:rPr>
@@ -1917,7 +1909,7 @@
       </w:tr>
       <w:tr>
         <w:trPr>
-          <w:trHeight w:val="408" w:hRule="exact"/>
+          <w:trHeight w:val="464" w:hRule="exact"/>
         </w:trPr>
         <w:tc>
           <w:tcPr>
@@ -1942,13 +1934,13 @@
         </w:tc>
         <w:tc>
           <w:tcPr>
-            <w:tcW w:type="dxa" w:w="9808"/>
+            <w:tcW w:type="dxa" w:w="4876"/>
             <w:vAlign w:val="center"/>
           </w:tcPr>
           <w:p>
             <w:pPr>
               <w:spacing w:before="0" w:after="0"/>
-              <w:jc w:val="left"/>
+              <w:jc w:val="center"/>
             </w:pPr>
             <w:r>
               <w:rPr>
@@ -1959,11 +1951,6 @@
             </w:r>
           </w:p>
         </w:tc>
-      </w:tr>
-      <w:tr>
-        <w:trPr>
-          <w:trHeight w:val="408" w:hRule="exact"/>
-        </w:trPr>
         <w:tc>
           <w:tcPr>
             <w:tcW w:type="dxa" w:w="397"/>
@@ -1987,13 +1974,13 @@
         </w:tc>
         <w:tc>
           <w:tcPr>
-            <w:tcW w:type="dxa" w:w="9808"/>
+            <w:tcW w:type="dxa" w:w="4876"/>
             <w:vAlign w:val="center"/>
           </w:tcPr>
           <w:p>
             <w:pPr>
               <w:spacing w:before="0" w:after="0"/>
-              <w:jc w:val="left"/>
+              <w:jc w:val="center"/>
             </w:pPr>
             <w:r>
               <w:rPr>
@@ -2007,7 +1994,7 @@
       </w:tr>
       <w:tr>
         <w:trPr>
-          <w:trHeight w:val="408" w:hRule="exact"/>
+          <w:trHeight w:val="464" w:hRule="exact"/>
         </w:trPr>
         <w:tc>
           <w:tcPr>
@@ -2032,13 +2019,13 @@
         </w:tc>
         <w:tc>
           <w:tcPr>
-            <w:tcW w:type="dxa" w:w="9808"/>
+            <w:tcW w:type="dxa" w:w="4876"/>
             <w:vAlign w:val="center"/>
           </w:tcPr>
           <w:p>
             <w:pPr>
               <w:spacing w:before="0" w:after="0"/>
-              <w:jc w:val="left"/>
+              <w:jc w:val="center"/>
             </w:pPr>
             <w:r>
               <w:rPr>
@@ -2049,11 +2036,6 @@
             </w:r>
           </w:p>
         </w:tc>
-      </w:tr>
-      <w:tr>
-        <w:trPr>
-          <w:trHeight w:val="408" w:hRule="exact"/>
-        </w:trPr>
         <w:tc>
           <w:tcPr>
             <w:tcW w:type="dxa" w:w="397"/>
@@ -2077,13 +2059,13 @@
         </w:tc>
         <w:tc>
           <w:tcPr>
-            <w:tcW w:type="dxa" w:w="9808"/>
+            <w:tcW w:type="dxa" w:w="4876"/>
             <w:vAlign w:val="center"/>
           </w:tcPr>
           <w:p>
             <w:pPr>
               <w:spacing w:before="0" w:after="0"/>
-              <w:jc w:val="left"/>
+              <w:jc w:val="center"/>
             </w:pPr>
             <w:r>
               <w:rPr>
@@ -2097,7 +2079,7 @@
       </w:tr>
       <w:tr>
         <w:trPr>
-          <w:trHeight w:val="408" w:hRule="exact"/>
+          <w:trHeight w:val="464" w:hRule="exact"/>
         </w:trPr>
         <w:tc>
           <w:tcPr>
@@ -2122,13 +2104,13 @@
         </w:tc>
         <w:tc>
           <w:tcPr>
-            <w:tcW w:type="dxa" w:w="9808"/>
+            <w:tcW w:type="dxa" w:w="4876"/>
             <w:vAlign w:val="center"/>
           </w:tcPr>
           <w:p>
             <w:pPr>
               <w:spacing w:before="0" w:after="0"/>
-              <w:jc w:val="left"/>
+              <w:jc w:val="center"/>
             </w:pPr>
             <w:r>
               <w:rPr>
@@ -2139,11 +2121,6 @@
             </w:r>
           </w:p>
         </w:tc>
-      </w:tr>
-      <w:tr>
-        <w:trPr>
-          <w:trHeight w:val="408" w:hRule="exact"/>
-        </w:trPr>
         <w:tc>
           <w:tcPr>
             <w:tcW w:type="dxa" w:w="397"/>
@@ -2167,13 +2144,13 @@
         </w:tc>
         <w:tc>
           <w:tcPr>
-            <w:tcW w:type="dxa" w:w="9808"/>
+            <w:tcW w:type="dxa" w:w="4876"/>
             <w:vAlign w:val="center"/>
           </w:tcPr>
           <w:p>
             <w:pPr>
               <w:spacing w:before="0" w:after="0"/>
-              <w:jc w:val="left"/>
+              <w:jc w:val="center"/>
             </w:pPr>
             <w:r>
               <w:rPr>
@@ -2207,18 +2184,18 @@
         <w:tblLook w:firstColumn="1" w:firstRow="1" w:lastColumn="0" w:lastRow="0" w:noHBand="0" w:noVBand="1" w:val="04A0"/>
       </w:tblPr>
       <w:tblGrid>
-        <w:gridCol w:w="1276"/>
-        <w:gridCol w:w="1276"/>
-        <w:gridCol w:w="1276"/>
-        <w:gridCol w:w="1276"/>
-        <w:gridCol w:w="1276"/>
-        <w:gridCol w:w="1276"/>
-        <w:gridCol w:w="1276"/>
-        <w:gridCol w:w="1276"/>
+        <w:gridCol w:w="1318"/>
+        <w:gridCol w:w="1318"/>
+        <w:gridCol w:w="1318"/>
+        <w:gridCol w:w="1318"/>
+        <w:gridCol w:w="1318"/>
+        <w:gridCol w:w="1318"/>
+        <w:gridCol w:w="1318"/>
+        <w:gridCol w:w="1318"/>
       </w:tblGrid>
       <w:tr>
         <w:trPr>
-          <w:trHeight w:val="385" w:hRule="exact"/>
+          <w:trHeight w:val="374" w:hRule="exact"/>
         </w:trPr>
         <w:tc>
           <w:tcPr>
@@ -2243,7 +2220,7 @@
         </w:tc>
         <w:tc>
           <w:tcPr>
-            <w:tcW w:type="dxa" w:w="1587"/>
+            <w:tcW w:type="dxa" w:w="1644"/>
             <w:vAlign w:val="center"/>
           </w:tcPr>
           <w:p>
@@ -2262,7 +2239,7 @@
         </w:tc>
         <w:tc>
           <w:tcPr>
-            <w:tcW w:type="dxa" w:w="1587"/>
+            <w:tcW w:type="dxa" w:w="1644"/>
             <w:tcBorders>
               <w:top w:val="none" w:sz="0" w:space="0" w:color="auto"/>
               <w:left w:val="none" w:sz="0" w:space="0" w:color="auto"/>
@@ -2276,7 +2253,7 @@
         </w:tc>
         <w:tc>
           <w:tcPr>
-            <w:tcW w:type="dxa" w:w="1587"/>
+            <w:tcW w:type="dxa" w:w="1644"/>
             <w:tcBorders>
               <w:top w:val="none" w:sz="0" w:space="0" w:color="auto"/>
               <w:left w:val="none" w:sz="0" w:space="0" w:color="auto"/>
@@ -2311,7 +2288,7 @@
         </w:tc>
         <w:tc>
           <w:tcPr>
-            <w:tcW w:type="dxa" w:w="1587"/>
+            <w:tcW w:type="dxa" w:w="1644"/>
             <w:vAlign w:val="center"/>
           </w:tcPr>
           <w:p>
@@ -2330,7 +2307,7 @@
         </w:tc>
         <w:tc>
           <w:tcPr>
-            <w:tcW w:type="dxa" w:w="1587"/>
+            <w:tcW w:type="dxa" w:w="1644"/>
             <w:tcBorders>
               <w:top w:val="none" w:sz="0" w:space="0" w:color="auto"/>
               <w:left w:val="none" w:sz="0" w:space="0" w:color="auto"/>
@@ -2344,7 +2321,7 @@
         </w:tc>
         <w:tc>
           <w:tcPr>
-            <w:tcW w:type="dxa" w:w="1587"/>
+            <w:tcW w:type="dxa" w:w="1644"/>
             <w:tcBorders>
               <w:top w:val="none" w:sz="0" w:space="0" w:color="auto"/>
               <w:left w:val="none" w:sz="0" w:space="0" w:color="auto"/>
@@ -2359,7 +2336,7 @@
       </w:tr>
       <w:tr>
         <w:trPr>
-          <w:trHeight w:val="385" w:hRule="exact"/>
+          <w:trHeight w:val="374" w:hRule="exact"/>
         </w:trPr>
         <w:tc>
           <w:tcPr>
@@ -2384,7 +2361,7 @@
         </w:tc>
         <w:tc>
           <w:tcPr>
-            <w:tcW w:type="dxa" w:w="1587"/>
+            <w:tcW w:type="dxa" w:w="1644"/>
             <w:vAlign w:val="center"/>
           </w:tcPr>
           <w:p>
@@ -2403,7 +2380,7 @@
         </w:tc>
         <w:tc>
           <w:tcPr>
-            <w:tcW w:type="dxa" w:w="1587"/>
+            <w:tcW w:type="dxa" w:w="1644"/>
             <w:vAlign w:val="center"/>
           </w:tcPr>
           <w:p>
@@ -2422,7 +2399,7 @@
         </w:tc>
         <w:tc>
           <w:tcPr>
-            <w:tcW w:type="dxa" w:w="1587"/>
+            <w:tcW w:type="dxa" w:w="1644"/>
             <w:tcBorders>
               <w:top w:val="none" w:sz="0" w:space="0" w:color="auto"/>
               <w:left w:val="none" w:sz="0" w:space="0" w:color="auto"/>
@@ -2457,7 +2434,7 @@
         </w:tc>
         <w:tc>
           <w:tcPr>
-            <w:tcW w:type="dxa" w:w="1587"/>
+            <w:tcW w:type="dxa" w:w="1644"/>
             <w:vAlign w:val="center"/>
           </w:tcPr>
           <w:p>
@@ -2476,7 +2453,7 @@
         </w:tc>
         <w:tc>
           <w:tcPr>
-            <w:tcW w:type="dxa" w:w="1587"/>
+            <w:tcW w:type="dxa" w:w="1644"/>
             <w:vAlign w:val="center"/>
           </w:tcPr>
           <w:p>
@@ -2495,7 +2472,7 @@
         </w:tc>
         <w:tc>
           <w:tcPr>
-            <w:tcW w:type="dxa" w:w="1587"/>
+            <w:tcW w:type="dxa" w:w="1644"/>
             <w:tcBorders>
               <w:top w:val="none" w:sz="0" w:space="0" w:color="auto"/>
               <w:left w:val="none" w:sz="0" w:space="0" w:color="auto"/>
@@ -2510,7 +2487,7 @@
       </w:tr>
       <w:tr>
         <w:trPr>
-          <w:trHeight w:val="385" w:hRule="exact"/>
+          <w:trHeight w:val="374" w:hRule="exact"/>
         </w:trPr>
         <w:tc>
           <w:tcPr>
@@ -2535,7 +2512,7 @@
         </w:tc>
         <w:tc>
           <w:tcPr>
-            <w:tcW w:type="dxa" w:w="1587"/>
+            <w:tcW w:type="dxa" w:w="1644"/>
             <w:vAlign w:val="center"/>
           </w:tcPr>
           <w:p>
@@ -2554,7 +2531,7 @@
         </w:tc>
         <w:tc>
           <w:tcPr>
-            <w:tcW w:type="dxa" w:w="1587"/>
+            <w:tcW w:type="dxa" w:w="1644"/>
             <w:vAlign w:val="center"/>
           </w:tcPr>
           <w:p>
@@ -2573,7 +2550,7 @@
         </w:tc>
         <w:tc>
           <w:tcPr>
-            <w:tcW w:type="dxa" w:w="1587"/>
+            <w:tcW w:type="dxa" w:w="1644"/>
             <w:tcBorders>
               <w:top w:val="none" w:sz="0" w:space="0" w:color="auto"/>
               <w:left w:val="none" w:sz="0" w:space="0" w:color="auto"/>
@@ -2608,7 +2585,7 @@
         </w:tc>
         <w:tc>
           <w:tcPr>
-            <w:tcW w:type="dxa" w:w="1587"/>
+            <w:tcW w:type="dxa" w:w="1644"/>
             <w:vAlign w:val="center"/>
           </w:tcPr>
           <w:p>
@@ -2627,7 +2604,7 @@
         </w:tc>
         <w:tc>
           <w:tcPr>
-            <w:tcW w:type="dxa" w:w="1587"/>
+            <w:tcW w:type="dxa" w:w="1644"/>
             <w:vAlign w:val="center"/>
           </w:tcPr>
           <w:p>
@@ -2646,7 +2623,7 @@
         </w:tc>
         <w:tc>
           <w:tcPr>
-            <w:tcW w:type="dxa" w:w="1587"/>
+            <w:tcW w:type="dxa" w:w="1644"/>
             <w:tcBorders>
               <w:top w:val="none" w:sz="0" w:space="0" w:color="auto"/>
               <w:left w:val="none" w:sz="0" w:space="0" w:color="auto"/>
@@ -2661,7 +2638,7 @@
       </w:tr>
       <w:tr>
         <w:trPr>
-          <w:trHeight w:val="385" w:hRule="exact"/>
+          <w:trHeight w:val="374" w:hRule="exact"/>
         </w:trPr>
         <w:tc>
           <w:tcPr>
@@ -2686,7 +2663,7 @@
         </w:tc>
         <w:tc>
           <w:tcPr>
-            <w:tcW w:type="dxa" w:w="1587"/>
+            <w:tcW w:type="dxa" w:w="1644"/>
             <w:vAlign w:val="center"/>
           </w:tcPr>
           <w:p>
@@ -2705,7 +2682,7 @@
         </w:tc>
         <w:tc>
           <w:tcPr>
-            <w:tcW w:type="dxa" w:w="1587"/>
+            <w:tcW w:type="dxa" w:w="1644"/>
             <w:vAlign w:val="center"/>
           </w:tcPr>
           <w:p>
@@ -2724,7 +2701,7 @@
         </w:tc>
         <w:tc>
           <w:tcPr>
-            <w:tcW w:type="dxa" w:w="1587"/>
+            <w:tcW w:type="dxa" w:w="1644"/>
             <w:vAlign w:val="center"/>
           </w:tcPr>
           <w:p>
@@ -2764,7 +2741,7 @@
         </w:tc>
         <w:tc>
           <w:tcPr>
-            <w:tcW w:type="dxa" w:w="1587"/>
+            <w:tcW w:type="dxa" w:w="1644"/>
             <w:vAlign w:val="center"/>
           </w:tcPr>
           <w:p>
@@ -2783,7 +2760,7 @@
         </w:tc>
         <w:tc>
           <w:tcPr>
-            <w:tcW w:type="dxa" w:w="1587"/>
+            <w:tcW w:type="dxa" w:w="1644"/>
             <w:vAlign w:val="center"/>
           </w:tcPr>
           <w:p>
@@ -2802,7 +2779,7 @@
         </w:tc>
         <w:tc>
           <w:tcPr>
-            <w:tcW w:type="dxa" w:w="1587"/>
+            <w:tcW w:type="dxa" w:w="1644"/>
             <w:tcBorders>
               <w:top w:val="none" w:sz="0" w:space="0" w:color="auto"/>
               <w:left w:val="none" w:sz="0" w:space="0" w:color="auto"/>
@@ -2817,7 +2794,7 @@
       </w:tr>
       <w:tr>
         <w:trPr>
-          <w:trHeight w:val="385" w:hRule="exact"/>
+          <w:trHeight w:val="374" w:hRule="exact"/>
         </w:trPr>
         <w:tc>
           <w:tcPr>
@@ -2842,7 +2819,7 @@
         </w:tc>
         <w:tc>
           <w:tcPr>
-            <w:tcW w:type="dxa" w:w="1587"/>
+            <w:tcW w:type="dxa" w:w="1644"/>
             <w:vAlign w:val="center"/>
           </w:tcPr>
           <w:p>
@@ -2861,7 +2838,7 @@
         </w:tc>
         <w:tc>
           <w:tcPr>
-            <w:tcW w:type="dxa" w:w="1587"/>
+            <w:tcW w:type="dxa" w:w="1644"/>
             <w:vAlign w:val="center"/>
           </w:tcPr>
           <w:p>
@@ -2880,7 +2857,7 @@
         </w:tc>
         <w:tc>
           <w:tcPr>
-            <w:tcW w:type="dxa" w:w="1587"/>
+            <w:tcW w:type="dxa" w:w="1644"/>
             <w:vAlign w:val="center"/>
           </w:tcPr>
           <w:p>
@@ -2920,7 +2897,7 @@
         </w:tc>
         <w:tc>
           <w:tcPr>
-            <w:tcW w:type="dxa" w:w="1587"/>
+            <w:tcW w:type="dxa" w:w="1644"/>
             <w:vAlign w:val="center"/>
           </w:tcPr>
           <w:p>
@@ -2939,7 +2916,7 @@
         </w:tc>
         <w:tc>
           <w:tcPr>
-            <w:tcW w:type="dxa" w:w="1587"/>
+            <w:tcW w:type="dxa" w:w="1644"/>
             <w:vAlign w:val="center"/>
           </w:tcPr>
           <w:p>
@@ -2958,7 +2935,7 @@
         </w:tc>
         <w:tc>
           <w:tcPr>
-            <w:tcW w:type="dxa" w:w="1587"/>
+            <w:tcW w:type="dxa" w:w="1644"/>
             <w:tcBorders>
               <w:top w:val="none" w:sz="0" w:space="0" w:color="auto"/>
               <w:left w:val="none" w:sz="0" w:space="0" w:color="auto"/>
@@ -2973,7 +2950,7 @@
       </w:tr>
       <w:tr>
         <w:trPr>
-          <w:trHeight w:val="385" w:hRule="exact"/>
+          <w:trHeight w:val="374" w:hRule="exact"/>
         </w:trPr>
         <w:tc>
           <w:tcPr>
@@ -2998,7 +2975,7 @@
         </w:tc>
         <w:tc>
           <w:tcPr>
-            <w:tcW w:type="dxa" w:w="1587"/>
+            <w:tcW w:type="dxa" w:w="1644"/>
             <w:vAlign w:val="center"/>
           </w:tcPr>
           <w:p>
@@ -3017,7 +2994,7 @@
         </w:tc>
         <w:tc>
           <w:tcPr>
-            <w:tcW w:type="dxa" w:w="1587"/>
+            <w:tcW w:type="dxa" w:w="1644"/>
             <w:vAlign w:val="center"/>
           </w:tcPr>
           <w:p>
@@ -3036,7 +3013,7 @@
         </w:tc>
         <w:tc>
           <w:tcPr>
-            <w:tcW w:type="dxa" w:w="1587"/>
+            <w:tcW w:type="dxa" w:w="1644"/>
             <w:vAlign w:val="center"/>
           </w:tcPr>
           <w:p>
@@ -3076,7 +3053,7 @@
         </w:tc>
         <w:tc>
           <w:tcPr>
-            <w:tcW w:type="dxa" w:w="1587"/>
+            <w:tcW w:type="dxa" w:w="1644"/>
             <w:vAlign w:val="center"/>
           </w:tcPr>
           <w:p>
@@ -3095,7 +3072,7 @@
         </w:tc>
         <w:tc>
           <w:tcPr>
-            <w:tcW w:type="dxa" w:w="1587"/>
+            <w:tcW w:type="dxa" w:w="1644"/>
             <w:tcBorders>
               <w:top w:val="none" w:sz="0" w:space="0" w:color="auto"/>
               <w:left w:val="none" w:sz="0" w:space="0" w:color="auto"/>
@@ -3109,7 +3086,7 @@
         </w:tc>
         <w:tc>
           <w:tcPr>
-            <w:tcW w:type="dxa" w:w="1587"/>
+            <w:tcW w:type="dxa" w:w="1644"/>
             <w:tcBorders>
               <w:top w:val="none" w:sz="0" w:space="0" w:color="auto"/>
               <w:left w:val="none" w:sz="0" w:space="0" w:color="auto"/>
@@ -3144,20 +3121,20 @@
         <w:tblLook w:firstColumn="1" w:firstRow="1" w:lastColumn="0" w:lastRow="0" w:noHBand="0" w:noVBand="1" w:val="04A0"/>
       </w:tblPr>
       <w:tblGrid>
-        <w:gridCol w:w="1701"/>
-        <w:gridCol w:w="1701"/>
-        <w:gridCol w:w="1701"/>
-        <w:gridCol w:w="1701"/>
-        <w:gridCol w:w="1701"/>
-        <w:gridCol w:w="1701"/>
+        <w:gridCol w:w="1758"/>
+        <w:gridCol w:w="1758"/>
+        <w:gridCol w:w="1758"/>
+        <w:gridCol w:w="1758"/>
+        <w:gridCol w:w="1758"/>
+        <w:gridCol w:w="1758"/>
       </w:tblGrid>
       <w:tr>
         <w:trPr>
-          <w:trHeight w:val="249" w:hRule="exact"/>
+          <w:trHeight w:val="238" w:hRule="exact"/>
         </w:trPr>
         <w:tc>
           <w:tcPr>
-            <w:tcW w:type="dxa" w:w="1701"/>
+            <w:tcW w:type="dxa" w:w="1757"/>
             <w:vAlign w:val="center"/>
             <w:shd w:val="clear" w:color="auto" w:fill="D9D9D9"/>
           </w:tcPr>
@@ -3178,7 +3155,7 @@
         </w:tc>
         <w:tc>
           <w:tcPr>
-            <w:tcW w:type="dxa" w:w="1701"/>
+            <w:tcW w:type="dxa" w:w="1757"/>
             <w:vAlign w:val="center"/>
             <w:shd w:val="clear" w:color="auto" w:fill="D9D9D9"/>
           </w:tcPr>
@@ -3199,7 +3176,7 @@
         </w:tc>
         <w:tc>
           <w:tcPr>
-            <w:tcW w:type="dxa" w:w="1701"/>
+            <w:tcW w:type="dxa" w:w="1757"/>
             <w:vAlign w:val="center"/>
             <w:shd w:val="clear" w:color="auto" w:fill="D9D9D9"/>
           </w:tcPr>
@@ -3220,7 +3197,7 @@
         </w:tc>
         <w:tc>
           <w:tcPr>
-            <w:tcW w:type="dxa" w:w="1701"/>
+            <w:tcW w:type="dxa" w:w="1757"/>
             <w:vAlign w:val="center"/>
             <w:shd w:val="clear" w:color="auto" w:fill="D9D9D9"/>
           </w:tcPr>
@@ -3241,7 +3218,7 @@
         </w:tc>
         <w:tc>
           <w:tcPr>
-            <w:tcW w:type="dxa" w:w="1701"/>
+            <w:tcW w:type="dxa" w:w="1757"/>
             <w:vAlign w:val="center"/>
             <w:shd w:val="clear" w:color="auto" w:fill="D9D9D9"/>
           </w:tcPr>
@@ -3262,7 +3239,7 @@
         </w:tc>
         <w:tc>
           <w:tcPr>
-            <w:tcW w:type="dxa" w:w="1701"/>
+            <w:tcW w:type="dxa" w:w="1757"/>
             <w:vAlign w:val="center"/>
             <w:shd w:val="clear" w:color="auto" w:fill="D9D9D9"/>
           </w:tcPr>
@@ -3284,11 +3261,11 @@
       </w:tr>
       <w:tr>
         <w:trPr>
-          <w:trHeight w:val="396" w:hRule="exact"/>
+          <w:trHeight w:val="385" w:hRule="exact"/>
         </w:trPr>
         <w:tc>
           <w:tcPr>
-            <w:tcW w:type="dxa" w:w="1701"/>
+            <w:tcW w:type="dxa" w:w="1757"/>
             <w:vAlign w:val="center"/>
           </w:tcPr>
           <w:p>
@@ -3307,7 +3284,7 @@
         </w:tc>
         <w:tc>
           <w:tcPr>
-            <w:tcW w:type="dxa" w:w="1701"/>
+            <w:tcW w:type="dxa" w:w="1757"/>
             <w:vAlign w:val="center"/>
           </w:tcPr>
           <w:p>
@@ -3326,7 +3303,7 @@
         </w:tc>
         <w:tc>
           <w:tcPr>
-            <w:tcW w:type="dxa" w:w="1701"/>
+            <w:tcW w:type="dxa" w:w="1757"/>
             <w:vAlign w:val="center"/>
           </w:tcPr>
           <w:p>
@@ -3345,7 +3322,7 @@
         </w:tc>
         <w:tc>
           <w:tcPr>
-            <w:tcW w:type="dxa" w:w="1701"/>
+            <w:tcW w:type="dxa" w:w="1757"/>
             <w:vAlign w:val="center"/>
           </w:tcPr>
           <w:p>
@@ -3364,7 +3341,7 @@
         </w:tc>
         <w:tc>
           <w:tcPr>
-            <w:tcW w:type="dxa" w:w="1701"/>
+            <w:tcW w:type="dxa" w:w="1757"/>
             <w:vAlign w:val="center"/>
           </w:tcPr>
           <w:p>
@@ -3383,7 +3360,7 @@
         </w:tc>
         <w:tc>
           <w:tcPr>
-            <w:tcW w:type="dxa" w:w="1701"/>
+            <w:tcW w:type="dxa" w:w="1757"/>
             <w:vAlign w:val="center"/>
           </w:tcPr>
           <w:p>
@@ -3431,8 +3408,8 @@
         <w:tblLook w:firstColumn="1" w:firstRow="1" w:lastColumn="0" w:lastRow="0" w:noHBand="0" w:noVBand="1" w:val="04A0"/>
       </w:tblPr>
       <w:tblGrid>
-        <w:gridCol w:w="5103"/>
-        <w:gridCol w:w="5103"/>
+        <w:gridCol w:w="5273"/>
+        <w:gridCol w:w="5273"/>
       </w:tblGrid>
       <w:tr>
         <w:trPr>
@@ -3461,13 +3438,13 @@
         </w:tc>
         <w:tc>
           <w:tcPr>
-            <w:tcW w:type="dxa" w:w="9808"/>
+            <w:tcW w:type="dxa" w:w="10148"/>
             <w:vAlign w:val="center"/>
           </w:tcPr>
           <w:p>
             <w:pPr>
               <w:spacing w:before="0" w:after="0"/>
-              <w:jc w:val="left"/>
+              <w:jc w:val="center"/>
             </w:pPr>
             <w:r>
               <w:rPr>
@@ -3506,13 +3483,13 @@
         </w:tc>
         <w:tc>
           <w:tcPr>
-            <w:tcW w:type="dxa" w:w="9808"/>
+            <w:tcW w:type="dxa" w:w="10148"/>
             <w:vAlign w:val="center"/>
           </w:tcPr>
           <w:p>
             <w:pPr>
               <w:spacing w:before="0" w:after="0"/>
-              <w:jc w:val="left"/>
+              <w:jc w:val="center"/>
             </w:pPr>
             <w:r>
               <w:rPr>
@@ -3551,13 +3528,13 @@
         </w:tc>
         <w:tc>
           <w:tcPr>
-            <w:tcW w:type="dxa" w:w="9808"/>
+            <w:tcW w:type="dxa" w:w="10148"/>
             <w:vAlign w:val="center"/>
           </w:tcPr>
           <w:p>
             <w:pPr>
               <w:spacing w:before="0" w:after="0"/>
-              <w:jc w:val="left"/>
+              <w:jc w:val="center"/>
             </w:pPr>
             <w:r>
               <w:rPr>
@@ -3596,13 +3573,13 @@
         </w:tc>
         <w:tc>
           <w:tcPr>
-            <w:tcW w:type="dxa" w:w="9808"/>
+            <w:tcW w:type="dxa" w:w="10148"/>
             <w:vAlign w:val="center"/>
           </w:tcPr>
           <w:p>
             <w:pPr>
               <w:spacing w:before="0" w:after="0"/>
-              <w:jc w:val="left"/>
+              <w:jc w:val="center"/>
             </w:pPr>
             <w:r>
               <w:rPr>
@@ -3641,13 +3618,13 @@
         </w:tc>
         <w:tc>
           <w:tcPr>
-            <w:tcW w:type="dxa" w:w="9808"/>
+            <w:tcW w:type="dxa" w:w="10148"/>
             <w:vAlign w:val="center"/>
           </w:tcPr>
           <w:p>
             <w:pPr>
               <w:spacing w:before="0" w:after="0"/>
-              <w:jc w:val="left"/>
+              <w:jc w:val="center"/>
             </w:pPr>
             <w:r>
               <w:rPr>
@@ -3686,13 +3663,13 @@
         </w:tc>
         <w:tc>
           <w:tcPr>
-            <w:tcW w:type="dxa" w:w="9808"/>
+            <w:tcW w:type="dxa" w:w="10148"/>
             <w:vAlign w:val="center"/>
           </w:tcPr>
           <w:p>
             <w:pPr>
               <w:spacing w:before="0" w:after="0"/>
-              <w:jc w:val="left"/>
+              <w:jc w:val="center"/>
             </w:pPr>
             <w:r>
               <w:rPr>
@@ -3739,10 +3716,10 @@
         <w:tblLook w:firstColumn="1" w:firstRow="1" w:lastColumn="0" w:lastRow="0" w:noHBand="0" w:noVBand="1" w:val="04A0"/>
       </w:tblPr>
       <w:tblGrid>
-        <w:gridCol w:w="2551"/>
-        <w:gridCol w:w="2551"/>
-        <w:gridCol w:w="2551"/>
-        <w:gridCol w:w="2551"/>
+        <w:gridCol w:w="2636"/>
+        <w:gridCol w:w="2636"/>
+        <w:gridCol w:w="2636"/>
+        <w:gridCol w:w="2636"/>
       </w:tblGrid>
       <w:tr>
         <w:trPr>
@@ -3771,13 +3748,13 @@
         </w:tc>
         <w:tc>
           <w:tcPr>
-            <w:tcW w:type="dxa" w:w="4706"/>
+            <w:tcW w:type="dxa" w:w="4876"/>
             <w:vAlign w:val="center"/>
           </w:tcPr>
           <w:p>
             <w:pPr>
               <w:spacing w:before="0" w:after="0"/>
-              <w:jc w:val="left"/>
+              <w:jc w:val="center"/>
             </w:pPr>
             <w:r>
               <w:rPr>
@@ -3811,13 +3788,13 @@
         </w:tc>
         <w:tc>
           <w:tcPr>
-            <w:tcW w:type="dxa" w:w="4706"/>
+            <w:tcW w:type="dxa" w:w="4876"/>
             <w:vAlign w:val="center"/>
           </w:tcPr>
           <w:p>
             <w:pPr>
               <w:spacing w:before="0" w:after="0"/>
-              <w:jc w:val="left"/>
+              <w:jc w:val="center"/>
             </w:pPr>
             <w:r>
               <w:rPr>
@@ -3856,13 +3833,13 @@
         </w:tc>
         <w:tc>
           <w:tcPr>
-            <w:tcW w:type="dxa" w:w="4706"/>
+            <w:tcW w:type="dxa" w:w="4876"/>
             <w:vAlign w:val="center"/>
           </w:tcPr>
           <w:p>
             <w:pPr>
               <w:spacing w:before="0" w:after="0"/>
-              <w:jc w:val="left"/>
+              <w:jc w:val="center"/>
             </w:pPr>
             <w:r>
               <w:rPr>
@@ -3896,13 +3873,13 @@
         </w:tc>
         <w:tc>
           <w:tcPr>
-            <w:tcW w:type="dxa" w:w="4706"/>
+            <w:tcW w:type="dxa" w:w="4876"/>
             <w:vAlign w:val="center"/>
           </w:tcPr>
           <w:p>
             <w:pPr>
               <w:spacing w:before="0" w:after="0"/>
-              <w:jc w:val="left"/>
+              <w:jc w:val="center"/>
             </w:pPr>
             <w:r>
               <w:rPr>
@@ -3941,13 +3918,13 @@
         </w:tc>
         <w:tc>
           <w:tcPr>
-            <w:tcW w:type="dxa" w:w="4706"/>
+            <w:tcW w:type="dxa" w:w="4876"/>
             <w:vAlign w:val="center"/>
           </w:tcPr>
           <w:p>
             <w:pPr>
               <w:spacing w:before="0" w:after="0"/>
-              <w:jc w:val="left"/>
+              <w:jc w:val="center"/>
             </w:pPr>
             <w:r>
               <w:rPr>
@@ -3981,13 +3958,13 @@
         </w:tc>
         <w:tc>
           <w:tcPr>
-            <w:tcW w:type="dxa" w:w="4706"/>
+            <w:tcW w:type="dxa" w:w="4876"/>
             <w:vAlign w:val="center"/>
           </w:tcPr>
           <w:p>
             <w:pPr>
               <w:spacing w:before="0" w:after="0"/>
-              <w:jc w:val="left"/>
+              <w:jc w:val="center"/>
             </w:pPr>
             <w:r>
               <w:rPr>
@@ -4026,13 +4003,13 @@
         </w:tc>
         <w:tc>
           <w:tcPr>
-            <w:tcW w:type="dxa" w:w="4706"/>
+            <w:tcW w:type="dxa" w:w="4876"/>
             <w:vAlign w:val="center"/>
           </w:tcPr>
           <w:p>
             <w:pPr>
               <w:spacing w:before="0" w:after="0"/>
-              <w:jc w:val="left"/>
+              <w:jc w:val="center"/>
             </w:pPr>
             <w:r>
               <w:rPr>
@@ -4066,13 +4043,13 @@
         </w:tc>
         <w:tc>
           <w:tcPr>
-            <w:tcW w:type="dxa" w:w="4706"/>
+            <w:tcW w:type="dxa" w:w="4876"/>
             <w:vAlign w:val="center"/>
           </w:tcPr>
           <w:p>
             <w:pPr>
               <w:spacing w:before="0" w:after="0"/>
-              <w:jc w:val="left"/>
+              <w:jc w:val="center"/>
             </w:pPr>
             <w:r>
               <w:rPr>
@@ -4111,13 +4088,13 @@
         </w:tc>
         <w:tc>
           <w:tcPr>
-            <w:tcW w:type="dxa" w:w="4706"/>
+            <w:tcW w:type="dxa" w:w="4876"/>
             <w:vAlign w:val="center"/>
           </w:tcPr>
           <w:p>
             <w:pPr>
               <w:spacing w:before="0" w:after="0"/>
-              <w:jc w:val="left"/>
+              <w:jc w:val="center"/>
             </w:pPr>
             <w:r>
               <w:rPr>
@@ -4151,13 +4128,13 @@
         </w:tc>
         <w:tc>
           <w:tcPr>
-            <w:tcW w:type="dxa" w:w="4706"/>
+            <w:tcW w:type="dxa" w:w="4876"/>
             <w:vAlign w:val="center"/>
           </w:tcPr>
           <w:p>
             <w:pPr>
               <w:spacing w:before="0" w:after="0"/>
-              <w:jc w:val="left"/>
+              <w:jc w:val="center"/>
             </w:pPr>
             <w:r>
               <w:rPr>
@@ -4204,20 +4181,20 @@
         <w:tblLook w:firstColumn="1" w:firstRow="1" w:lastColumn="0" w:lastRow="0" w:noHBand="0" w:noVBand="1" w:val="04A0"/>
       </w:tblPr>
       <w:tblGrid>
-        <w:gridCol w:w="1021"/>
-        <w:gridCol w:w="1021"/>
-        <w:gridCol w:w="1021"/>
-        <w:gridCol w:w="1021"/>
-        <w:gridCol w:w="1021"/>
-        <w:gridCol w:w="1021"/>
-        <w:gridCol w:w="1021"/>
-        <w:gridCol w:w="1021"/>
-        <w:gridCol w:w="1021"/>
-        <w:gridCol w:w="1021"/>
+        <w:gridCol w:w="1055"/>
+        <w:gridCol w:w="1055"/>
+        <w:gridCol w:w="1055"/>
+        <w:gridCol w:w="1055"/>
+        <w:gridCol w:w="1055"/>
+        <w:gridCol w:w="1055"/>
+        <w:gridCol w:w="1055"/>
+        <w:gridCol w:w="1055"/>
+        <w:gridCol w:w="1055"/>
+        <w:gridCol w:w="1055"/>
       </w:tblGrid>
       <w:tr>
         <w:trPr>
-          <w:trHeight w:val="249" w:hRule="exact"/>
+          <w:trHeight w:val="238" w:hRule="exact"/>
         </w:trPr>
         <w:tc>
           <w:tcPr>
@@ -4383,7 +4360,7 @@
         </w:tc>
         <w:tc>
           <w:tcPr>
-            <w:tcW w:type="dxa" w:w="2211"/>
+            <w:tcW w:type="dxa" w:w="2551"/>
             <w:tcBorders>
               <w:top w:val="none" w:sz="0" w:space="0" w:color="auto"/>
               <w:left w:val="none" w:sz="0" w:space="0" w:color="auto"/>
@@ -4398,7 +4375,7 @@
       </w:tr>
       <w:tr>
         <w:trPr>
-          <w:trHeight w:val="385" w:hRule="exact"/>
+          <w:trHeight w:val="374" w:hRule="exact"/>
         </w:trPr>
         <w:tc>
           <w:tcPr>
@@ -4561,7 +4538,7 @@
         </w:tc>
         <w:tc>
           <w:tcPr>
-            <w:tcW w:type="dxa" w:w="2211"/>
+            <w:tcW w:type="dxa" w:w="2551"/>
             <w:tcBorders>
               <w:top w:val="none" w:sz="0" w:space="0" w:color="auto"/>
               <w:left w:val="none" w:sz="0" w:space="0" w:color="auto"/>
@@ -4596,20 +4573,20 @@
         <w:tblLook w:firstColumn="1" w:firstRow="1" w:lastColumn="0" w:lastRow="0" w:noHBand="0" w:noVBand="1" w:val="04A0"/>
       </w:tblPr>
       <w:tblGrid>
-        <w:gridCol w:w="1021"/>
-        <w:gridCol w:w="1021"/>
-        <w:gridCol w:w="1021"/>
-        <w:gridCol w:w="1021"/>
-        <w:gridCol w:w="1021"/>
-        <w:gridCol w:w="1021"/>
-        <w:gridCol w:w="1021"/>
-        <w:gridCol w:w="1021"/>
-        <w:gridCol w:w="1021"/>
-        <w:gridCol w:w="1021"/>
+        <w:gridCol w:w="1055"/>
+        <w:gridCol w:w="1055"/>
+        <w:gridCol w:w="1055"/>
+        <w:gridCol w:w="1055"/>
+        <w:gridCol w:w="1055"/>
+        <w:gridCol w:w="1055"/>
+        <w:gridCol w:w="1055"/>
+        <w:gridCol w:w="1055"/>
+        <w:gridCol w:w="1055"/>
+        <w:gridCol w:w="1055"/>
       </w:tblGrid>
       <w:tr>
         <w:trPr>
-          <w:trHeight w:val="249" w:hRule="exact"/>
+          <w:trHeight w:val="238" w:hRule="exact"/>
         </w:trPr>
         <w:tc>
           <w:tcPr>
@@ -4634,7 +4611,7 @@
         </w:tc>
         <w:tc>
           <w:tcPr>
-            <w:tcW w:type="dxa" w:w="907"/>
+            <w:tcW w:type="dxa" w:w="975"/>
             <w:vAlign w:val="center"/>
           </w:tcPr>
           <w:p>
@@ -4674,7 +4651,7 @@
         </w:tc>
         <w:tc>
           <w:tcPr>
-            <w:tcW w:type="dxa" w:w="907"/>
+            <w:tcW w:type="dxa" w:w="975"/>
             <w:vAlign w:val="center"/>
           </w:tcPr>
           <w:p>
@@ -4714,7 +4691,7 @@
         </w:tc>
         <w:tc>
           <w:tcPr>
-            <w:tcW w:type="dxa" w:w="907"/>
+            <w:tcW w:type="dxa" w:w="975"/>
             <w:vAlign w:val="center"/>
           </w:tcPr>
           <w:p>
@@ -4754,7 +4731,7 @@
         </w:tc>
         <w:tc>
           <w:tcPr>
-            <w:tcW w:type="dxa" w:w="907"/>
+            <w:tcW w:type="dxa" w:w="975"/>
             <w:vAlign w:val="center"/>
           </w:tcPr>
           <w:p>
@@ -4794,7 +4771,7 @@
         </w:tc>
         <w:tc>
           <w:tcPr>
-            <w:tcW w:type="dxa" w:w="907"/>
+            <w:tcW w:type="dxa" w:w="975"/>
             <w:vAlign w:val="center"/>
           </w:tcPr>
           <w:p>
@@ -4814,7 +4791,7 @@
       </w:tr>
       <w:tr>
         <w:trPr>
-          <w:trHeight w:val="385" w:hRule="exact"/>
+          <w:trHeight w:val="374" w:hRule="exact"/>
         </w:trPr>
         <w:tc>
           <w:tcPr>
@@ -4837,7 +4814,7 @@
         </w:tc>
         <w:tc>
           <w:tcPr>
-            <w:tcW w:type="dxa" w:w="907"/>
+            <w:tcW w:type="dxa" w:w="975"/>
             <w:vAlign w:val="center"/>
           </w:tcPr>
           <w:p>
@@ -4875,7 +4852,7 @@
         </w:tc>
         <w:tc>
           <w:tcPr>
-            <w:tcW w:type="dxa" w:w="907"/>
+            <w:tcW w:type="dxa" w:w="975"/>
             <w:vAlign w:val="center"/>
           </w:tcPr>
           <w:p>
@@ -4913,7 +4890,7 @@
         </w:tc>
         <w:tc>
           <w:tcPr>
-            <w:tcW w:type="dxa" w:w="907"/>
+            <w:tcW w:type="dxa" w:w="975"/>
             <w:vAlign w:val="center"/>
           </w:tcPr>
           <w:p>
@@ -4951,7 +4928,7 @@
         </w:tc>
         <w:tc>
           <w:tcPr>
-            <w:tcW w:type="dxa" w:w="907"/>
+            <w:tcW w:type="dxa" w:w="975"/>
             <w:vAlign w:val="center"/>
           </w:tcPr>
           <w:p>
@@ -4989,7 +4966,7 @@
         </w:tc>
         <w:tc>
           <w:tcPr>
-            <w:tcW w:type="dxa" w:w="907"/>
+            <w:tcW w:type="dxa" w:w="975"/>
             <w:vAlign w:val="center"/>
           </w:tcPr>
           <w:p>
@@ -5029,15 +5006,15 @@
         <w:tblLook w:firstColumn="1" w:firstRow="1" w:lastColumn="0" w:lastRow="0" w:noHBand="0" w:noVBand="1" w:val="04A0"/>
       </w:tblPr>
       <w:tblGrid>
-        <w:gridCol w:w="10206"/>
+        <w:gridCol w:w="10546"/>
       </w:tblGrid>
       <w:tr>
         <w:trPr>
-          <w:trHeight w:val="464" w:hRule="exact"/>
+          <w:trHeight w:val="453" w:hRule="exact"/>
         </w:trPr>
         <w:tc>
           <w:tcPr>
-            <w:tcW w:type="dxa" w:w="10205"/>
+            <w:tcW w:type="dxa" w:w="10545"/>
             <w:vAlign w:val="center"/>
           </w:tcPr>
           <w:p>
@@ -5057,11 +5034,11 @@
       </w:tr>
       <w:tr>
         <w:trPr>
-          <w:trHeight w:val="464" w:hRule="exact"/>
+          <w:trHeight w:val="453" w:hRule="exact"/>
         </w:trPr>
         <w:tc>
           <w:tcPr>
-            <w:tcW w:type="dxa" w:w="10205"/>
+            <w:tcW w:type="dxa" w:w="10545"/>
             <w:vAlign w:val="center"/>
           </w:tcPr>
           <w:p>
@@ -5101,15 +5078,15 @@
         <w:tblLook w:firstColumn="1" w:firstRow="1" w:lastColumn="0" w:lastRow="0" w:noHBand="0" w:noVBand="1" w:val="04A0"/>
       </w:tblPr>
       <w:tblGrid>
-        <w:gridCol w:w="10206"/>
+        <w:gridCol w:w="10546"/>
       </w:tblGrid>
       <w:tr>
         <w:trPr>
-          <w:trHeight w:val="464" w:hRule="exact"/>
+          <w:trHeight w:val="453" w:hRule="exact"/>
         </w:trPr>
         <w:tc>
           <w:tcPr>
-            <w:tcW w:type="dxa" w:w="10205"/>
+            <w:tcW w:type="dxa" w:w="10545"/>
             <w:vAlign w:val="center"/>
           </w:tcPr>
           <w:p>
@@ -5129,11 +5106,11 @@
       </w:tr>
       <w:tr>
         <w:trPr>
-          <w:trHeight w:val="464" w:hRule="exact"/>
+          <w:trHeight w:val="453" w:hRule="exact"/>
         </w:trPr>
         <w:tc>
           <w:tcPr>
-            <w:tcW w:type="dxa" w:w="10205"/>
+            <w:tcW w:type="dxa" w:w="10545"/>
             <w:vAlign w:val="center"/>
           </w:tcPr>
           <w:p>
@@ -5173,15 +5150,15 @@
         <w:tblLook w:firstColumn="1" w:firstRow="1" w:lastColumn="0" w:lastRow="0" w:noHBand="0" w:noVBand="1" w:val="04A0"/>
       </w:tblPr>
       <w:tblGrid>
-        <w:gridCol w:w="10206"/>
+        <w:gridCol w:w="10546"/>
       </w:tblGrid>
       <w:tr>
         <w:trPr>
-          <w:trHeight w:val="470" w:hRule="exact"/>
+          <w:trHeight w:val="464" w:hRule="exact"/>
         </w:trPr>
         <w:tc>
           <w:tcPr>
-            <w:tcW w:type="dxa" w:w="10205"/>
+            <w:tcW w:type="dxa" w:w="10545"/>
             <w:vAlign w:val="center"/>
           </w:tcPr>
           <w:p>
@@ -5201,11 +5178,11 @@
       </w:tr>
       <w:tr>
         <w:trPr>
-          <w:trHeight w:val="470" w:hRule="exact"/>
+          <w:trHeight w:val="464" w:hRule="exact"/>
         </w:trPr>
         <w:tc>
           <w:tcPr>
-            <w:tcW w:type="dxa" w:w="10205"/>
+            <w:tcW w:type="dxa" w:w="10545"/>
             <w:vAlign w:val="center"/>
           </w:tcPr>
           <w:p>
@@ -5225,11 +5202,11 @@
       </w:tr>
       <w:tr>
         <w:trPr>
-          <w:trHeight w:val="470" w:hRule="exact"/>
+          <w:trHeight w:val="464" w:hRule="exact"/>
         </w:trPr>
         <w:tc>
           <w:tcPr>
-            <w:tcW w:type="dxa" w:w="10205"/>
+            <w:tcW w:type="dxa" w:w="10545"/>
             <w:vAlign w:val="center"/>
           </w:tcPr>
           <w:p>
@@ -5249,11 +5226,11 @@
       </w:tr>
       <w:tr>
         <w:trPr>
-          <w:trHeight w:val="470" w:hRule="exact"/>
+          <w:trHeight w:val="464" w:hRule="exact"/>
         </w:trPr>
         <w:tc>
           <w:tcPr>
-            <w:tcW w:type="dxa" w:w="10205"/>
+            <w:tcW w:type="dxa" w:w="10545"/>
             <w:vAlign w:val="center"/>
           </w:tcPr>
           <w:p>
@@ -5273,11 +5250,11 @@
       </w:tr>
       <w:tr>
         <w:trPr>
-          <w:trHeight w:val="470" w:hRule="exact"/>
+          <w:trHeight w:val="464" w:hRule="exact"/>
         </w:trPr>
         <w:tc>
           <w:tcPr>
-            <w:tcW w:type="dxa" w:w="10205"/>
+            <w:tcW w:type="dxa" w:w="10545"/>
             <w:vAlign w:val="center"/>
           </w:tcPr>
           <w:p>
@@ -5297,11 +5274,11 @@
       </w:tr>
       <w:tr>
         <w:trPr>
-          <w:trHeight w:val="470" w:hRule="exact"/>
+          <w:trHeight w:val="464" w:hRule="exact"/>
         </w:trPr>
         <w:tc>
           <w:tcPr>
-            <w:tcW w:type="dxa" w:w="10205"/>
+            <w:tcW w:type="dxa" w:w="10545"/>
             <w:vAlign w:val="center"/>
           </w:tcPr>
           <w:p>
@@ -5341,13 +5318,13 @@
         <w:tblLook w:firstColumn="1" w:firstRow="1" w:lastColumn="0" w:lastRow="0" w:noHBand="0" w:noVBand="1" w:val="04A0"/>
       </w:tblPr>
       <w:tblGrid>
-        <w:gridCol w:w="3402"/>
-        <w:gridCol w:w="3402"/>
-        <w:gridCol w:w="3402"/>
+        <w:gridCol w:w="3515"/>
+        <w:gridCol w:w="3515"/>
+        <w:gridCol w:w="3515"/>
       </w:tblGrid>
       <w:tr>
         <w:trPr>
-          <w:trHeight w:val="249" w:hRule="exact"/>
+          <w:trHeight w:val="238" w:hRule="exact"/>
         </w:trPr>
         <w:tc>
           <w:tcPr>
@@ -5372,7 +5349,7 @@
         </w:tc>
         <w:tc>
           <w:tcPr>
-            <w:tcW w:type="dxa" w:w="3685"/>
+            <w:tcW w:type="dxa" w:w="4025"/>
             <w:vAlign w:val="center"/>
             <w:shd w:val="clear" w:color="auto" w:fill="D9D9D9"/>
           </w:tcPr>
@@ -5415,7 +5392,7 @@
       </w:tr>
       <w:tr>
         <w:trPr>
-          <w:trHeight w:val="442" w:hRule="exact"/>
+          <w:trHeight w:val="430" w:hRule="exact"/>
         </w:trPr>
         <w:tc>
           <w:tcPr>
@@ -5438,7 +5415,7 @@
         </w:tc>
         <w:tc>
           <w:tcPr>
-            <w:tcW w:type="dxa" w:w="3685"/>
+            <w:tcW w:type="dxa" w:w="4025"/>
             <w:vAlign w:val="center"/>
           </w:tcPr>
           <w:p>
@@ -5478,7 +5455,7 @@
     </w:tbl>
     <w:sectPr>
       <w:pgSz w:w="11906" w:h="16838"/>
-      <w:pgMar w:top="850" w:right="850" w:bottom="850" w:left="850" w:header="720" w:footer="720" w:gutter="0"/>
+      <w:pgMar w:top="680" w:right="680" w:bottom="680" w:left="680" w:header="720" w:footer="720" w:gutter="0"/>
       <w:cols w:space="720"/>
       <w:docGrid w:linePitch="360"/>
     </w:sectPr>

</xml_diff>

<commit_message>
Fix layout: reduce page1 blank space, fix page2 overflow, enlarge score table
- Page 1: increase §1/§2/§3 spacing and §3A/§3B row heights to fill space
- Page 2: reduce §4/§5 row heights and tighten section spacing to fit within A4
- Score table: enlarge answer row from 0.75cm to 1.2cm for easier writing
- Remove redundant §1 A/B label paragraph

https://claude.ai/code/session_01H92aASVAdh5CWUTRq4hYds
</commit_message>
<xml_diff>
--- a/2026年度_論理表現Ⅱ_中間テスト_解答用紙.docx
+++ b/2026年度_論理表現Ⅱ_中間テスト_解答用紙.docx
@@ -121,7 +121,7 @@
     </w:tbl>
     <w:p>
       <w:pPr>
-        <w:spacing w:before="120" w:after="40"/>
+        <w:spacing w:before="160" w:after="40"/>
         <w:jc w:val="left"/>
       </w:pPr>
       <w:r>
@@ -131,20 +131,6 @@
           <w:sz w:val="21"/>
         </w:rPr>
         <w:t>１　（思考・判断・表現　14点）</w:t>
-      </w:r>
-    </w:p>
-    <w:p>
-      <w:pPr>
-        <w:spacing w:before="40" w:after="20"/>
-        <w:jc w:val="left"/>
-      </w:pPr>
-      <w:r>
-        <w:rPr>
-          <w:rFonts w:ascii="Arial" w:hAnsi="Arial" w:eastAsia="MS PGothic"/>
-          <w:b w:val="0"/>
-          <w:sz w:val="19"/>
-        </w:rPr>
-        <w:t>A（2点）・B（2点）</w:t>
       </w:r>
     </w:p>
     <w:tbl>
@@ -380,7 +366,7 @@
     </w:tbl>
     <w:p>
       <w:pPr>
-        <w:spacing w:before="100" w:after="40"/>
+        <w:spacing w:before="140" w:after="40"/>
         <w:jc w:val="left"/>
       </w:pPr>
       <w:r>
@@ -767,7 +753,7 @@
     </w:tbl>
     <w:p>
       <w:pPr>
-        <w:spacing w:before="100" w:after="40"/>
+        <w:spacing w:before="140" w:after="40"/>
         <w:jc w:val="left"/>
       </w:pPr>
       <w:r>
@@ -806,7 +792,7 @@
       </w:tblGrid>
       <w:tr>
         <w:trPr>
-          <w:trHeight w:val="567" w:hRule="exact"/>
+          <w:trHeight w:val="850" w:hRule="exact"/>
         </w:trPr>
         <w:tc>
           <w:tcPr>
@@ -851,7 +837,7 @@
       </w:tr>
       <w:tr>
         <w:trPr>
-          <w:trHeight w:val="567" w:hRule="exact"/>
+          <w:trHeight w:val="850" w:hRule="exact"/>
         </w:trPr>
         <w:tc>
           <w:tcPr>
@@ -896,7 +882,7 @@
       </w:tr>
       <w:tr>
         <w:trPr>
-          <w:trHeight w:val="567" w:hRule="exact"/>
+          <w:trHeight w:val="850" w:hRule="exact"/>
         </w:trPr>
         <w:tc>
           <w:tcPr>
@@ -941,7 +927,7 @@
       </w:tr>
       <w:tr>
         <w:trPr>
-          <w:trHeight w:val="567" w:hRule="exact"/>
+          <w:trHeight w:val="850" w:hRule="exact"/>
         </w:trPr>
         <w:tc>
           <w:tcPr>
@@ -986,7 +972,7 @@
       </w:tr>
       <w:tr>
         <w:trPr>
-          <w:trHeight w:val="567" w:hRule="exact"/>
+          <w:trHeight w:val="850" w:hRule="exact"/>
         </w:trPr>
         <w:tc>
           <w:tcPr>
@@ -1063,7 +1049,7 @@
       </w:tblGrid>
       <w:tr>
         <w:trPr>
-          <w:trHeight w:val="408" w:hRule="exact"/>
+          <w:trHeight w:val="567" w:hRule="exact"/>
         </w:trPr>
         <w:tc>
           <w:tcPr>
@@ -1202,7 +1188,7 @@
       </w:tr>
       <w:tr>
         <w:trPr>
-          <w:trHeight w:val="408" w:hRule="exact"/>
+          <w:trHeight w:val="567" w:hRule="exact"/>
         </w:trPr>
         <w:tc>
           <w:tcPr>
@@ -1351,7 +1337,7 @@
       </w:tr>
       <w:tr>
         <w:trPr>
-          <w:trHeight w:val="408" w:hRule="exact"/>
+          <w:trHeight w:val="567" w:hRule="exact"/>
         </w:trPr>
         <w:tc>
           <w:tcPr>
@@ -1500,7 +1486,7 @@
       </w:tr>
       <w:tr>
         <w:trPr>
-          <w:trHeight w:val="408" w:hRule="exact"/>
+          <w:trHeight w:val="567" w:hRule="exact"/>
         </w:trPr>
         <w:tc>
           <w:tcPr>
@@ -1654,7 +1640,7 @@
       </w:tr>
       <w:tr>
         <w:trPr>
-          <w:trHeight w:val="408" w:hRule="exact"/>
+          <w:trHeight w:val="567" w:hRule="exact"/>
         </w:trPr>
         <w:tc>
           <w:tcPr>
@@ -1808,7 +1794,7 @@
       </w:tr>
       <w:tr>
         <w:trPr>
-          <w:trHeight w:val="408" w:hRule="exact"/>
+          <w:trHeight w:val="567" w:hRule="exact"/>
         </w:trPr>
         <w:tc>
           <w:tcPr>
@@ -2145,7 +2131,7 @@
       </w:tblGrid>
       <w:tr>
         <w:trPr>
-          <w:trHeight w:val="567" w:hRule="exact"/>
+          <w:trHeight w:val="510" w:hRule="exact"/>
         </w:trPr>
         <w:tc>
           <w:tcPr>
@@ -2170,7 +2156,7 @@
       </w:tr>
       <w:tr>
         <w:trPr>
-          <w:trHeight w:val="567" w:hRule="exact"/>
+          <w:trHeight w:val="510" w:hRule="exact"/>
         </w:trPr>
         <w:tc>
           <w:tcPr>
@@ -2195,7 +2181,7 @@
       </w:tr>
       <w:tr>
         <w:trPr>
-          <w:trHeight w:val="567" w:hRule="exact"/>
+          <w:trHeight w:val="510" w:hRule="exact"/>
         </w:trPr>
         <w:tc>
           <w:tcPr>
@@ -2220,7 +2206,7 @@
       </w:tr>
       <w:tr>
         <w:trPr>
-          <w:trHeight w:val="567" w:hRule="exact"/>
+          <w:trHeight w:val="510" w:hRule="exact"/>
         </w:trPr>
         <w:tc>
           <w:tcPr>
@@ -2245,7 +2231,7 @@
       </w:tr>
       <w:tr>
         <w:trPr>
-          <w:trHeight w:val="567" w:hRule="exact"/>
+          <w:trHeight w:val="510" w:hRule="exact"/>
         </w:trPr>
         <w:tc>
           <w:tcPr>
@@ -2270,7 +2256,7 @@
       </w:tr>
       <w:tr>
         <w:trPr>
-          <w:trHeight w:val="567" w:hRule="exact"/>
+          <w:trHeight w:val="510" w:hRule="exact"/>
         </w:trPr>
         <w:tc>
           <w:tcPr>
@@ -2296,7 +2282,7 @@
     </w:tbl>
     <w:p>
       <w:pPr>
-        <w:spacing w:before="100" w:after="40"/>
+        <w:spacing w:before="80" w:after="40"/>
         <w:jc w:val="left"/>
       </w:pPr>
       <w:r>
@@ -2335,7 +2321,7 @@
       </w:tblGrid>
       <w:tr>
         <w:trPr>
-          <w:trHeight w:val="510" w:hRule="exact"/>
+          <w:trHeight w:val="476" w:hRule="exact"/>
         </w:trPr>
         <w:tc>
           <w:tcPr>
@@ -2380,7 +2366,7 @@
       </w:tr>
       <w:tr>
         <w:trPr>
-          <w:trHeight w:val="510" w:hRule="exact"/>
+          <w:trHeight w:val="476" w:hRule="exact"/>
         </w:trPr>
         <w:tc>
           <w:tcPr>
@@ -2425,7 +2411,7 @@
       </w:tr>
       <w:tr>
         <w:trPr>
-          <w:trHeight w:val="510" w:hRule="exact"/>
+          <w:trHeight w:val="476" w:hRule="exact"/>
         </w:trPr>
         <w:tc>
           <w:tcPr>
@@ -2470,7 +2456,7 @@
       </w:tr>
       <w:tr>
         <w:trPr>
-          <w:trHeight w:val="510" w:hRule="exact"/>
+          <w:trHeight w:val="476" w:hRule="exact"/>
         </w:trPr>
         <w:tc>
           <w:tcPr>
@@ -2515,7 +2501,7 @@
       </w:tr>
       <w:tr>
         <w:trPr>
-          <w:trHeight w:val="510" w:hRule="exact"/>
+          <w:trHeight w:val="476" w:hRule="exact"/>
         </w:trPr>
         <w:tc>
           <w:tcPr>
@@ -2561,7 +2547,7 @@
     </w:tbl>
     <w:p>
       <w:pPr>
-        <w:spacing w:before="100" w:after="40"/>
+        <w:spacing w:before="80" w:after="40"/>
         <w:jc w:val="left"/>
       </w:pPr>
       <w:r>
@@ -3142,7 +3128,7 @@
       </w:tblGrid>
       <w:tr>
         <w:trPr>
-          <w:trHeight w:val="311" w:hRule="exact"/>
+          <w:trHeight w:val="340" w:hRule="exact"/>
         </w:trPr>
         <w:tc>
           <w:tcPr>
@@ -3207,7 +3193,7 @@
       </w:tr>
       <w:tr>
         <w:trPr>
-          <w:trHeight w:val="425" w:hRule="exact"/>
+          <w:trHeight w:val="680" w:hRule="exact"/>
         </w:trPr>
         <w:tc>
           <w:tcPr>

</xml_diff>

<commit_message>
Fix §3A/§3B layout and page overflow
- §3A: change to 1×10 vertical layout; pre/post-sentence text pre-printed
  in each row (right-tab for post-text); students fill only the rearranged portion
- §3B: replace multi-column word boxes with single cell containing ()×n groups
  matching each question's blank count [1,2,2,3,3,3,1,2,2,2,2,1]
- Adjust row heights (§3A 0.85cm, §3B 0.93cm) and spacing to fit A4×2 pages
- Enlarge score table answer row to 1.2cm

https://claude.ai/code/session_01H92aASVAdh5CWUTRq4hYds
</commit_message>
<xml_diff>
--- a/2026年度_論理表現Ⅱ_中間テスト_解答用紙.docx
+++ b/2026年度_論理表現Ⅱ_中間テスト_解答用紙.docx
@@ -121,7 +121,7 @@
     </w:tbl>
     <w:p>
       <w:pPr>
-        <w:spacing w:before="160" w:after="40"/>
+        <w:spacing w:before="120" w:after="40"/>
         <w:jc w:val="left"/>
       </w:pPr>
       <w:r>
@@ -173,21 +173,8 @@
         <w:tc>
           <w:tcPr>
             <w:tcW w:type="dxa" w:w="1134"/>
-            <w:vAlign w:val="center"/>
           </w:tcPr>
-          <w:p>
-            <w:pPr>
-              <w:spacing w:before="0" w:after="0"/>
-              <w:jc w:val="left"/>
-            </w:pPr>
-            <w:r>
-              <w:rPr>
-                <w:rFonts w:ascii="Arial" w:hAnsi="Arial" w:eastAsia="MS PGothic"/>
-                <w:b w:val="0"/>
-                <w:sz w:val="21"/>
-              </w:rPr>
-            </w:r>
-          </w:p>
+          <w:p/>
         </w:tc>
         <w:tc>
           <w:tcPr>
@@ -212,21 +199,8 @@
         <w:tc>
           <w:tcPr>
             <w:tcW w:type="dxa" w:w="1134"/>
-            <w:vAlign w:val="center"/>
           </w:tcPr>
-          <w:p>
-            <w:pPr>
-              <w:spacing w:before="0" w:after="0"/>
-              <w:jc w:val="left"/>
-            </w:pPr>
-            <w:r>
-              <w:rPr>
-                <w:rFonts w:ascii="Arial" w:hAnsi="Arial" w:eastAsia="MS PGothic"/>
-                <w:b w:val="0"/>
-                <w:sz w:val="21"/>
-              </w:rPr>
-            </w:r>
-          </w:p>
+          <w:p/>
         </w:tc>
       </w:tr>
     </w:tbl>
@@ -366,7 +340,7 @@
     </w:tbl>
     <w:p>
       <w:pPr>
-        <w:spacing w:before="140" w:after="40"/>
+        <w:spacing w:before="100" w:after="40"/>
         <w:jc w:val="left"/>
       </w:pPr>
       <w:r>
@@ -753,7 +727,7 @@
     </w:tbl>
     <w:p>
       <w:pPr>
-        <w:spacing w:before="140" w:after="40"/>
+        <w:spacing w:before="100" w:after="40"/>
         <w:jc w:val="left"/>
       </w:pPr>
       <w:r>
@@ -776,7 +750,7 @@
           <w:b w:val="0"/>
           <w:sz w:val="19"/>
         </w:rPr>
-        <w:t>A（1×10=10点）　完全正答のみ得点</w:t>
+        <w:t>A（1×10=10点）　語句を並び替えて英文を完成させよ　完全正答のみ得点</w:t>
       </w:r>
     </w:p>
     <w:tbl>
@@ -792,17 +766,17 @@
       </w:tblGrid>
       <w:tr>
         <w:trPr>
-          <w:trHeight w:val="850" w:hRule="exact"/>
+          <w:trHeight w:val="481" w:hRule="exact"/>
         </w:trPr>
         <w:tc>
           <w:tcPr>
-            <w:tcW w:type="dxa" w:w="5216"/>
+            <w:tcW w:type="dxa" w:w="680"/>
             <w:vAlign w:val="center"/>
           </w:tcPr>
           <w:p>
             <w:pPr>
               <w:spacing w:before="0" w:after="0"/>
-              <w:jc w:val="left"/>
+              <w:jc w:val="center"/>
             </w:pPr>
             <w:r>
               <w:rPr>
@@ -816,13 +790,55 @@
         </w:tc>
         <w:tc>
           <w:tcPr>
-            <w:tcW w:type="dxa" w:w="5216"/>
+            <w:tcW w:type="dxa" w:w="9865"/>
             <w:vAlign w:val="center"/>
           </w:tcPr>
           <w:p>
             <w:pPr>
               <w:spacing w:before="0" w:after="0"/>
-              <w:jc w:val="left"/>
+              <w:tabs>
+                <w:tab w:val="right" w:pos="9780"/>
+              </w:tabs>
+            </w:pPr>
+            <w:r>
+              <w:rPr>
+                <w:rFonts w:ascii="Arial" w:hAnsi="Arial" w:eastAsia="MS PGothic"/>
+                <w:b w:val="0"/>
+                <w:sz w:val="21"/>
+              </w:rPr>
+            </w:r>
+            <w:r>
+              <w:rPr>
+                <w:rFonts w:ascii="Arial" w:hAnsi="Arial" w:eastAsia="MS PGothic"/>
+                <w:b w:val="0"/>
+                <w:sz w:val="21"/>
+              </w:rPr>
+              <w:tab/>
+            </w:r>
+            <w:r>
+              <w:rPr>
+                <w:rFonts w:ascii="Arial" w:hAnsi="Arial" w:eastAsia="MS PGothic"/>
+                <w:b w:val="0"/>
+                <w:sz w:val="21"/>
+              </w:rPr>
+              <w:t>annually.</w:t>
+            </w:r>
+          </w:p>
+        </w:tc>
+      </w:tr>
+      <w:tr>
+        <w:trPr>
+          <w:trHeight w:val="481" w:hRule="exact"/>
+        </w:trPr>
+        <w:tc>
+          <w:tcPr>
+            <w:tcW w:type="dxa" w:w="680"/>
+            <w:vAlign w:val="center"/>
+          </w:tcPr>
+          <w:p>
+            <w:pPr>
+              <w:spacing w:before="0" w:after="0"/>
+              <w:jc w:val="center"/>
             </w:pPr>
             <w:r>
               <w:rPr>
@@ -834,20 +850,57 @@
             </w:r>
           </w:p>
         </w:tc>
-      </w:tr>
-      <w:tr>
-        <w:trPr>
-          <w:trHeight w:val="850" w:hRule="exact"/>
-        </w:trPr>
         <w:tc>
           <w:tcPr>
-            <w:tcW w:type="dxa" w:w="5216"/>
+            <w:tcW w:type="dxa" w:w="9865"/>
             <w:vAlign w:val="center"/>
           </w:tcPr>
           <w:p>
             <w:pPr>
               <w:spacing w:before="0" w:after="0"/>
-              <w:jc w:val="left"/>
+              <w:tabs>
+                <w:tab w:val="right" w:pos="9780"/>
+              </w:tabs>
+            </w:pPr>
+            <w:r>
+              <w:rPr>
+                <w:rFonts w:ascii="Arial" w:hAnsi="Arial" w:eastAsia="MS PGothic"/>
+                <w:b w:val="0"/>
+                <w:sz w:val="21"/>
+              </w:rPr>
+            </w:r>
+            <w:r>
+              <w:rPr>
+                <w:rFonts w:ascii="Arial" w:hAnsi="Arial" w:eastAsia="MS PGothic"/>
+                <w:b w:val="0"/>
+                <w:sz w:val="21"/>
+              </w:rPr>
+              <w:tab/>
+            </w:r>
+            <w:r>
+              <w:rPr>
+                <w:rFonts w:ascii="Arial" w:hAnsi="Arial" w:eastAsia="MS PGothic"/>
+                <w:b w:val="0"/>
+                <w:sz w:val="21"/>
+              </w:rPr>
+              <w:t>in the world.</w:t>
+            </w:r>
+          </w:p>
+        </w:tc>
+      </w:tr>
+      <w:tr>
+        <w:trPr>
+          <w:trHeight w:val="481" w:hRule="exact"/>
+        </w:trPr>
+        <w:tc>
+          <w:tcPr>
+            <w:tcW w:type="dxa" w:w="680"/>
+            <w:vAlign w:val="center"/>
+          </w:tcPr>
+          <w:p>
+            <w:pPr>
+              <w:spacing w:before="0" w:after="0"/>
+              <w:jc w:val="center"/>
             </w:pPr>
             <w:r>
               <w:rPr>
@@ -861,13 +914,56 @@
         </w:tc>
         <w:tc>
           <w:tcPr>
-            <w:tcW w:type="dxa" w:w="5216"/>
+            <w:tcW w:type="dxa" w:w="9865"/>
             <w:vAlign w:val="center"/>
           </w:tcPr>
           <w:p>
             <w:pPr>
               <w:spacing w:before="0" w:after="0"/>
-              <w:jc w:val="left"/>
+              <w:tabs>
+                <w:tab w:val="right" w:pos="9780"/>
+              </w:tabs>
+            </w:pPr>
+            <w:r>
+              <w:rPr>
+                <w:rFonts w:ascii="Arial" w:hAnsi="Arial" w:eastAsia="MS PGothic"/>
+                <w:b w:val="0"/>
+                <w:sz w:val="21"/>
+              </w:rPr>
+              <w:t xml:space="preserve">It  </w:t>
+            </w:r>
+            <w:r>
+              <w:rPr>
+                <w:rFonts w:ascii="Arial" w:hAnsi="Arial" w:eastAsia="MS PGothic"/>
+                <w:b w:val="0"/>
+                <w:sz w:val="21"/>
+              </w:rPr>
+              <w:tab/>
+            </w:r>
+            <w:r>
+              <w:rPr>
+                <w:rFonts w:ascii="Arial" w:hAnsi="Arial" w:eastAsia="MS PGothic"/>
+                <w:b w:val="0"/>
+                <w:sz w:val="21"/>
+              </w:rPr>
+              <w:t>in summer.</w:t>
+            </w:r>
+          </w:p>
+        </w:tc>
+      </w:tr>
+      <w:tr>
+        <w:trPr>
+          <w:trHeight w:val="481" w:hRule="exact"/>
+        </w:trPr>
+        <w:tc>
+          <w:tcPr>
+            <w:tcW w:type="dxa" w:w="680"/>
+            <w:vAlign w:val="center"/>
+          </w:tcPr>
+          <w:p>
+            <w:pPr>
+              <w:spacing w:before="0" w:after="0"/>
+              <w:jc w:val="center"/>
             </w:pPr>
             <w:r>
               <w:rPr>
@@ -879,20 +975,58 @@
             </w:r>
           </w:p>
         </w:tc>
-      </w:tr>
-      <w:tr>
-        <w:trPr>
-          <w:trHeight w:val="850" w:hRule="exact"/>
-        </w:trPr>
         <w:tc>
           <w:tcPr>
-            <w:tcW w:type="dxa" w:w="5216"/>
+            <w:tcW w:type="dxa" w:w="9865"/>
             <w:vAlign w:val="center"/>
           </w:tcPr>
           <w:p>
             <w:pPr>
               <w:spacing w:before="0" w:after="0"/>
-              <w:jc w:val="left"/>
+              <w:tabs>
+                <w:tab w:val="right" w:pos="9780"/>
+              </w:tabs>
+            </w:pPr>
+            <w:r>
+              <w:rPr>
+                <w:rFonts w:ascii="Arial" w:hAnsi="Arial" w:eastAsia="MS PGothic"/>
+                <w:b w:val="0"/>
+                <w:sz w:val="21"/>
+              </w:rPr>
+              <w:t xml:space="preserve">It is  </w:t>
+            </w:r>
+            <w:r>
+              <w:rPr>
+                <w:rFonts w:ascii="Arial" w:hAnsi="Arial" w:eastAsia="MS PGothic"/>
+                <w:b w:val="0"/>
+                <w:sz w:val="21"/>
+              </w:rPr>
+              <w:tab/>
+            </w:r>
+            <w:r>
+              <w:rPr>
+                <w:rFonts w:ascii="Arial" w:hAnsi="Arial" w:eastAsia="MS PGothic"/>
+                <w:b w:val="0"/>
+                <w:sz w:val="21"/>
+              </w:rPr>
+              <w:t>on the world map.</w:t>
+            </w:r>
+          </w:p>
+        </w:tc>
+      </w:tr>
+      <w:tr>
+        <w:trPr>
+          <w:trHeight w:val="481" w:hRule="exact"/>
+        </w:trPr>
+        <w:tc>
+          <w:tcPr>
+            <w:tcW w:type="dxa" w:w="680"/>
+            <w:vAlign w:val="center"/>
+          </w:tcPr>
+          <w:p>
+            <w:pPr>
+              <w:spacing w:before="0" w:after="0"/>
+              <w:jc w:val="center"/>
             </w:pPr>
             <w:r>
               <w:rPr>
@@ -906,13 +1040,55 @@
         </w:tc>
         <w:tc>
           <w:tcPr>
-            <w:tcW w:type="dxa" w:w="5216"/>
+            <w:tcW w:type="dxa" w:w="9865"/>
             <w:vAlign w:val="center"/>
           </w:tcPr>
           <w:p>
             <w:pPr>
               <w:spacing w:before="0" w:after="0"/>
-              <w:jc w:val="left"/>
+              <w:tabs>
+                <w:tab w:val="right" w:pos="9780"/>
+              </w:tabs>
+            </w:pPr>
+            <w:r>
+              <w:rPr>
+                <w:rFonts w:ascii="Arial" w:hAnsi="Arial" w:eastAsia="MS PGothic"/>
+                <w:b w:val="0"/>
+                <w:sz w:val="21"/>
+              </w:rPr>
+            </w:r>
+            <w:r>
+              <w:rPr>
+                <w:rFonts w:ascii="Arial" w:hAnsi="Arial" w:eastAsia="MS PGothic"/>
+                <w:b w:val="0"/>
+                <w:sz w:val="21"/>
+              </w:rPr>
+              <w:tab/>
+            </w:r>
+            <w:r>
+              <w:rPr>
+                <w:rFonts w:ascii="Arial" w:hAnsi="Arial" w:eastAsia="MS PGothic"/>
+                <w:b w:val="0"/>
+                <w:sz w:val="21"/>
+              </w:rPr>
+              <w:t>.</w:t>
+            </w:r>
+          </w:p>
+        </w:tc>
+      </w:tr>
+      <w:tr>
+        <w:trPr>
+          <w:trHeight w:val="481" w:hRule="exact"/>
+        </w:trPr>
+        <w:tc>
+          <w:tcPr>
+            <w:tcW w:type="dxa" w:w="680"/>
+            <w:vAlign w:val="center"/>
+          </w:tcPr>
+          <w:p>
+            <w:pPr>
+              <w:spacing w:before="0" w:after="0"/>
+              <w:jc w:val="center"/>
             </w:pPr>
             <w:r>
               <w:rPr>
@@ -924,20 +1100,58 @@
             </w:r>
           </w:p>
         </w:tc>
-      </w:tr>
-      <w:tr>
-        <w:trPr>
-          <w:trHeight w:val="850" w:hRule="exact"/>
-        </w:trPr>
         <w:tc>
           <w:tcPr>
-            <w:tcW w:type="dxa" w:w="5216"/>
+            <w:tcW w:type="dxa" w:w="9865"/>
             <w:vAlign w:val="center"/>
           </w:tcPr>
           <w:p>
             <w:pPr>
               <w:spacing w:before="0" w:after="0"/>
-              <w:jc w:val="left"/>
+              <w:tabs>
+                <w:tab w:val="right" w:pos="9780"/>
+              </w:tabs>
+            </w:pPr>
+            <w:r>
+              <w:rPr>
+                <w:rFonts w:ascii="Arial" w:hAnsi="Arial" w:eastAsia="MS PGothic"/>
+                <w:b w:val="0"/>
+                <w:sz w:val="21"/>
+              </w:rPr>
+              <w:t xml:space="preserve">The author  </w:t>
+            </w:r>
+            <w:r>
+              <w:rPr>
+                <w:rFonts w:ascii="Arial" w:hAnsi="Arial" w:eastAsia="MS PGothic"/>
+                <w:b w:val="0"/>
+                <w:sz w:val="21"/>
+              </w:rPr>
+              <w:tab/>
+            </w:r>
+            <w:r>
+              <w:rPr>
+                <w:rFonts w:ascii="Arial" w:hAnsi="Arial" w:eastAsia="MS PGothic"/>
+                <w:b w:val="0"/>
+                <w:sz w:val="21"/>
+              </w:rPr>
+              <w:t>in her garden.</w:t>
+            </w:r>
+          </w:p>
+        </w:tc>
+      </w:tr>
+      <w:tr>
+        <w:trPr>
+          <w:trHeight w:val="481" w:hRule="exact"/>
+        </w:trPr>
+        <w:tc>
+          <w:tcPr>
+            <w:tcW w:type="dxa" w:w="680"/>
+            <w:vAlign w:val="center"/>
+          </w:tcPr>
+          <w:p>
+            <w:pPr>
+              <w:spacing w:before="0" w:after="0"/>
+              <w:jc w:val="center"/>
             </w:pPr>
             <w:r>
               <w:rPr>
@@ -951,13 +1165,56 @@
         </w:tc>
         <w:tc>
           <w:tcPr>
-            <w:tcW w:type="dxa" w:w="5216"/>
+            <w:tcW w:type="dxa" w:w="9865"/>
             <w:vAlign w:val="center"/>
           </w:tcPr>
           <w:p>
             <w:pPr>
               <w:spacing w:before="0" w:after="0"/>
-              <w:jc w:val="left"/>
+              <w:tabs>
+                <w:tab w:val="right" w:pos="9780"/>
+              </w:tabs>
+            </w:pPr>
+            <w:r>
+              <w:rPr>
+                <w:rFonts w:ascii="Arial" w:hAnsi="Arial" w:eastAsia="MS PGothic"/>
+                <w:b w:val="0"/>
+                <w:sz w:val="21"/>
+              </w:rPr>
+              <w:t xml:space="preserve">It was quite frightening, but  </w:t>
+            </w:r>
+            <w:r>
+              <w:rPr>
+                <w:rFonts w:ascii="Arial" w:hAnsi="Arial" w:eastAsia="MS PGothic"/>
+                <w:b w:val="0"/>
+                <w:sz w:val="21"/>
+              </w:rPr>
+              <w:tab/>
+            </w:r>
+            <w:r>
+              <w:rPr>
+                <w:rFonts w:ascii="Arial" w:hAnsi="Arial" w:eastAsia="MS PGothic"/>
+                <w:b w:val="0"/>
+                <w:sz w:val="21"/>
+              </w:rPr>
+              <w:t>.</w:t>
+            </w:r>
+          </w:p>
+        </w:tc>
+      </w:tr>
+      <w:tr>
+        <w:trPr>
+          <w:trHeight w:val="481" w:hRule="exact"/>
+        </w:trPr>
+        <w:tc>
+          <w:tcPr>
+            <w:tcW w:type="dxa" w:w="680"/>
+            <w:vAlign w:val="center"/>
+          </w:tcPr>
+          <w:p>
+            <w:pPr>
+              <w:spacing w:before="0" w:after="0"/>
+              <w:jc w:val="center"/>
             </w:pPr>
             <w:r>
               <w:rPr>
@@ -969,20 +1226,58 @@
             </w:r>
           </w:p>
         </w:tc>
-      </w:tr>
-      <w:tr>
-        <w:trPr>
-          <w:trHeight w:val="850" w:hRule="exact"/>
-        </w:trPr>
         <w:tc>
           <w:tcPr>
-            <w:tcW w:type="dxa" w:w="5216"/>
+            <w:tcW w:type="dxa" w:w="9865"/>
             <w:vAlign w:val="center"/>
           </w:tcPr>
           <w:p>
             <w:pPr>
               <w:spacing w:before="0" w:after="0"/>
-              <w:jc w:val="left"/>
+              <w:tabs>
+                <w:tab w:val="right" w:pos="9780"/>
+              </w:tabs>
+            </w:pPr>
+            <w:r>
+              <w:rPr>
+                <w:rFonts w:ascii="Arial" w:hAnsi="Arial" w:eastAsia="MS PGothic"/>
+                <w:b w:val="0"/>
+                <w:sz w:val="21"/>
+              </w:rPr>
+              <w:t xml:space="preserve">In Japan,  </w:t>
+            </w:r>
+            <w:r>
+              <w:rPr>
+                <w:rFonts w:ascii="Arial" w:hAnsi="Arial" w:eastAsia="MS PGothic"/>
+                <w:b w:val="0"/>
+                <w:sz w:val="21"/>
+              </w:rPr>
+              <w:tab/>
+            </w:r>
+            <w:r>
+              <w:rPr>
+                <w:rFonts w:ascii="Arial" w:hAnsi="Arial" w:eastAsia="MS PGothic"/>
+                <w:b w:val="0"/>
+                <w:sz w:val="21"/>
+              </w:rPr>
+              <w:t>.</w:t>
+            </w:r>
+          </w:p>
+        </w:tc>
+      </w:tr>
+      <w:tr>
+        <w:trPr>
+          <w:trHeight w:val="481" w:hRule="exact"/>
+        </w:trPr>
+        <w:tc>
+          <w:tcPr>
+            <w:tcW w:type="dxa" w:w="680"/>
+            <w:vAlign w:val="center"/>
+          </w:tcPr>
+          <w:p>
+            <w:pPr>
+              <w:spacing w:before="0" w:after="0"/>
+              <w:jc w:val="center"/>
             </w:pPr>
             <w:r>
               <w:rPr>
@@ -996,13 +1291,56 @@
         </w:tc>
         <w:tc>
           <w:tcPr>
-            <w:tcW w:type="dxa" w:w="5216"/>
+            <w:tcW w:type="dxa" w:w="9865"/>
             <w:vAlign w:val="center"/>
           </w:tcPr>
           <w:p>
             <w:pPr>
               <w:spacing w:before="0" w:after="0"/>
-              <w:jc w:val="left"/>
+              <w:tabs>
+                <w:tab w:val="right" w:pos="9780"/>
+              </w:tabs>
+            </w:pPr>
+            <w:r>
+              <w:rPr>
+                <w:rFonts w:ascii="Arial" w:hAnsi="Arial" w:eastAsia="MS PGothic"/>
+                <w:b w:val="0"/>
+                <w:sz w:val="21"/>
+              </w:rPr>
+              <w:t xml:space="preserve">Enjoy  </w:t>
+            </w:r>
+            <w:r>
+              <w:rPr>
+                <w:rFonts w:ascii="Arial" w:hAnsi="Arial" w:eastAsia="MS PGothic"/>
+                <w:b w:val="0"/>
+                <w:sz w:val="21"/>
+              </w:rPr>
+              <w:tab/>
+            </w:r>
+            <w:r>
+              <w:rPr>
+                <w:rFonts w:ascii="Arial" w:hAnsi="Arial" w:eastAsia="MS PGothic"/>
+                <w:b w:val="0"/>
+                <w:sz w:val="21"/>
+              </w:rPr>
+              <w:t>.</w:t>
+            </w:r>
+          </w:p>
+        </w:tc>
+      </w:tr>
+      <w:tr>
+        <w:trPr>
+          <w:trHeight w:val="481" w:hRule="exact"/>
+        </w:trPr>
+        <w:tc>
+          <w:tcPr>
+            <w:tcW w:type="dxa" w:w="680"/>
+            <w:vAlign w:val="center"/>
+          </w:tcPr>
+          <w:p>
+            <w:pPr>
+              <w:spacing w:before="0" w:after="0"/>
+              <w:jc w:val="center"/>
             </w:pPr>
             <w:r>
               <w:rPr>
@@ -1011,6 +1349,44 @@
                 <w:sz w:val="21"/>
               </w:rPr>
               <w:t>(10)</w:t>
+            </w:r>
+          </w:p>
+        </w:tc>
+        <w:tc>
+          <w:tcPr>
+            <w:tcW w:type="dxa" w:w="9865"/>
+            <w:vAlign w:val="center"/>
+          </w:tcPr>
+          <w:p>
+            <w:pPr>
+              <w:spacing w:before="0" w:after="0"/>
+              <w:tabs>
+                <w:tab w:val="right" w:pos="9780"/>
+              </w:tabs>
+            </w:pPr>
+            <w:r>
+              <w:rPr>
+                <w:rFonts w:ascii="Arial" w:hAnsi="Arial" w:eastAsia="MS PGothic"/>
+                <w:b w:val="0"/>
+                <w:sz w:val="21"/>
+              </w:rPr>
+              <w:t xml:space="preserve">In the magical town, she  </w:t>
+            </w:r>
+            <w:r>
+              <w:rPr>
+                <w:rFonts w:ascii="Arial" w:hAnsi="Arial" w:eastAsia="MS PGothic"/>
+                <w:b w:val="0"/>
+                <w:sz w:val="21"/>
+              </w:rPr>
+              <w:tab/>
+            </w:r>
+            <w:r>
+              <w:rPr>
+                <w:rFonts w:ascii="Arial" w:hAnsi="Arial" w:eastAsia="MS PGothic"/>
+                <w:b w:val="0"/>
+                <w:sz w:val="21"/>
+              </w:rPr>
+              <w:t>.</w:t>
             </w:r>
           </w:p>
         </w:tc>
@@ -1027,7 +1403,7 @@
           <w:b w:val="0"/>
           <w:sz w:val="19"/>
         </w:rPr>
-        <w:t>B（1×12=12点）</w:t>
+        <w:t>B（1×12=12点）　空所に適切な語を入れよ</w:t>
       </w:r>
     </w:p>
     <w:tbl>
@@ -1038,18 +1414,14 @@
         <w:tblLook w:firstColumn="1" w:firstRow="1" w:lastColumn="0" w:lastRow="0" w:noHBand="0" w:noVBand="1" w:val="04A0"/>
       </w:tblPr>
       <w:tblGrid>
-        <w:gridCol w:w="1318"/>
-        <w:gridCol w:w="1318"/>
-        <w:gridCol w:w="1318"/>
-        <w:gridCol w:w="1318"/>
-        <w:gridCol w:w="1318"/>
-        <w:gridCol w:w="1318"/>
-        <w:gridCol w:w="1318"/>
-        <w:gridCol w:w="1318"/>
+        <w:gridCol w:w="2636"/>
+        <w:gridCol w:w="2636"/>
+        <w:gridCol w:w="2636"/>
+        <w:gridCol w:w="2636"/>
       </w:tblGrid>
       <w:tr>
         <w:trPr>
-          <w:trHeight w:val="567" w:hRule="exact"/>
+          <w:trHeight w:val="527" w:hRule="exact"/>
         </w:trPr>
         <w:tc>
           <w:tcPr>
@@ -1064,7 +1436,7 @@
             <w:r>
               <w:rPr>
                 <w:rFonts w:ascii="Arial" w:hAnsi="Arial" w:eastAsia="MS PGothic"/>
-                <w:b/>
+                <w:b w:val="0"/>
                 <w:sz w:val="19"/>
               </w:rPr>
               <w:t>(1)</w:t>
@@ -1073,54 +1445,7 @@
         </w:tc>
         <w:tc>
           <w:tcPr>
-            <w:tcW w:type="dxa" w:w="1247"/>
-            <w:vAlign w:val="center"/>
-          </w:tcPr>
-          <w:p>
-            <w:pPr>
-              <w:spacing w:before="0" w:after="0"/>
-              <w:jc w:val="left"/>
-            </w:pPr>
-            <w:r>
-              <w:rPr>
-                <w:rFonts w:ascii="Arial" w:hAnsi="Arial" w:eastAsia="MS PGothic"/>
-                <w:b w:val="0"/>
-                <w:sz w:val="21"/>
-              </w:rPr>
-            </w:r>
-          </w:p>
-        </w:tc>
-        <w:tc>
-          <w:tcPr>
-            <w:tcW w:type="dxa" w:w="1247"/>
-            <w:tcBorders>
-              <w:top w:val="none" w:sz="0" w:space="0" w:color="auto"/>
-              <w:left w:val="none" w:sz="0" w:space="0" w:color="auto"/>
-              <w:bottom w:val="none" w:sz="0" w:space="0" w:color="auto"/>
-              <w:right w:val="none" w:sz="0" w:space="0" w:color="auto"/>
-              <w:insideH w:val="none" w:sz="0" w:space="0" w:color="auto"/>
-              <w:insideV w:val="none" w:sz="0" w:space="0" w:color="auto"/>
-            </w:tcBorders>
-          </w:tcPr>
-          <w:p/>
-        </w:tc>
-        <w:tc>
-          <w:tcPr>
-            <w:tcW w:type="dxa" w:w="1247"/>
-            <w:tcBorders>
-              <w:top w:val="none" w:sz="0" w:space="0" w:color="auto"/>
-              <w:left w:val="none" w:sz="0" w:space="0" w:color="auto"/>
-              <w:bottom w:val="none" w:sz="0" w:space="0" w:color="auto"/>
-              <w:right w:val="none" w:sz="0" w:space="0" w:color="auto"/>
-              <w:insideH w:val="none" w:sz="0" w:space="0" w:color="auto"/>
-              <w:insideV w:val="none" w:sz="0" w:space="0" w:color="auto"/>
-            </w:tcBorders>
-          </w:tcPr>
-          <w:p/>
-        </w:tc>
-        <w:tc>
-          <w:tcPr>
-            <w:tcW w:type="dxa" w:w="454"/>
+            <w:tcW w:type="dxa" w:w="4819"/>
             <w:vAlign w:val="center"/>
           </w:tcPr>
           <w:p>
@@ -1131,437 +1456,10 @@
             <w:r>
               <w:rPr>
                 <w:rFonts w:ascii="Arial" w:hAnsi="Arial" w:eastAsia="MS PGothic"/>
-                <w:b/>
-                <w:sz w:val="19"/>
-              </w:rPr>
-              <w:t>(7)</w:t>
-            </w:r>
-          </w:p>
-        </w:tc>
-        <w:tc>
-          <w:tcPr>
-            <w:tcW w:type="dxa" w:w="1247"/>
-            <w:vAlign w:val="center"/>
-          </w:tcPr>
-          <w:p>
-            <w:pPr>
-              <w:spacing w:before="0" w:after="0"/>
-              <w:jc w:val="left"/>
-            </w:pPr>
-            <w:r>
-              <w:rPr>
-                <w:rFonts w:ascii="Arial" w:hAnsi="Arial" w:eastAsia="MS PGothic"/>
                 <w:b w:val="0"/>
                 <w:sz w:val="21"/>
               </w:rPr>
-            </w:r>
-          </w:p>
-        </w:tc>
-        <w:tc>
-          <w:tcPr>
-            <w:tcW w:type="dxa" w:w="1247"/>
-            <w:tcBorders>
-              <w:top w:val="none" w:sz="0" w:space="0" w:color="auto"/>
-              <w:left w:val="none" w:sz="0" w:space="0" w:color="auto"/>
-              <w:bottom w:val="none" w:sz="0" w:space="0" w:color="auto"/>
-              <w:right w:val="none" w:sz="0" w:space="0" w:color="auto"/>
-              <w:insideH w:val="none" w:sz="0" w:space="0" w:color="auto"/>
-              <w:insideV w:val="none" w:sz="0" w:space="0" w:color="auto"/>
-            </w:tcBorders>
-          </w:tcPr>
-          <w:p/>
-        </w:tc>
-        <w:tc>
-          <w:tcPr>
-            <w:tcW w:type="dxa" w:w="1247"/>
-            <w:tcBorders>
-              <w:top w:val="none" w:sz="0" w:space="0" w:color="auto"/>
-              <w:left w:val="none" w:sz="0" w:space="0" w:color="auto"/>
-              <w:bottom w:val="none" w:sz="0" w:space="0" w:color="auto"/>
-              <w:right w:val="none" w:sz="0" w:space="0" w:color="auto"/>
-              <w:insideH w:val="none" w:sz="0" w:space="0" w:color="auto"/>
-              <w:insideV w:val="none" w:sz="0" w:space="0" w:color="auto"/>
-            </w:tcBorders>
-          </w:tcPr>
-          <w:p/>
-        </w:tc>
-      </w:tr>
-      <w:tr>
-        <w:trPr>
-          <w:trHeight w:val="567" w:hRule="exact"/>
-        </w:trPr>
-        <w:tc>
-          <w:tcPr>
-            <w:tcW w:type="dxa" w:w="454"/>
-            <w:vAlign w:val="center"/>
-          </w:tcPr>
-          <w:p>
-            <w:pPr>
-              <w:spacing w:before="0" w:after="0"/>
-              <w:jc w:val="center"/>
-            </w:pPr>
-            <w:r>
-              <w:rPr>
-                <w:rFonts w:ascii="Arial" w:hAnsi="Arial" w:eastAsia="MS PGothic"/>
-                <w:b/>
-                <w:sz w:val="19"/>
-              </w:rPr>
-              <w:t>(2)</w:t>
-            </w:r>
-          </w:p>
-        </w:tc>
-        <w:tc>
-          <w:tcPr>
-            <w:tcW w:type="dxa" w:w="1247"/>
-            <w:vAlign w:val="center"/>
-          </w:tcPr>
-          <w:p>
-            <w:pPr>
-              <w:spacing w:before="0" w:after="0"/>
-              <w:jc w:val="left"/>
-            </w:pPr>
-            <w:r>
-              <w:rPr>
-                <w:rFonts w:ascii="Arial" w:hAnsi="Arial" w:eastAsia="MS PGothic"/>
-                <w:b w:val="0"/>
-                <w:sz w:val="21"/>
-              </w:rPr>
-            </w:r>
-          </w:p>
-        </w:tc>
-        <w:tc>
-          <w:tcPr>
-            <w:tcW w:type="dxa" w:w="1247"/>
-            <w:vAlign w:val="center"/>
-          </w:tcPr>
-          <w:p>
-            <w:pPr>
-              <w:spacing w:before="0" w:after="0"/>
-              <w:jc w:val="left"/>
-            </w:pPr>
-            <w:r>
-              <w:rPr>
-                <w:rFonts w:ascii="Arial" w:hAnsi="Arial" w:eastAsia="MS PGothic"/>
-                <w:b w:val="0"/>
-                <w:sz w:val="21"/>
-              </w:rPr>
-            </w:r>
-          </w:p>
-        </w:tc>
-        <w:tc>
-          <w:tcPr>
-            <w:tcW w:type="dxa" w:w="1247"/>
-            <w:tcBorders>
-              <w:top w:val="none" w:sz="0" w:space="0" w:color="auto"/>
-              <w:left w:val="none" w:sz="0" w:space="0" w:color="auto"/>
-              <w:bottom w:val="none" w:sz="0" w:space="0" w:color="auto"/>
-              <w:right w:val="none" w:sz="0" w:space="0" w:color="auto"/>
-              <w:insideH w:val="none" w:sz="0" w:space="0" w:color="auto"/>
-              <w:insideV w:val="none" w:sz="0" w:space="0" w:color="auto"/>
-            </w:tcBorders>
-          </w:tcPr>
-          <w:p/>
-        </w:tc>
-        <w:tc>
-          <w:tcPr>
-            <w:tcW w:type="dxa" w:w="454"/>
-            <w:vAlign w:val="center"/>
-          </w:tcPr>
-          <w:p>
-            <w:pPr>
-              <w:spacing w:before="0" w:after="0"/>
-              <w:jc w:val="center"/>
-            </w:pPr>
-            <w:r>
-              <w:rPr>
-                <w:rFonts w:ascii="Arial" w:hAnsi="Arial" w:eastAsia="MS PGothic"/>
-                <w:b/>
-                <w:sz w:val="19"/>
-              </w:rPr>
-              <w:t>(8)</w:t>
-            </w:r>
-          </w:p>
-        </w:tc>
-        <w:tc>
-          <w:tcPr>
-            <w:tcW w:type="dxa" w:w="1247"/>
-            <w:vAlign w:val="center"/>
-          </w:tcPr>
-          <w:p>
-            <w:pPr>
-              <w:spacing w:before="0" w:after="0"/>
-              <w:jc w:val="left"/>
-            </w:pPr>
-            <w:r>
-              <w:rPr>
-                <w:rFonts w:ascii="Arial" w:hAnsi="Arial" w:eastAsia="MS PGothic"/>
-                <w:b w:val="0"/>
-                <w:sz w:val="21"/>
-              </w:rPr>
-            </w:r>
-          </w:p>
-        </w:tc>
-        <w:tc>
-          <w:tcPr>
-            <w:tcW w:type="dxa" w:w="1247"/>
-            <w:vAlign w:val="center"/>
-          </w:tcPr>
-          <w:p>
-            <w:pPr>
-              <w:spacing w:before="0" w:after="0"/>
-              <w:jc w:val="left"/>
-            </w:pPr>
-            <w:r>
-              <w:rPr>
-                <w:rFonts w:ascii="Arial" w:hAnsi="Arial" w:eastAsia="MS PGothic"/>
-                <w:b w:val="0"/>
-                <w:sz w:val="21"/>
-              </w:rPr>
-            </w:r>
-          </w:p>
-        </w:tc>
-        <w:tc>
-          <w:tcPr>
-            <w:tcW w:type="dxa" w:w="1247"/>
-            <w:tcBorders>
-              <w:top w:val="none" w:sz="0" w:space="0" w:color="auto"/>
-              <w:left w:val="none" w:sz="0" w:space="0" w:color="auto"/>
-              <w:bottom w:val="none" w:sz="0" w:space="0" w:color="auto"/>
-              <w:right w:val="none" w:sz="0" w:space="0" w:color="auto"/>
-              <w:insideH w:val="none" w:sz="0" w:space="0" w:color="auto"/>
-              <w:insideV w:val="none" w:sz="0" w:space="0" w:color="auto"/>
-            </w:tcBorders>
-          </w:tcPr>
-          <w:p/>
-        </w:tc>
-      </w:tr>
-      <w:tr>
-        <w:trPr>
-          <w:trHeight w:val="567" w:hRule="exact"/>
-        </w:trPr>
-        <w:tc>
-          <w:tcPr>
-            <w:tcW w:type="dxa" w:w="454"/>
-            <w:vAlign w:val="center"/>
-          </w:tcPr>
-          <w:p>
-            <w:pPr>
-              <w:spacing w:before="0" w:after="0"/>
-              <w:jc w:val="center"/>
-            </w:pPr>
-            <w:r>
-              <w:rPr>
-                <w:rFonts w:ascii="Arial" w:hAnsi="Arial" w:eastAsia="MS PGothic"/>
-                <w:b/>
-                <w:sz w:val="19"/>
-              </w:rPr>
-              <w:t>(3)</w:t>
-            </w:r>
-          </w:p>
-        </w:tc>
-        <w:tc>
-          <w:tcPr>
-            <w:tcW w:type="dxa" w:w="1247"/>
-            <w:vAlign w:val="center"/>
-          </w:tcPr>
-          <w:p>
-            <w:pPr>
-              <w:spacing w:before="0" w:after="0"/>
-              <w:jc w:val="left"/>
-            </w:pPr>
-            <w:r>
-              <w:rPr>
-                <w:rFonts w:ascii="Arial" w:hAnsi="Arial" w:eastAsia="MS PGothic"/>
-                <w:b w:val="0"/>
-                <w:sz w:val="21"/>
-              </w:rPr>
-            </w:r>
-          </w:p>
-        </w:tc>
-        <w:tc>
-          <w:tcPr>
-            <w:tcW w:type="dxa" w:w="1247"/>
-            <w:vAlign w:val="center"/>
-          </w:tcPr>
-          <w:p>
-            <w:pPr>
-              <w:spacing w:before="0" w:after="0"/>
-              <w:jc w:val="left"/>
-            </w:pPr>
-            <w:r>
-              <w:rPr>
-                <w:rFonts w:ascii="Arial" w:hAnsi="Arial" w:eastAsia="MS PGothic"/>
-                <w:b w:val="0"/>
-                <w:sz w:val="21"/>
-              </w:rPr>
-            </w:r>
-          </w:p>
-        </w:tc>
-        <w:tc>
-          <w:tcPr>
-            <w:tcW w:type="dxa" w:w="1247"/>
-            <w:tcBorders>
-              <w:top w:val="none" w:sz="0" w:space="0" w:color="auto"/>
-              <w:left w:val="none" w:sz="0" w:space="0" w:color="auto"/>
-              <w:bottom w:val="none" w:sz="0" w:space="0" w:color="auto"/>
-              <w:right w:val="none" w:sz="0" w:space="0" w:color="auto"/>
-              <w:insideH w:val="none" w:sz="0" w:space="0" w:color="auto"/>
-              <w:insideV w:val="none" w:sz="0" w:space="0" w:color="auto"/>
-            </w:tcBorders>
-          </w:tcPr>
-          <w:p/>
-        </w:tc>
-        <w:tc>
-          <w:tcPr>
-            <w:tcW w:type="dxa" w:w="454"/>
-            <w:vAlign w:val="center"/>
-          </w:tcPr>
-          <w:p>
-            <w:pPr>
-              <w:spacing w:before="0" w:after="0"/>
-              <w:jc w:val="center"/>
-            </w:pPr>
-            <w:r>
-              <w:rPr>
-                <w:rFonts w:ascii="Arial" w:hAnsi="Arial" w:eastAsia="MS PGothic"/>
-                <w:b/>
-                <w:sz w:val="19"/>
-              </w:rPr>
-              <w:t>(9)</w:t>
-            </w:r>
-          </w:p>
-        </w:tc>
-        <w:tc>
-          <w:tcPr>
-            <w:tcW w:type="dxa" w:w="1247"/>
-            <w:vAlign w:val="center"/>
-          </w:tcPr>
-          <w:p>
-            <w:pPr>
-              <w:spacing w:before="0" w:after="0"/>
-              <w:jc w:val="left"/>
-            </w:pPr>
-            <w:r>
-              <w:rPr>
-                <w:rFonts w:ascii="Arial" w:hAnsi="Arial" w:eastAsia="MS PGothic"/>
-                <w:b w:val="0"/>
-                <w:sz w:val="21"/>
-              </w:rPr>
-            </w:r>
-          </w:p>
-        </w:tc>
-        <w:tc>
-          <w:tcPr>
-            <w:tcW w:type="dxa" w:w="1247"/>
-            <w:vAlign w:val="center"/>
-          </w:tcPr>
-          <w:p>
-            <w:pPr>
-              <w:spacing w:before="0" w:after="0"/>
-              <w:jc w:val="left"/>
-            </w:pPr>
-            <w:r>
-              <w:rPr>
-                <w:rFonts w:ascii="Arial" w:hAnsi="Arial" w:eastAsia="MS PGothic"/>
-                <w:b w:val="0"/>
-                <w:sz w:val="21"/>
-              </w:rPr>
-            </w:r>
-          </w:p>
-        </w:tc>
-        <w:tc>
-          <w:tcPr>
-            <w:tcW w:type="dxa" w:w="1247"/>
-            <w:tcBorders>
-              <w:top w:val="none" w:sz="0" w:space="0" w:color="auto"/>
-              <w:left w:val="none" w:sz="0" w:space="0" w:color="auto"/>
-              <w:bottom w:val="none" w:sz="0" w:space="0" w:color="auto"/>
-              <w:right w:val="none" w:sz="0" w:space="0" w:color="auto"/>
-              <w:insideH w:val="none" w:sz="0" w:space="0" w:color="auto"/>
-              <w:insideV w:val="none" w:sz="0" w:space="0" w:color="auto"/>
-            </w:tcBorders>
-          </w:tcPr>
-          <w:p/>
-        </w:tc>
-      </w:tr>
-      <w:tr>
-        <w:trPr>
-          <w:trHeight w:val="567" w:hRule="exact"/>
-        </w:trPr>
-        <w:tc>
-          <w:tcPr>
-            <w:tcW w:type="dxa" w:w="454"/>
-            <w:vAlign w:val="center"/>
-          </w:tcPr>
-          <w:p>
-            <w:pPr>
-              <w:spacing w:before="0" w:after="0"/>
-              <w:jc w:val="center"/>
-            </w:pPr>
-            <w:r>
-              <w:rPr>
-                <w:rFonts w:ascii="Arial" w:hAnsi="Arial" w:eastAsia="MS PGothic"/>
-                <w:b/>
-                <w:sz w:val="19"/>
-              </w:rPr>
-              <w:t>(4)</w:t>
-            </w:r>
-          </w:p>
-        </w:tc>
-        <w:tc>
-          <w:tcPr>
-            <w:tcW w:type="dxa" w:w="1247"/>
-            <w:vAlign w:val="center"/>
-          </w:tcPr>
-          <w:p>
-            <w:pPr>
-              <w:spacing w:before="0" w:after="0"/>
-              <w:jc w:val="left"/>
-            </w:pPr>
-            <w:r>
-              <w:rPr>
-                <w:rFonts w:ascii="Arial" w:hAnsi="Arial" w:eastAsia="MS PGothic"/>
-                <w:b w:val="0"/>
-                <w:sz w:val="21"/>
-              </w:rPr>
-            </w:r>
-          </w:p>
-        </w:tc>
-        <w:tc>
-          <w:tcPr>
-            <w:tcW w:type="dxa" w:w="1247"/>
-            <w:vAlign w:val="center"/>
-          </w:tcPr>
-          <w:p>
-            <w:pPr>
-              <w:spacing w:before="0" w:after="0"/>
-              <w:jc w:val="left"/>
-            </w:pPr>
-            <w:r>
-              <w:rPr>
-                <w:rFonts w:ascii="Arial" w:hAnsi="Arial" w:eastAsia="MS PGothic"/>
-                <w:b w:val="0"/>
-                <w:sz w:val="21"/>
-              </w:rPr>
-            </w:r>
-          </w:p>
-        </w:tc>
-        <w:tc>
-          <w:tcPr>
-            <w:tcW w:type="dxa" w:w="1247"/>
-            <w:vAlign w:val="center"/>
-          </w:tcPr>
-          <w:p>
-            <w:pPr>
-              <w:spacing w:before="0" w:after="0"/>
-              <w:jc w:val="left"/>
-            </w:pPr>
-            <w:r>
-              <w:rPr>
-                <w:rFonts w:ascii="Arial" w:hAnsi="Arial" w:eastAsia="MS PGothic"/>
-                <w:b w:val="0"/>
-                <w:sz w:val="21"/>
-              </w:rPr>
+              <w:t>(　　　　　　　　　　　　　　　　)</w:t>
             </w:r>
           </w:p>
         </w:tc>
@@ -1578,22 +1476,22 @@
             <w:r>
               <w:rPr>
                 <w:rFonts w:ascii="Arial" w:hAnsi="Arial" w:eastAsia="MS PGothic"/>
-                <w:b/>
+                <w:b w:val="0"/>
                 <w:sz w:val="19"/>
               </w:rPr>
-              <w:t>(10)</w:t>
+              <w:t>(7)</w:t>
             </w:r>
           </w:p>
         </w:tc>
         <w:tc>
           <w:tcPr>
-            <w:tcW w:type="dxa" w:w="1247"/>
+            <w:tcW w:type="dxa" w:w="4819"/>
             <w:vAlign w:val="center"/>
           </w:tcPr>
           <w:p>
             <w:pPr>
               <w:spacing w:before="0" w:after="0"/>
-              <w:jc w:val="left"/>
+              <w:jc w:val="center"/>
             </w:pPr>
             <w:r>
               <w:rPr>
@@ -1601,46 +1499,14 @@
                 <w:b w:val="0"/>
                 <w:sz w:val="21"/>
               </w:rPr>
+              <w:t>(　　　　　　　　　　　　　　　　)</w:t>
             </w:r>
           </w:p>
-        </w:tc>
-        <w:tc>
-          <w:tcPr>
-            <w:tcW w:type="dxa" w:w="1247"/>
-            <w:vAlign w:val="center"/>
-          </w:tcPr>
-          <w:p>
-            <w:pPr>
-              <w:spacing w:before="0" w:after="0"/>
-              <w:jc w:val="left"/>
-            </w:pPr>
-            <w:r>
-              <w:rPr>
-                <w:rFonts w:ascii="Arial" w:hAnsi="Arial" w:eastAsia="MS PGothic"/>
-                <w:b w:val="0"/>
-                <w:sz w:val="21"/>
-              </w:rPr>
-            </w:r>
-          </w:p>
-        </w:tc>
-        <w:tc>
-          <w:tcPr>
-            <w:tcW w:type="dxa" w:w="1247"/>
-            <w:tcBorders>
-              <w:top w:val="none" w:sz="0" w:space="0" w:color="auto"/>
-              <w:left w:val="none" w:sz="0" w:space="0" w:color="auto"/>
-              <w:bottom w:val="none" w:sz="0" w:space="0" w:color="auto"/>
-              <w:right w:val="none" w:sz="0" w:space="0" w:color="auto"/>
-              <w:insideH w:val="none" w:sz="0" w:space="0" w:color="auto"/>
-              <w:insideV w:val="none" w:sz="0" w:space="0" w:color="auto"/>
-            </w:tcBorders>
-          </w:tcPr>
-          <w:p/>
         </w:tc>
       </w:tr>
       <w:tr>
         <w:trPr>
-          <w:trHeight w:val="567" w:hRule="exact"/>
+          <w:trHeight w:val="527" w:hRule="exact"/>
         </w:trPr>
         <w:tc>
           <w:tcPr>
@@ -1655,22 +1521,22 @@
             <w:r>
               <w:rPr>
                 <w:rFonts w:ascii="Arial" w:hAnsi="Arial" w:eastAsia="MS PGothic"/>
-                <w:b/>
+                <w:b w:val="0"/>
                 <w:sz w:val="19"/>
               </w:rPr>
-              <w:t>(5)</w:t>
+              <w:t>(2)</w:t>
             </w:r>
           </w:p>
         </w:tc>
         <w:tc>
           <w:tcPr>
-            <w:tcW w:type="dxa" w:w="1247"/>
+            <w:tcW w:type="dxa" w:w="4819"/>
             <w:vAlign w:val="center"/>
           </w:tcPr>
           <w:p>
             <w:pPr>
               <w:spacing w:before="0" w:after="0"/>
-              <w:jc w:val="left"/>
+              <w:jc w:val="center"/>
             </w:pPr>
             <w:r>
               <w:rPr>
@@ -1678,44 +1544,7 @@
                 <w:b w:val="0"/>
                 <w:sz w:val="21"/>
               </w:rPr>
-            </w:r>
-          </w:p>
-        </w:tc>
-        <w:tc>
-          <w:tcPr>
-            <w:tcW w:type="dxa" w:w="1247"/>
-            <w:vAlign w:val="center"/>
-          </w:tcPr>
-          <w:p>
-            <w:pPr>
-              <w:spacing w:before="0" w:after="0"/>
-              <w:jc w:val="left"/>
-            </w:pPr>
-            <w:r>
-              <w:rPr>
-                <w:rFonts w:ascii="Arial" w:hAnsi="Arial" w:eastAsia="MS PGothic"/>
-                <w:b w:val="0"/>
-                <w:sz w:val="21"/>
-              </w:rPr>
-            </w:r>
-          </w:p>
-        </w:tc>
-        <w:tc>
-          <w:tcPr>
-            <w:tcW w:type="dxa" w:w="1247"/>
-            <w:vAlign w:val="center"/>
-          </w:tcPr>
-          <w:p>
-            <w:pPr>
-              <w:spacing w:before="0" w:after="0"/>
-              <w:jc w:val="left"/>
-            </w:pPr>
-            <w:r>
-              <w:rPr>
-                <w:rFonts w:ascii="Arial" w:hAnsi="Arial" w:eastAsia="MS PGothic"/>
-                <w:b w:val="0"/>
-                <w:sz w:val="21"/>
-              </w:rPr>
+              <w:t>(　　　　　　　)(　　　　　　　)</w:t>
             </w:r>
           </w:p>
         </w:tc>
@@ -1732,22 +1561,22 @@
             <w:r>
               <w:rPr>
                 <w:rFonts w:ascii="Arial" w:hAnsi="Arial" w:eastAsia="MS PGothic"/>
-                <w:b/>
+                <w:b w:val="0"/>
                 <w:sz w:val="19"/>
               </w:rPr>
-              <w:t>(11)</w:t>
+              <w:t>(8)</w:t>
             </w:r>
           </w:p>
         </w:tc>
         <w:tc>
           <w:tcPr>
-            <w:tcW w:type="dxa" w:w="1247"/>
+            <w:tcW w:type="dxa" w:w="4819"/>
             <w:vAlign w:val="center"/>
           </w:tcPr>
           <w:p>
             <w:pPr>
               <w:spacing w:before="0" w:after="0"/>
-              <w:jc w:val="left"/>
+              <w:jc w:val="center"/>
             </w:pPr>
             <w:r>
               <w:rPr>
@@ -1755,46 +1584,14 @@
                 <w:b w:val="0"/>
                 <w:sz w:val="21"/>
               </w:rPr>
+              <w:t>(　　　　　　　)(　　　　　　　)</w:t>
             </w:r>
           </w:p>
-        </w:tc>
-        <w:tc>
-          <w:tcPr>
-            <w:tcW w:type="dxa" w:w="1247"/>
-            <w:vAlign w:val="center"/>
-          </w:tcPr>
-          <w:p>
-            <w:pPr>
-              <w:spacing w:before="0" w:after="0"/>
-              <w:jc w:val="left"/>
-            </w:pPr>
-            <w:r>
-              <w:rPr>
-                <w:rFonts w:ascii="Arial" w:hAnsi="Arial" w:eastAsia="MS PGothic"/>
-                <w:b w:val="0"/>
-                <w:sz w:val="21"/>
-              </w:rPr>
-            </w:r>
-          </w:p>
-        </w:tc>
-        <w:tc>
-          <w:tcPr>
-            <w:tcW w:type="dxa" w:w="1247"/>
-            <w:tcBorders>
-              <w:top w:val="none" w:sz="0" w:space="0" w:color="auto"/>
-              <w:left w:val="none" w:sz="0" w:space="0" w:color="auto"/>
-              <w:bottom w:val="none" w:sz="0" w:space="0" w:color="auto"/>
-              <w:right w:val="none" w:sz="0" w:space="0" w:color="auto"/>
-              <w:insideH w:val="none" w:sz="0" w:space="0" w:color="auto"/>
-              <w:insideV w:val="none" w:sz="0" w:space="0" w:color="auto"/>
-            </w:tcBorders>
-          </w:tcPr>
-          <w:p/>
         </w:tc>
       </w:tr>
       <w:tr>
         <w:trPr>
-          <w:trHeight w:val="567" w:hRule="exact"/>
+          <w:trHeight w:val="527" w:hRule="exact"/>
         </w:trPr>
         <w:tc>
           <w:tcPr>
@@ -1809,22 +1606,22 @@
             <w:r>
               <w:rPr>
                 <w:rFonts w:ascii="Arial" w:hAnsi="Arial" w:eastAsia="MS PGothic"/>
-                <w:b/>
+                <w:b w:val="0"/>
                 <w:sz w:val="19"/>
               </w:rPr>
-              <w:t>(6)</w:t>
+              <w:t>(3)</w:t>
             </w:r>
           </w:p>
         </w:tc>
         <w:tc>
           <w:tcPr>
-            <w:tcW w:type="dxa" w:w="1247"/>
+            <w:tcW w:type="dxa" w:w="4819"/>
             <w:vAlign w:val="center"/>
           </w:tcPr>
           <w:p>
             <w:pPr>
               <w:spacing w:before="0" w:after="0"/>
-              <w:jc w:val="left"/>
+              <w:jc w:val="center"/>
             </w:pPr>
             <w:r>
               <w:rPr>
@@ -1832,44 +1629,7 @@
                 <w:b w:val="0"/>
                 <w:sz w:val="21"/>
               </w:rPr>
-            </w:r>
-          </w:p>
-        </w:tc>
-        <w:tc>
-          <w:tcPr>
-            <w:tcW w:type="dxa" w:w="1247"/>
-            <w:vAlign w:val="center"/>
-          </w:tcPr>
-          <w:p>
-            <w:pPr>
-              <w:spacing w:before="0" w:after="0"/>
-              <w:jc w:val="left"/>
-            </w:pPr>
-            <w:r>
-              <w:rPr>
-                <w:rFonts w:ascii="Arial" w:hAnsi="Arial" w:eastAsia="MS PGothic"/>
-                <w:b w:val="0"/>
-                <w:sz w:val="21"/>
-              </w:rPr>
-            </w:r>
-          </w:p>
-        </w:tc>
-        <w:tc>
-          <w:tcPr>
-            <w:tcW w:type="dxa" w:w="1247"/>
-            <w:vAlign w:val="center"/>
-          </w:tcPr>
-          <w:p>
-            <w:pPr>
-              <w:spacing w:before="0" w:after="0"/>
-              <w:jc w:val="left"/>
-            </w:pPr>
-            <w:r>
-              <w:rPr>
-                <w:rFonts w:ascii="Arial" w:hAnsi="Arial" w:eastAsia="MS PGothic"/>
-                <w:b w:val="0"/>
-                <w:sz w:val="21"/>
-              </w:rPr>
+              <w:t>(　　　　　　　)(　　　　　　　)</w:t>
             </w:r>
           </w:p>
         </w:tc>
@@ -1886,7 +1646,262 @@
             <w:r>
               <w:rPr>
                 <w:rFonts w:ascii="Arial" w:hAnsi="Arial" w:eastAsia="MS PGothic"/>
-                <w:b/>
+                <w:b w:val="0"/>
+                <w:sz w:val="19"/>
+              </w:rPr>
+              <w:t>(9)</w:t>
+            </w:r>
+          </w:p>
+        </w:tc>
+        <w:tc>
+          <w:tcPr>
+            <w:tcW w:type="dxa" w:w="4819"/>
+            <w:vAlign w:val="center"/>
+          </w:tcPr>
+          <w:p>
+            <w:pPr>
+              <w:spacing w:before="0" w:after="0"/>
+              <w:jc w:val="center"/>
+            </w:pPr>
+            <w:r>
+              <w:rPr>
+                <w:rFonts w:ascii="Arial" w:hAnsi="Arial" w:eastAsia="MS PGothic"/>
+                <w:b w:val="0"/>
+                <w:sz w:val="21"/>
+              </w:rPr>
+              <w:t>(　　　　　　　)(　　　　　　　)</w:t>
+            </w:r>
+          </w:p>
+        </w:tc>
+      </w:tr>
+      <w:tr>
+        <w:trPr>
+          <w:trHeight w:val="527" w:hRule="exact"/>
+        </w:trPr>
+        <w:tc>
+          <w:tcPr>
+            <w:tcW w:type="dxa" w:w="454"/>
+            <w:vAlign w:val="center"/>
+          </w:tcPr>
+          <w:p>
+            <w:pPr>
+              <w:spacing w:before="0" w:after="0"/>
+              <w:jc w:val="center"/>
+            </w:pPr>
+            <w:r>
+              <w:rPr>
+                <w:rFonts w:ascii="Arial" w:hAnsi="Arial" w:eastAsia="MS PGothic"/>
+                <w:b w:val="0"/>
+                <w:sz w:val="19"/>
+              </w:rPr>
+              <w:t>(4)</w:t>
+            </w:r>
+          </w:p>
+        </w:tc>
+        <w:tc>
+          <w:tcPr>
+            <w:tcW w:type="dxa" w:w="4819"/>
+            <w:vAlign w:val="center"/>
+          </w:tcPr>
+          <w:p>
+            <w:pPr>
+              <w:spacing w:before="0" w:after="0"/>
+              <w:jc w:val="center"/>
+            </w:pPr>
+            <w:r>
+              <w:rPr>
+                <w:rFonts w:ascii="Arial" w:hAnsi="Arial" w:eastAsia="MS PGothic"/>
+                <w:b w:val="0"/>
+                <w:sz w:val="21"/>
+              </w:rPr>
+              <w:t>(　　　　)(　　　　)(　　　　)</w:t>
+            </w:r>
+          </w:p>
+        </w:tc>
+        <w:tc>
+          <w:tcPr>
+            <w:tcW w:type="dxa" w:w="454"/>
+            <w:vAlign w:val="center"/>
+          </w:tcPr>
+          <w:p>
+            <w:pPr>
+              <w:spacing w:before="0" w:after="0"/>
+              <w:jc w:val="center"/>
+            </w:pPr>
+            <w:r>
+              <w:rPr>
+                <w:rFonts w:ascii="Arial" w:hAnsi="Arial" w:eastAsia="MS PGothic"/>
+                <w:b w:val="0"/>
+                <w:sz w:val="19"/>
+              </w:rPr>
+              <w:t>(10)</w:t>
+            </w:r>
+          </w:p>
+        </w:tc>
+        <w:tc>
+          <w:tcPr>
+            <w:tcW w:type="dxa" w:w="4819"/>
+            <w:vAlign w:val="center"/>
+          </w:tcPr>
+          <w:p>
+            <w:pPr>
+              <w:spacing w:before="0" w:after="0"/>
+              <w:jc w:val="center"/>
+            </w:pPr>
+            <w:r>
+              <w:rPr>
+                <w:rFonts w:ascii="Arial" w:hAnsi="Arial" w:eastAsia="MS PGothic"/>
+                <w:b w:val="0"/>
+                <w:sz w:val="21"/>
+              </w:rPr>
+              <w:t>(　　　　　　　)(　　　　　　　)</w:t>
+            </w:r>
+          </w:p>
+        </w:tc>
+      </w:tr>
+      <w:tr>
+        <w:trPr>
+          <w:trHeight w:val="527" w:hRule="exact"/>
+        </w:trPr>
+        <w:tc>
+          <w:tcPr>
+            <w:tcW w:type="dxa" w:w="454"/>
+            <w:vAlign w:val="center"/>
+          </w:tcPr>
+          <w:p>
+            <w:pPr>
+              <w:spacing w:before="0" w:after="0"/>
+              <w:jc w:val="center"/>
+            </w:pPr>
+            <w:r>
+              <w:rPr>
+                <w:rFonts w:ascii="Arial" w:hAnsi="Arial" w:eastAsia="MS PGothic"/>
+                <w:b w:val="0"/>
+                <w:sz w:val="19"/>
+              </w:rPr>
+              <w:t>(5)</w:t>
+            </w:r>
+          </w:p>
+        </w:tc>
+        <w:tc>
+          <w:tcPr>
+            <w:tcW w:type="dxa" w:w="4819"/>
+            <w:vAlign w:val="center"/>
+          </w:tcPr>
+          <w:p>
+            <w:pPr>
+              <w:spacing w:before="0" w:after="0"/>
+              <w:jc w:val="center"/>
+            </w:pPr>
+            <w:r>
+              <w:rPr>
+                <w:rFonts w:ascii="Arial" w:hAnsi="Arial" w:eastAsia="MS PGothic"/>
+                <w:b w:val="0"/>
+                <w:sz w:val="21"/>
+              </w:rPr>
+              <w:t>(　　　　)(　　　　)(　　　　)</w:t>
+            </w:r>
+          </w:p>
+        </w:tc>
+        <w:tc>
+          <w:tcPr>
+            <w:tcW w:type="dxa" w:w="454"/>
+            <w:vAlign w:val="center"/>
+          </w:tcPr>
+          <w:p>
+            <w:pPr>
+              <w:spacing w:before="0" w:after="0"/>
+              <w:jc w:val="center"/>
+            </w:pPr>
+            <w:r>
+              <w:rPr>
+                <w:rFonts w:ascii="Arial" w:hAnsi="Arial" w:eastAsia="MS PGothic"/>
+                <w:b w:val="0"/>
+                <w:sz w:val="19"/>
+              </w:rPr>
+              <w:t>(11)</w:t>
+            </w:r>
+          </w:p>
+        </w:tc>
+        <w:tc>
+          <w:tcPr>
+            <w:tcW w:type="dxa" w:w="4819"/>
+            <w:vAlign w:val="center"/>
+          </w:tcPr>
+          <w:p>
+            <w:pPr>
+              <w:spacing w:before="0" w:after="0"/>
+              <w:jc w:val="center"/>
+            </w:pPr>
+            <w:r>
+              <w:rPr>
+                <w:rFonts w:ascii="Arial" w:hAnsi="Arial" w:eastAsia="MS PGothic"/>
+                <w:b w:val="0"/>
+                <w:sz w:val="21"/>
+              </w:rPr>
+              <w:t>(　　　　　　　)(　　　　　　　)</w:t>
+            </w:r>
+          </w:p>
+        </w:tc>
+      </w:tr>
+      <w:tr>
+        <w:trPr>
+          <w:trHeight w:val="527" w:hRule="exact"/>
+        </w:trPr>
+        <w:tc>
+          <w:tcPr>
+            <w:tcW w:type="dxa" w:w="454"/>
+            <w:vAlign w:val="center"/>
+          </w:tcPr>
+          <w:p>
+            <w:pPr>
+              <w:spacing w:before="0" w:after="0"/>
+              <w:jc w:val="center"/>
+            </w:pPr>
+            <w:r>
+              <w:rPr>
+                <w:rFonts w:ascii="Arial" w:hAnsi="Arial" w:eastAsia="MS PGothic"/>
+                <w:b w:val="0"/>
+                <w:sz w:val="19"/>
+              </w:rPr>
+              <w:t>(6)</w:t>
+            </w:r>
+          </w:p>
+        </w:tc>
+        <w:tc>
+          <w:tcPr>
+            <w:tcW w:type="dxa" w:w="4819"/>
+            <w:vAlign w:val="center"/>
+          </w:tcPr>
+          <w:p>
+            <w:pPr>
+              <w:spacing w:before="0" w:after="0"/>
+              <w:jc w:val="center"/>
+            </w:pPr>
+            <w:r>
+              <w:rPr>
+                <w:rFonts w:ascii="Arial" w:hAnsi="Arial" w:eastAsia="MS PGothic"/>
+                <w:b w:val="0"/>
+                <w:sz w:val="21"/>
+              </w:rPr>
+              <w:t>(　　　　)(　　　　)(　　　　)</w:t>
+            </w:r>
+          </w:p>
+        </w:tc>
+        <w:tc>
+          <w:tcPr>
+            <w:tcW w:type="dxa" w:w="454"/>
+            <w:vAlign w:val="center"/>
+          </w:tcPr>
+          <w:p>
+            <w:pPr>
+              <w:spacing w:before="0" w:after="0"/>
+              <w:jc w:val="center"/>
+            </w:pPr>
+            <w:r>
+              <w:rPr>
+                <w:rFonts w:ascii="Arial" w:hAnsi="Arial" w:eastAsia="MS PGothic"/>
+                <w:b w:val="0"/>
                 <w:sz w:val="19"/>
               </w:rPr>
               <w:t>(12)</w:t>
@@ -1895,13 +1910,13 @@
         </w:tc>
         <w:tc>
           <w:tcPr>
-            <w:tcW w:type="dxa" w:w="1247"/>
+            <w:tcW w:type="dxa" w:w="4819"/>
             <w:vAlign w:val="center"/>
           </w:tcPr>
           <w:p>
             <w:pPr>
               <w:spacing w:before="0" w:after="0"/>
-              <w:jc w:val="left"/>
+              <w:jc w:val="center"/>
             </w:pPr>
             <w:r>
               <w:rPr>
@@ -1909,36 +1924,9 @@
                 <w:b w:val="0"/>
                 <w:sz w:val="21"/>
               </w:rPr>
+              <w:t>(　　　　　　　　　　　　　　　　)</w:t>
             </w:r>
           </w:p>
-        </w:tc>
-        <w:tc>
-          <w:tcPr>
-            <w:tcW w:type="dxa" w:w="1247"/>
-            <w:tcBorders>
-              <w:top w:val="none" w:sz="0" w:space="0" w:color="auto"/>
-              <w:left w:val="none" w:sz="0" w:space="0" w:color="auto"/>
-              <w:bottom w:val="none" w:sz="0" w:space="0" w:color="auto"/>
-              <w:right w:val="none" w:sz="0" w:space="0" w:color="auto"/>
-              <w:insideH w:val="none" w:sz="0" w:space="0" w:color="auto"/>
-              <w:insideV w:val="none" w:sz="0" w:space="0" w:color="auto"/>
-            </w:tcBorders>
-          </w:tcPr>
-          <w:p/>
-        </w:tc>
-        <w:tc>
-          <w:tcPr>
-            <w:tcW w:type="dxa" w:w="1247"/>
-            <w:tcBorders>
-              <w:top w:val="none" w:sz="0" w:space="0" w:color="auto"/>
-              <w:left w:val="none" w:sz="0" w:space="0" w:color="auto"/>
-              <w:bottom w:val="none" w:sz="0" w:space="0" w:color="auto"/>
-              <w:right w:val="none" w:sz="0" w:space="0" w:color="auto"/>
-              <w:insideH w:val="none" w:sz="0" w:space="0" w:color="auto"/>
-              <w:insideV w:val="none" w:sz="0" w:space="0" w:color="auto"/>
-            </w:tcBorders>
-          </w:tcPr>
-          <w:p/>
         </w:tc>
       </w:tr>
     </w:tbl>
@@ -1953,7 +1941,7 @@
           <w:b w:val="0"/>
           <w:sz w:val="19"/>
         </w:rPr>
-        <w:t>C（1×6=6点）</w:t>
+        <w:t>C（1×6=6点）　動詞を正しい形に変えよ</w:t>
       </w:r>
     </w:p>
     <w:tbl>
@@ -2547,7 +2535,7 @@
     </w:tbl>
     <w:p>
       <w:pPr>
-        <w:spacing w:before="80" w:after="40"/>
+        <w:spacing w:before="60" w:after="40"/>
         <w:jc w:val="left"/>
       </w:pPr>
       <w:r>
@@ -2933,7 +2921,7 @@
     </w:tbl>
     <w:p>
       <w:pPr>
-        <w:spacing w:before="100" w:after="40"/>
+        <w:spacing w:before="80" w:after="40"/>
         <w:jc w:val="left"/>
       </w:pPr>
       <w:r>
@@ -3102,7 +3090,7 @@
     </w:tbl>
     <w:p>
       <w:pPr>
-        <w:spacing w:before="100" w:after="20"/>
+        <w:spacing w:before="80" w:after="20"/>
         <w:jc w:val="left"/>
       </w:pPr>
       <w:r>

</xml_diff>

<commit_message>
Fix 2-page overflow: enforce exact line spacing on all paragraphs
- Apply WD_LINE_SPACING.EXACTLY to every paragraph so Word cannot
  expand line height beyond the specified value
- Set Normal style space_before/after to 0 to prevent style inheritance
- Tune all before/after/line values so each page fits within 27.3 cm:
  Page 1: 25.09 cm  Page 2: 25.98 cm  (verified from generated XML)
- Reduce compact row heights (0.78 cm) and writing rows (0.80-0.85 cm)

https://claude.ai/code/session_01H92aASVAdh5CWUTRq4hYds
</commit_message>
<xml_diff>
--- a/2026年度_論理表現Ⅱ_中間テスト_解答用紙.docx
+++ b/2026年度_論理表現Ⅱ_中間テスト_解答用紙.docx
@@ -4,7 +4,7 @@
   <w:body>
     <w:p>
       <w:pPr>
-        <w:spacing w:before="0" w:after="60"/>
+        <w:spacing w:before="0" w:after="60" w:lineRule="exact" w:line="280"/>
         <w:jc w:val="center"/>
       </w:pPr>
       <w:r>
@@ -31,7 +31,7 @@
       </w:tblGrid>
       <w:tr>
         <w:trPr>
-          <w:trHeight w:val="408" w:hRule="atLeast"/>
+          <w:trHeight w:val="408" w:hRule="exact"/>
         </w:trPr>
         <w:tc>
           <w:tcPr>
@@ -88,7 +88,7 @@
       </w:tr>
       <w:tr>
         <w:trPr>
-          <w:trHeight w:val="408" w:hRule="atLeast"/>
+          <w:trHeight w:val="408" w:hRule="exact"/>
         </w:trPr>
         <w:tc>
           <w:tcPr>
@@ -121,7 +121,7 @@
     </w:tbl>
     <w:p>
       <w:pPr>
-        <w:spacing w:before="120" w:after="40"/>
+        <w:spacing w:before="100" w:after="40" w:lineRule="exact" w:line="260"/>
         <w:jc w:val="left"/>
       </w:pPr>
       <w:r>
@@ -148,7 +148,7 @@
       </w:tblGrid>
       <w:tr>
         <w:trPr>
-          <w:trHeight w:val="476" w:hRule="exact"/>
+          <w:trHeight w:val="442" w:hRule="exact"/>
         </w:trPr>
         <w:tc>
           <w:tcPr>
@@ -206,7 +206,7 @@
     </w:tbl>
     <w:p>
       <w:pPr>
-        <w:spacing w:before="60" w:after="20"/>
+        <w:spacing w:before="40" w:after="0" w:lineRule="exact" w:line="240"/>
         <w:jc w:val="left"/>
       </w:pPr>
       <w:r>
@@ -234,7 +234,7 @@
       </w:tblGrid>
       <w:tr>
         <w:trPr>
-          <w:trHeight w:val="476" w:hRule="exact"/>
+          <w:trHeight w:val="442" w:hRule="exact"/>
         </w:trPr>
         <w:tc>
           <w:tcPr>
@@ -340,7 +340,7 @@
     </w:tbl>
     <w:p>
       <w:pPr>
-        <w:spacing w:before="100" w:after="40"/>
+        <w:spacing w:before="80" w:after="40" w:lineRule="exact" w:line="260"/>
         <w:jc w:val="left"/>
       </w:pPr>
       <w:r>
@@ -354,7 +354,7 @@
     </w:p>
     <w:p>
       <w:pPr>
-        <w:spacing w:before="40" w:after="20"/>
+        <w:spacing w:before="40" w:after="0" w:lineRule="exact" w:line="240"/>
         <w:jc w:val="left"/>
       </w:pPr>
       <w:r>
@@ -382,7 +382,7 @@
       </w:tblGrid>
       <w:tr>
         <w:trPr>
-          <w:trHeight w:val="476" w:hRule="exact"/>
+          <w:trHeight w:val="425" w:hRule="exact"/>
         </w:trPr>
         <w:tc>
           <w:tcPr>
@@ -487,7 +487,7 @@
       </w:tr>
       <w:tr>
         <w:trPr>
-          <w:trHeight w:val="476" w:hRule="exact"/>
+          <w:trHeight w:val="425" w:hRule="exact"/>
         </w:trPr>
         <w:tc>
           <w:tcPr>
@@ -593,7 +593,7 @@
     </w:tbl>
     <w:p>
       <w:pPr>
-        <w:spacing w:before="60" w:after="20"/>
+        <w:spacing w:before="40" w:after="0" w:lineRule="exact" w:line="240"/>
         <w:jc w:val="left"/>
       </w:pPr>
       <w:r>
@@ -621,7 +621,7 @@
       </w:tblGrid>
       <w:tr>
         <w:trPr>
-          <w:trHeight w:val="476" w:hRule="exact"/>
+          <w:trHeight w:val="425" w:hRule="exact"/>
         </w:trPr>
         <w:tc>
           <w:tcPr>
@@ -727,7 +727,7 @@
     </w:tbl>
     <w:p>
       <w:pPr>
-        <w:spacing w:before="100" w:after="40"/>
+        <w:spacing w:before="80" w:after="40" w:lineRule="exact" w:line="260"/>
         <w:jc w:val="left"/>
       </w:pPr>
       <w:r>
@@ -741,7 +741,7 @@
     </w:p>
     <w:p>
       <w:pPr>
-        <w:spacing w:before="40" w:after="20"/>
+        <w:spacing w:before="40" w:after="0" w:lineRule="exact" w:line="240"/>
         <w:jc w:val="left"/>
       </w:pPr>
       <w:r>
@@ -766,7 +766,7 @@
       </w:tblGrid>
       <w:tr>
         <w:trPr>
-          <w:trHeight w:val="481" w:hRule="exact"/>
+          <w:trHeight w:val="464" w:hRule="exact"/>
         </w:trPr>
         <w:tc>
           <w:tcPr>
@@ -828,7 +828,7 @@
       </w:tr>
       <w:tr>
         <w:trPr>
-          <w:trHeight w:val="481" w:hRule="exact"/>
+          <w:trHeight w:val="464" w:hRule="exact"/>
         </w:trPr>
         <w:tc>
           <w:tcPr>
@@ -890,7 +890,7 @@
       </w:tr>
       <w:tr>
         <w:trPr>
-          <w:trHeight w:val="481" w:hRule="exact"/>
+          <w:trHeight w:val="464" w:hRule="exact"/>
         </w:trPr>
         <w:tc>
           <w:tcPr>
@@ -953,7 +953,7 @@
       </w:tr>
       <w:tr>
         <w:trPr>
-          <w:trHeight w:val="481" w:hRule="exact"/>
+          <w:trHeight w:val="464" w:hRule="exact"/>
         </w:trPr>
         <w:tc>
           <w:tcPr>
@@ -1016,7 +1016,7 @@
       </w:tr>
       <w:tr>
         <w:trPr>
-          <w:trHeight w:val="481" w:hRule="exact"/>
+          <w:trHeight w:val="464" w:hRule="exact"/>
         </w:trPr>
         <w:tc>
           <w:tcPr>
@@ -1078,7 +1078,7 @@
       </w:tr>
       <w:tr>
         <w:trPr>
-          <w:trHeight w:val="481" w:hRule="exact"/>
+          <w:trHeight w:val="464" w:hRule="exact"/>
         </w:trPr>
         <w:tc>
           <w:tcPr>
@@ -1141,7 +1141,7 @@
       </w:tr>
       <w:tr>
         <w:trPr>
-          <w:trHeight w:val="481" w:hRule="exact"/>
+          <w:trHeight w:val="464" w:hRule="exact"/>
         </w:trPr>
         <w:tc>
           <w:tcPr>
@@ -1204,7 +1204,7 @@
       </w:tr>
       <w:tr>
         <w:trPr>
-          <w:trHeight w:val="481" w:hRule="exact"/>
+          <w:trHeight w:val="464" w:hRule="exact"/>
         </w:trPr>
         <w:tc>
           <w:tcPr>
@@ -1267,7 +1267,7 @@
       </w:tr>
       <w:tr>
         <w:trPr>
-          <w:trHeight w:val="481" w:hRule="exact"/>
+          <w:trHeight w:val="464" w:hRule="exact"/>
         </w:trPr>
         <w:tc>
           <w:tcPr>
@@ -1330,7 +1330,7 @@
       </w:tr>
       <w:tr>
         <w:trPr>
-          <w:trHeight w:val="481" w:hRule="exact"/>
+          <w:trHeight w:val="464" w:hRule="exact"/>
         </w:trPr>
         <w:tc>
           <w:tcPr>
@@ -1394,7 +1394,7 @@
     </w:tbl>
     <w:p>
       <w:pPr>
-        <w:spacing w:before="60" w:after="20"/>
+        <w:spacing w:before="40" w:after="0" w:lineRule="exact" w:line="240"/>
         <w:jc w:val="left"/>
       </w:pPr>
       <w:r>
@@ -1421,7 +1421,7 @@
       </w:tblGrid>
       <w:tr>
         <w:trPr>
-          <w:trHeight w:val="527" w:hRule="exact"/>
+          <w:trHeight w:val="498" w:hRule="exact"/>
         </w:trPr>
         <w:tc>
           <w:tcPr>
@@ -1506,7 +1506,7 @@
       </w:tr>
       <w:tr>
         <w:trPr>
-          <w:trHeight w:val="527" w:hRule="exact"/>
+          <w:trHeight w:val="498" w:hRule="exact"/>
         </w:trPr>
         <w:tc>
           <w:tcPr>
@@ -1591,7 +1591,7 @@
       </w:tr>
       <w:tr>
         <w:trPr>
-          <w:trHeight w:val="527" w:hRule="exact"/>
+          <w:trHeight w:val="498" w:hRule="exact"/>
         </w:trPr>
         <w:tc>
           <w:tcPr>
@@ -1676,7 +1676,7 @@
       </w:tr>
       <w:tr>
         <w:trPr>
-          <w:trHeight w:val="527" w:hRule="exact"/>
+          <w:trHeight w:val="498" w:hRule="exact"/>
         </w:trPr>
         <w:tc>
           <w:tcPr>
@@ -1761,7 +1761,7 @@
       </w:tr>
       <w:tr>
         <w:trPr>
-          <w:trHeight w:val="527" w:hRule="exact"/>
+          <w:trHeight w:val="498" w:hRule="exact"/>
         </w:trPr>
         <w:tc>
           <w:tcPr>
@@ -1846,7 +1846,7 @@
       </w:tr>
       <w:tr>
         <w:trPr>
-          <w:trHeight w:val="527" w:hRule="exact"/>
+          <w:trHeight w:val="498" w:hRule="exact"/>
         </w:trPr>
         <w:tc>
           <w:tcPr>
@@ -1932,7 +1932,7 @@
     </w:tbl>
     <w:p>
       <w:pPr>
-        <w:spacing w:before="60" w:after="20"/>
+        <w:spacing w:before="40" w:after="0" w:lineRule="exact" w:line="240"/>
         <w:jc w:val="left"/>
       </w:pPr>
       <w:r>
@@ -1961,7 +1961,7 @@
       </w:tblGrid>
       <w:tr>
         <w:trPr>
-          <w:trHeight w:val="476" w:hRule="exact"/>
+          <w:trHeight w:val="442" w:hRule="exact"/>
         </w:trPr>
         <w:tc>
           <w:tcPr>
@@ -2087,7 +2087,7 @@
     </w:tbl>
     <w:p>
       <w:pPr>
-        <w:spacing w:before="0" w:after="0"/>
+        <w:spacing w:before="0" w:after="0" w:lineRule="exact" w:line="20"/>
       </w:pPr>
       <w:r>
         <w:br w:type="page"/>
@@ -2095,7 +2095,7 @@
     </w:p>
     <w:p>
       <w:pPr>
-        <w:spacing w:before="0" w:after="40"/>
+        <w:spacing w:before="0" w:after="40" w:lineRule="exact" w:line="260"/>
         <w:jc w:val="left"/>
       </w:pPr>
       <w:r>
@@ -2119,7 +2119,7 @@
       </w:tblGrid>
       <w:tr>
         <w:trPr>
-          <w:trHeight w:val="510" w:hRule="exact"/>
+          <w:trHeight w:val="481" w:hRule="exact"/>
         </w:trPr>
         <w:tc>
           <w:tcPr>
@@ -2144,7 +2144,7 @@
       </w:tr>
       <w:tr>
         <w:trPr>
-          <w:trHeight w:val="510" w:hRule="exact"/>
+          <w:trHeight w:val="481" w:hRule="exact"/>
         </w:trPr>
         <w:tc>
           <w:tcPr>
@@ -2169,7 +2169,7 @@
       </w:tr>
       <w:tr>
         <w:trPr>
-          <w:trHeight w:val="510" w:hRule="exact"/>
+          <w:trHeight w:val="481" w:hRule="exact"/>
         </w:trPr>
         <w:tc>
           <w:tcPr>
@@ -2194,7 +2194,7 @@
       </w:tr>
       <w:tr>
         <w:trPr>
-          <w:trHeight w:val="510" w:hRule="exact"/>
+          <w:trHeight w:val="481" w:hRule="exact"/>
         </w:trPr>
         <w:tc>
           <w:tcPr>
@@ -2219,7 +2219,7 @@
       </w:tr>
       <w:tr>
         <w:trPr>
-          <w:trHeight w:val="510" w:hRule="exact"/>
+          <w:trHeight w:val="481" w:hRule="exact"/>
         </w:trPr>
         <w:tc>
           <w:tcPr>
@@ -2244,7 +2244,7 @@
       </w:tr>
       <w:tr>
         <w:trPr>
-          <w:trHeight w:val="510" w:hRule="exact"/>
+          <w:trHeight w:val="481" w:hRule="exact"/>
         </w:trPr>
         <w:tc>
           <w:tcPr>
@@ -2270,7 +2270,7 @@
     </w:tbl>
     <w:p>
       <w:pPr>
-        <w:spacing w:before="80" w:after="40"/>
+        <w:spacing w:before="80" w:after="40" w:lineRule="exact" w:line="260"/>
         <w:jc w:val="left"/>
       </w:pPr>
       <w:r>
@@ -2284,7 +2284,7 @@
     </w:p>
     <w:p>
       <w:pPr>
-        <w:spacing w:before="20" w:after="20"/>
+        <w:spacing w:before="20" w:after="0" w:lineRule="exact" w:line="240"/>
         <w:jc w:val="left"/>
       </w:pPr>
       <w:r>
@@ -2293,7 +2293,7 @@
           <w:b w:val="0"/>
           <w:sz w:val="19"/>
         </w:rPr>
-        <w:t>A（1×5=5点）　　　　　　　　　　　　　B（1×5=5点）</w:t>
+        <w:t>A（1×5=5点）　　　　　　　　　　　　　　B（1×5=5点）</w:t>
       </w:r>
     </w:p>
     <w:tbl>
@@ -2309,7 +2309,7 @@
       </w:tblGrid>
       <w:tr>
         <w:trPr>
-          <w:trHeight w:val="476" w:hRule="exact"/>
+          <w:trHeight w:val="453" w:hRule="exact"/>
         </w:trPr>
         <w:tc>
           <w:tcPr>
@@ -2354,7 +2354,7 @@
       </w:tr>
       <w:tr>
         <w:trPr>
-          <w:trHeight w:val="476" w:hRule="exact"/>
+          <w:trHeight w:val="453" w:hRule="exact"/>
         </w:trPr>
         <w:tc>
           <w:tcPr>
@@ -2399,7 +2399,7 @@
       </w:tr>
       <w:tr>
         <w:trPr>
-          <w:trHeight w:val="476" w:hRule="exact"/>
+          <w:trHeight w:val="453" w:hRule="exact"/>
         </w:trPr>
         <w:tc>
           <w:tcPr>
@@ -2444,7 +2444,7 @@
       </w:tr>
       <w:tr>
         <w:trPr>
-          <w:trHeight w:val="476" w:hRule="exact"/>
+          <w:trHeight w:val="453" w:hRule="exact"/>
         </w:trPr>
         <w:tc>
           <w:tcPr>
@@ -2489,7 +2489,7 @@
       </w:tr>
       <w:tr>
         <w:trPr>
-          <w:trHeight w:val="476" w:hRule="exact"/>
+          <w:trHeight w:val="453" w:hRule="exact"/>
         </w:trPr>
         <w:tc>
           <w:tcPr>
@@ -2535,7 +2535,7 @@
     </w:tbl>
     <w:p>
       <w:pPr>
-        <w:spacing w:before="60" w:after="40"/>
+        <w:spacing w:before="60" w:after="40" w:lineRule="exact" w:line="260"/>
         <w:jc w:val="left"/>
       </w:pPr>
       <w:r>
@@ -2549,7 +2549,7 @@
     </w:p>
     <w:p>
       <w:pPr>
-        <w:spacing w:before="40" w:after="20"/>
+        <w:spacing w:before="40" w:after="0" w:lineRule="exact" w:line="240"/>
         <w:jc w:val="left"/>
       </w:pPr>
       <w:r>
@@ -2575,7 +2575,7 @@
       </w:tblGrid>
       <w:tr>
         <w:trPr>
-          <w:trHeight w:val="476" w:hRule="exact"/>
+          <w:trHeight w:val="442" w:hRule="exact"/>
         </w:trPr>
         <w:tc>
           <w:tcPr>
@@ -2641,7 +2641,7 @@
     </w:tbl>
     <w:p>
       <w:pPr>
-        <w:spacing w:before="60" w:after="20"/>
+        <w:spacing w:before="40" w:after="0" w:lineRule="exact" w:line="240"/>
         <w:jc w:val="left"/>
       </w:pPr>
       <w:r>
@@ -2669,7 +2669,7 @@
       </w:tblGrid>
       <w:tr>
         <w:trPr>
-          <w:trHeight w:val="476" w:hRule="exact"/>
+          <w:trHeight w:val="442" w:hRule="exact"/>
         </w:trPr>
         <w:tc>
           <w:tcPr>
@@ -2775,7 +2775,7 @@
     </w:tbl>
     <w:p>
       <w:pPr>
-        <w:spacing w:before="60" w:after="20"/>
+        <w:spacing w:before="40" w:after="0" w:lineRule="exact" w:line="240"/>
         <w:jc w:val="left"/>
       </w:pPr>
       <w:r>
@@ -2799,7 +2799,7 @@
       </w:tblGrid>
       <w:tr>
         <w:trPr>
-          <w:trHeight w:val="498" w:hRule="exact"/>
+          <w:trHeight w:val="481" w:hRule="exact"/>
         </w:trPr>
         <w:tc>
           <w:tcPr>
@@ -2823,7 +2823,7 @@
       </w:tr>
       <w:tr>
         <w:trPr>
-          <w:trHeight w:val="498" w:hRule="exact"/>
+          <w:trHeight w:val="481" w:hRule="exact"/>
         </w:trPr>
         <w:tc>
           <w:tcPr>
@@ -2848,7 +2848,7 @@
     </w:tbl>
     <w:p>
       <w:pPr>
-        <w:spacing w:before="60" w:after="20"/>
+        <w:spacing w:before="40" w:after="0" w:lineRule="exact" w:line="240"/>
         <w:jc w:val="left"/>
       </w:pPr>
       <w:r>
@@ -2872,7 +2872,7 @@
       </w:tblGrid>
       <w:tr>
         <w:trPr>
-          <w:trHeight w:val="498" w:hRule="exact"/>
+          <w:trHeight w:val="481" w:hRule="exact"/>
         </w:trPr>
         <w:tc>
           <w:tcPr>
@@ -2896,7 +2896,7 @@
       </w:tr>
       <w:tr>
         <w:trPr>
-          <w:trHeight w:val="498" w:hRule="exact"/>
+          <w:trHeight w:val="481" w:hRule="exact"/>
         </w:trPr>
         <w:tc>
           <w:tcPr>
@@ -2921,7 +2921,7 @@
     </w:tbl>
     <w:p>
       <w:pPr>
-        <w:spacing w:before="80" w:after="40"/>
+        <w:spacing w:before="60" w:after="40" w:lineRule="exact" w:line="260"/>
         <w:jc w:val="left"/>
       </w:pPr>
       <w:r>
@@ -2945,7 +2945,7 @@
       </w:tblGrid>
       <w:tr>
         <w:trPr>
-          <w:trHeight w:val="470" w:hRule="exact"/>
+          <w:trHeight w:val="442" w:hRule="exact"/>
         </w:trPr>
         <w:tc>
           <w:tcPr>
@@ -2969,7 +2969,7 @@
       </w:tr>
       <w:tr>
         <w:trPr>
-          <w:trHeight w:val="470" w:hRule="exact"/>
+          <w:trHeight w:val="442" w:hRule="exact"/>
         </w:trPr>
         <w:tc>
           <w:tcPr>
@@ -2993,7 +2993,7 @@
       </w:tr>
       <w:tr>
         <w:trPr>
-          <w:trHeight w:val="470" w:hRule="exact"/>
+          <w:trHeight w:val="442" w:hRule="exact"/>
         </w:trPr>
         <w:tc>
           <w:tcPr>
@@ -3017,7 +3017,7 @@
       </w:tr>
       <w:tr>
         <w:trPr>
-          <w:trHeight w:val="470" w:hRule="exact"/>
+          <w:trHeight w:val="442" w:hRule="exact"/>
         </w:trPr>
         <w:tc>
           <w:tcPr>
@@ -3041,7 +3041,7 @@
       </w:tr>
       <w:tr>
         <w:trPr>
-          <w:trHeight w:val="470" w:hRule="exact"/>
+          <w:trHeight w:val="442" w:hRule="exact"/>
         </w:trPr>
         <w:tc>
           <w:tcPr>
@@ -3065,7 +3065,7 @@
       </w:tr>
       <w:tr>
         <w:trPr>
-          <w:trHeight w:val="470" w:hRule="exact"/>
+          <w:trHeight w:val="442" w:hRule="exact"/>
         </w:trPr>
         <w:tc>
           <w:tcPr>
@@ -3090,7 +3090,7 @@
     </w:tbl>
     <w:p>
       <w:pPr>
-        <w:spacing w:before="80" w:after="20"/>
+        <w:spacing w:before="60" w:after="20" w:lineRule="exact" w:line="260"/>
         <w:jc w:val="left"/>
       </w:pPr>
       <w:r>
@@ -3116,7 +3116,7 @@
       </w:tblGrid>
       <w:tr>
         <w:trPr>
-          <w:trHeight w:val="340" w:hRule="exact"/>
+          <w:trHeight w:val="328" w:hRule="exact"/>
         </w:trPr>
         <w:tc>
           <w:tcPr>
@@ -3181,7 +3181,7 @@
       </w:tr>
       <w:tr>
         <w:trPr>
-          <w:trHeight w:val="680" w:hRule="exact"/>
+          <w:trHeight w:val="652" w:hRule="exact"/>
         </w:trPr>
         <w:tc>
           <w:tcPr>
@@ -3615,6 +3615,9 @@
     <w:name w:val="Normal"/>
     <w:qFormat/>
     <w:rsid w:val="00FC693F"/>
+    <w:pPr>
+      <w:spacing w:before="0" w:after="0"/>
+    </w:pPr>
   </w:style>
   <w:style w:type="paragraph" w:styleId="Header">
     <w:name w:val="header"/>

</xml_diff>

<commit_message>
Add v6 answer sheet for revised exam (3-page layout)
Revised exam changes applied:
- §3A Q2/Q10 updated sentences
- §3B expanded to 13 questions (B3B=[1,2,2,3,3,3,1,2,2,2,2,1,1])
- §4 updated to 18pts (3×6 questions)
- §5 restructured to 2×3 questions (2pts each, 12pts total)
- §6 reorganised to 10pts (Q1/Q2/Q4 combined row, Q3+Q5 writing)
- Total updated to 104pts

Page layout (XML-verified heights):
- Page 1: §1+§2+§3A — 27.013cm (§3A rows 1.6cm generous)
- Page 2: §3B+§3C+§4+§5+§6+score — 26.468cm
- Page 3: §7 essay only — 25.870cm (16 rows × 1.5cm)

https://claude.ai/code/session_01H92aASVAdh5CWUTRq4hYds
</commit_message>
<xml_diff>
--- a/2026年度_論理表現Ⅱ_中間テスト_解答用紙.docx
+++ b/2026年度_論理表現Ⅱ_中間テスト_解答用紙.docx
@@ -148,7 +148,7 @@
       </w:tblGrid>
       <w:tr>
         <w:trPr>
-          <w:trHeight w:val="442" w:hRule="exact"/>
+          <w:trHeight w:val="567" w:hRule="exact"/>
         </w:trPr>
         <w:tc>
           <w:tcPr>
@@ -234,7 +234,7 @@
       </w:tblGrid>
       <w:tr>
         <w:trPr>
-          <w:trHeight w:val="442" w:hRule="exact"/>
+          <w:trHeight w:val="680" w:hRule="exact"/>
         </w:trPr>
         <w:tc>
           <w:tcPr>
@@ -382,7 +382,7 @@
       </w:tblGrid>
       <w:tr>
         <w:trPr>
-          <w:trHeight w:val="425" w:hRule="exact"/>
+          <w:trHeight w:val="498" w:hRule="exact"/>
         </w:trPr>
         <w:tc>
           <w:tcPr>
@@ -487,7 +487,7 @@
       </w:tr>
       <w:tr>
         <w:trPr>
-          <w:trHeight w:val="425" w:hRule="exact"/>
+          <w:trHeight w:val="498" w:hRule="exact"/>
         </w:trPr>
         <w:tc>
           <w:tcPr>
@@ -621,7 +621,7 @@
       </w:tblGrid>
       <w:tr>
         <w:trPr>
-          <w:trHeight w:val="425" w:hRule="exact"/>
+          <w:trHeight w:val="567" w:hRule="exact"/>
         </w:trPr>
         <w:tc>
           <w:tcPr>
@@ -736,7 +736,7 @@
           <w:b/>
           <w:sz w:val="21"/>
         </w:rPr>
-        <w:t>３　（知識・技能　28点）</w:t>
+        <w:t>３　（知識・技能　29点）</w:t>
       </w:r>
     </w:p>
     <w:p>
@@ -766,7 +766,7 @@
       </w:tblGrid>
       <w:tr>
         <w:trPr>
-          <w:trHeight w:val="464" w:hRule="exact"/>
+          <w:trHeight w:val="907" w:hRule="exact"/>
         </w:trPr>
         <w:tc>
           <w:tcPr>
@@ -808,11 +808,6 @@
               </w:rPr>
             </w:r>
             <w:r>
-              <w:rPr>
-                <w:rFonts w:ascii="Arial" w:hAnsi="Arial" w:eastAsia="MS PGothic"/>
-                <w:b w:val="0"/>
-                <w:sz w:val="21"/>
-              </w:rPr>
               <w:tab/>
             </w:r>
             <w:r>
@@ -828,7 +823,7 @@
       </w:tr>
       <w:tr>
         <w:trPr>
-          <w:trHeight w:val="464" w:hRule="exact"/>
+          <w:trHeight w:val="907" w:hRule="exact"/>
         </w:trPr>
         <w:tc>
           <w:tcPr>
@@ -870,11 +865,6 @@
               </w:rPr>
             </w:r>
             <w:r>
-              <w:rPr>
-                <w:rFonts w:ascii="Arial" w:hAnsi="Arial" w:eastAsia="MS PGothic"/>
-                <w:b w:val="0"/>
-                <w:sz w:val="21"/>
-              </w:rPr>
               <w:tab/>
             </w:r>
             <w:r>
@@ -883,14 +873,14 @@
                 <w:b w:val="0"/>
                 <w:sz w:val="21"/>
               </w:rPr>
-              <w:t>in the world.</w:t>
+              <w:t>.</w:t>
             </w:r>
           </w:p>
         </w:tc>
       </w:tr>
       <w:tr>
         <w:trPr>
-          <w:trHeight w:val="464" w:hRule="exact"/>
+          <w:trHeight w:val="907" w:hRule="exact"/>
         </w:trPr>
         <w:tc>
           <w:tcPr>
@@ -933,11 +923,6 @@
               <w:t xml:space="preserve">It  </w:t>
             </w:r>
             <w:r>
-              <w:rPr>
-                <w:rFonts w:ascii="Arial" w:hAnsi="Arial" w:eastAsia="MS PGothic"/>
-                <w:b w:val="0"/>
-                <w:sz w:val="21"/>
-              </w:rPr>
               <w:tab/>
             </w:r>
             <w:r>
@@ -953,7 +938,7 @@
       </w:tr>
       <w:tr>
         <w:trPr>
-          <w:trHeight w:val="464" w:hRule="exact"/>
+          <w:trHeight w:val="907" w:hRule="exact"/>
         </w:trPr>
         <w:tc>
           <w:tcPr>
@@ -996,11 +981,6 @@
               <w:t xml:space="preserve">It is  </w:t>
             </w:r>
             <w:r>
-              <w:rPr>
-                <w:rFonts w:ascii="Arial" w:hAnsi="Arial" w:eastAsia="MS PGothic"/>
-                <w:b w:val="0"/>
-                <w:sz w:val="21"/>
-              </w:rPr>
               <w:tab/>
             </w:r>
             <w:r>
@@ -1016,7 +996,7 @@
       </w:tr>
       <w:tr>
         <w:trPr>
-          <w:trHeight w:val="464" w:hRule="exact"/>
+          <w:trHeight w:val="907" w:hRule="exact"/>
         </w:trPr>
         <w:tc>
           <w:tcPr>
@@ -1058,11 +1038,6 @@
               </w:rPr>
             </w:r>
             <w:r>
-              <w:rPr>
-                <w:rFonts w:ascii="Arial" w:hAnsi="Arial" w:eastAsia="MS PGothic"/>
-                <w:b w:val="0"/>
-                <w:sz w:val="21"/>
-              </w:rPr>
               <w:tab/>
             </w:r>
             <w:r>
@@ -1078,7 +1053,7 @@
       </w:tr>
       <w:tr>
         <w:trPr>
-          <w:trHeight w:val="464" w:hRule="exact"/>
+          <w:trHeight w:val="907" w:hRule="exact"/>
         </w:trPr>
         <w:tc>
           <w:tcPr>
@@ -1121,11 +1096,6 @@
               <w:t xml:space="preserve">The author  </w:t>
             </w:r>
             <w:r>
-              <w:rPr>
-                <w:rFonts w:ascii="Arial" w:hAnsi="Arial" w:eastAsia="MS PGothic"/>
-                <w:b w:val="0"/>
-                <w:sz w:val="21"/>
-              </w:rPr>
               <w:tab/>
             </w:r>
             <w:r>
@@ -1141,7 +1111,7 @@
       </w:tr>
       <w:tr>
         <w:trPr>
-          <w:trHeight w:val="464" w:hRule="exact"/>
+          <w:trHeight w:val="907" w:hRule="exact"/>
         </w:trPr>
         <w:tc>
           <w:tcPr>
@@ -1184,11 +1154,6 @@
               <w:t xml:space="preserve">It was quite frightening, but  </w:t>
             </w:r>
             <w:r>
-              <w:rPr>
-                <w:rFonts w:ascii="Arial" w:hAnsi="Arial" w:eastAsia="MS PGothic"/>
-                <w:b w:val="0"/>
-                <w:sz w:val="21"/>
-              </w:rPr>
               <w:tab/>
             </w:r>
             <w:r>
@@ -1204,7 +1169,7 @@
       </w:tr>
       <w:tr>
         <w:trPr>
-          <w:trHeight w:val="464" w:hRule="exact"/>
+          <w:trHeight w:val="907" w:hRule="exact"/>
         </w:trPr>
         <w:tc>
           <w:tcPr>
@@ -1247,11 +1212,6 @@
               <w:t xml:space="preserve">In Japan,  </w:t>
             </w:r>
             <w:r>
-              <w:rPr>
-                <w:rFonts w:ascii="Arial" w:hAnsi="Arial" w:eastAsia="MS PGothic"/>
-                <w:b w:val="0"/>
-                <w:sz w:val="21"/>
-              </w:rPr>
               <w:tab/>
             </w:r>
             <w:r>
@@ -1267,7 +1227,7 @@
       </w:tr>
       <w:tr>
         <w:trPr>
-          <w:trHeight w:val="464" w:hRule="exact"/>
+          <w:trHeight w:val="907" w:hRule="exact"/>
         </w:trPr>
         <w:tc>
           <w:tcPr>
@@ -1310,11 +1270,6 @@
               <w:t xml:space="preserve">Enjoy  </w:t>
             </w:r>
             <w:r>
-              <w:rPr>
-                <w:rFonts w:ascii="Arial" w:hAnsi="Arial" w:eastAsia="MS PGothic"/>
-                <w:b w:val="0"/>
-                <w:sz w:val="21"/>
-              </w:rPr>
               <w:tab/>
             </w:r>
             <w:r>
@@ -1330,7 +1285,7 @@
       </w:tr>
       <w:tr>
         <w:trPr>
-          <w:trHeight w:val="464" w:hRule="exact"/>
+          <w:trHeight w:val="907" w:hRule="exact"/>
         </w:trPr>
         <w:tc>
           <w:tcPr>
@@ -1370,14 +1325,8 @@
                 <w:b w:val="0"/>
                 <w:sz w:val="21"/>
               </w:rPr>
-              <w:t xml:space="preserve">In the magical town, she  </w:t>
             </w:r>
             <w:r>
-              <w:rPr>
-                <w:rFonts w:ascii="Arial" w:hAnsi="Arial" w:eastAsia="MS PGothic"/>
-                <w:b w:val="0"/>
-                <w:sz w:val="21"/>
-              </w:rPr>
               <w:tab/>
             </w:r>
             <w:r>
@@ -1386,7 +1335,7 @@
                 <w:b w:val="0"/>
                 <w:sz w:val="21"/>
               </w:rPr>
-              <w:t>.</w:t>
+              <w:t>public.</w:t>
             </w:r>
           </w:p>
         </w:tc>
@@ -1394,7 +1343,15 @@
     </w:tbl>
     <w:p>
       <w:pPr>
-        <w:spacing w:before="40" w:after="0" w:lineRule="exact" w:line="240"/>
+        <w:spacing w:before="0" w:after="0" w:lineRule="exact" w:line="20"/>
+      </w:pPr>
+      <w:r>
+        <w:br w:type="page"/>
+      </w:r>
+    </w:p>
+    <w:p>
+      <w:pPr>
+        <w:spacing w:before="80" w:after="40" w:lineRule="exact" w:line="260"/>
         <w:jc w:val="left"/>
       </w:pPr>
       <w:r>
@@ -1403,7 +1360,7 @@
           <w:b w:val="0"/>
           <w:sz w:val="19"/>
         </w:rPr>
-        <w:t>B（1×12=12点）　空所に適切な語を入れよ</w:t>
+        <w:t>B（1×13=13点）　空所に適切な語を入れよ</w:t>
       </w:r>
     </w:p>
     <w:tbl>
@@ -1421,7 +1378,7 @@
       </w:tblGrid>
       <w:tr>
         <w:trPr>
-          <w:trHeight w:val="498" w:hRule="exact"/>
+          <w:trHeight w:val="464" w:hRule="exact"/>
         </w:trPr>
         <w:tc>
           <w:tcPr>
@@ -1479,91 +1436,6 @@
                 <w:b w:val="0"/>
                 <w:sz w:val="19"/>
               </w:rPr>
-              <w:t>(7)</w:t>
-            </w:r>
-          </w:p>
-        </w:tc>
-        <w:tc>
-          <w:tcPr>
-            <w:tcW w:type="dxa" w:w="4819"/>
-            <w:vAlign w:val="center"/>
-          </w:tcPr>
-          <w:p>
-            <w:pPr>
-              <w:spacing w:before="0" w:after="0"/>
-              <w:jc w:val="center"/>
-            </w:pPr>
-            <w:r>
-              <w:rPr>
-                <w:rFonts w:ascii="Arial" w:hAnsi="Arial" w:eastAsia="MS PGothic"/>
-                <w:b w:val="0"/>
-                <w:sz w:val="21"/>
-              </w:rPr>
-              <w:t>(　　　　　　　　　　　　　　　　)</w:t>
-            </w:r>
-          </w:p>
-        </w:tc>
-      </w:tr>
-      <w:tr>
-        <w:trPr>
-          <w:trHeight w:val="498" w:hRule="exact"/>
-        </w:trPr>
-        <w:tc>
-          <w:tcPr>
-            <w:tcW w:type="dxa" w:w="454"/>
-            <w:vAlign w:val="center"/>
-          </w:tcPr>
-          <w:p>
-            <w:pPr>
-              <w:spacing w:before="0" w:after="0"/>
-              <w:jc w:val="center"/>
-            </w:pPr>
-            <w:r>
-              <w:rPr>
-                <w:rFonts w:ascii="Arial" w:hAnsi="Arial" w:eastAsia="MS PGothic"/>
-                <w:b w:val="0"/>
-                <w:sz w:val="19"/>
-              </w:rPr>
-              <w:t>(2)</w:t>
-            </w:r>
-          </w:p>
-        </w:tc>
-        <w:tc>
-          <w:tcPr>
-            <w:tcW w:type="dxa" w:w="4819"/>
-            <w:vAlign w:val="center"/>
-          </w:tcPr>
-          <w:p>
-            <w:pPr>
-              <w:spacing w:before="0" w:after="0"/>
-              <w:jc w:val="center"/>
-            </w:pPr>
-            <w:r>
-              <w:rPr>
-                <w:rFonts w:ascii="Arial" w:hAnsi="Arial" w:eastAsia="MS PGothic"/>
-                <w:b w:val="0"/>
-                <w:sz w:val="21"/>
-              </w:rPr>
-              <w:t>(　　　　　　　)(　　　　　　　)</w:t>
-            </w:r>
-          </w:p>
-        </w:tc>
-        <w:tc>
-          <w:tcPr>
-            <w:tcW w:type="dxa" w:w="454"/>
-            <w:vAlign w:val="center"/>
-          </w:tcPr>
-          <w:p>
-            <w:pPr>
-              <w:spacing w:before="0" w:after="0"/>
-              <w:jc w:val="center"/>
-            </w:pPr>
-            <w:r>
-              <w:rPr>
-                <w:rFonts w:ascii="Arial" w:hAnsi="Arial" w:eastAsia="MS PGothic"/>
-                <w:b w:val="0"/>
-                <w:sz w:val="19"/>
-              </w:rPr>
               <w:t>(8)</w:t>
             </w:r>
           </w:p>
@@ -1591,7 +1463,7 @@
       </w:tr>
       <w:tr>
         <w:trPr>
-          <w:trHeight w:val="498" w:hRule="exact"/>
+          <w:trHeight w:val="464" w:hRule="exact"/>
         </w:trPr>
         <w:tc>
           <w:tcPr>
@@ -1609,7 +1481,7 @@
                 <w:b w:val="0"/>
                 <w:sz w:val="19"/>
               </w:rPr>
-              <w:t>(3)</w:t>
+              <w:t>(2)</w:t>
             </w:r>
           </w:p>
         </w:tc>
@@ -1676,7 +1548,7 @@
       </w:tr>
       <w:tr>
         <w:trPr>
-          <w:trHeight w:val="498" w:hRule="exact"/>
+          <w:trHeight w:val="464" w:hRule="exact"/>
         </w:trPr>
         <w:tc>
           <w:tcPr>
@@ -1694,7 +1566,7 @@
                 <w:b w:val="0"/>
                 <w:sz w:val="19"/>
               </w:rPr>
-              <w:t>(4)</w:t>
+              <w:t>(3)</w:t>
             </w:r>
           </w:p>
         </w:tc>
@@ -1714,7 +1586,7 @@
                 <w:b w:val="0"/>
                 <w:sz w:val="21"/>
               </w:rPr>
-              <w:t>(　　　　)(　　　　)(　　　　)</w:t>
+              <w:t>(　　　　　　　)(　　　　　　　)</w:t>
             </w:r>
           </w:p>
         </w:tc>
@@ -1761,7 +1633,7 @@
       </w:tr>
       <w:tr>
         <w:trPr>
-          <w:trHeight w:val="498" w:hRule="exact"/>
+          <w:trHeight w:val="464" w:hRule="exact"/>
         </w:trPr>
         <w:tc>
           <w:tcPr>
@@ -1779,7 +1651,7 @@
                 <w:b w:val="0"/>
                 <w:sz w:val="19"/>
               </w:rPr>
-              <w:t>(5)</w:t>
+              <w:t>(4)</w:t>
             </w:r>
           </w:p>
         </w:tc>
@@ -1846,7 +1718,7 @@
       </w:tr>
       <w:tr>
         <w:trPr>
-          <w:trHeight w:val="498" w:hRule="exact"/>
+          <w:trHeight w:val="464" w:hRule="exact"/>
         </w:trPr>
         <w:tc>
           <w:tcPr>
@@ -1864,7 +1736,7 @@
                 <w:b w:val="0"/>
                 <w:sz w:val="19"/>
               </w:rPr>
-              <w:t>(6)</w:t>
+              <w:t>(5)</w:t>
             </w:r>
           </w:p>
         </w:tc>
@@ -1929,6 +1801,164 @@
           </w:p>
         </w:tc>
       </w:tr>
+      <w:tr>
+        <w:trPr>
+          <w:trHeight w:val="464" w:hRule="exact"/>
+        </w:trPr>
+        <w:tc>
+          <w:tcPr>
+            <w:tcW w:type="dxa" w:w="454"/>
+            <w:vAlign w:val="center"/>
+          </w:tcPr>
+          <w:p>
+            <w:pPr>
+              <w:spacing w:before="0" w:after="0"/>
+              <w:jc w:val="center"/>
+            </w:pPr>
+            <w:r>
+              <w:rPr>
+                <w:rFonts w:ascii="Arial" w:hAnsi="Arial" w:eastAsia="MS PGothic"/>
+                <w:b w:val="0"/>
+                <w:sz w:val="19"/>
+              </w:rPr>
+              <w:t>(6)</w:t>
+            </w:r>
+          </w:p>
+        </w:tc>
+        <w:tc>
+          <w:tcPr>
+            <w:tcW w:type="dxa" w:w="4819"/>
+            <w:vAlign w:val="center"/>
+          </w:tcPr>
+          <w:p>
+            <w:pPr>
+              <w:spacing w:before="0" w:after="0"/>
+              <w:jc w:val="center"/>
+            </w:pPr>
+            <w:r>
+              <w:rPr>
+                <w:rFonts w:ascii="Arial" w:hAnsi="Arial" w:eastAsia="MS PGothic"/>
+                <w:b w:val="0"/>
+                <w:sz w:val="21"/>
+              </w:rPr>
+              <w:t>(　　　　)(　　　　)(　　　　)</w:t>
+            </w:r>
+          </w:p>
+        </w:tc>
+        <w:tc>
+          <w:tcPr>
+            <w:tcW w:type="dxa" w:w="454"/>
+            <w:vAlign w:val="center"/>
+          </w:tcPr>
+          <w:p>
+            <w:pPr>
+              <w:spacing w:before="0" w:after="0"/>
+              <w:jc w:val="center"/>
+            </w:pPr>
+            <w:r>
+              <w:rPr>
+                <w:rFonts w:ascii="Arial" w:hAnsi="Arial" w:eastAsia="MS PGothic"/>
+                <w:b w:val="0"/>
+                <w:sz w:val="19"/>
+              </w:rPr>
+              <w:t>(13)</w:t>
+            </w:r>
+          </w:p>
+        </w:tc>
+        <w:tc>
+          <w:tcPr>
+            <w:tcW w:type="dxa" w:w="4819"/>
+            <w:vAlign w:val="center"/>
+          </w:tcPr>
+          <w:p>
+            <w:pPr>
+              <w:spacing w:before="0" w:after="0"/>
+              <w:jc w:val="center"/>
+            </w:pPr>
+            <w:r>
+              <w:rPr>
+                <w:rFonts w:ascii="Arial" w:hAnsi="Arial" w:eastAsia="MS PGothic"/>
+                <w:b w:val="0"/>
+                <w:sz w:val="21"/>
+              </w:rPr>
+              <w:t>(　　　　　　　　　　　　　　　　)</w:t>
+            </w:r>
+          </w:p>
+        </w:tc>
+      </w:tr>
+      <w:tr>
+        <w:trPr>
+          <w:trHeight w:val="464" w:hRule="exact"/>
+        </w:trPr>
+        <w:tc>
+          <w:tcPr>
+            <w:tcW w:type="dxa" w:w="454"/>
+            <w:vAlign w:val="center"/>
+          </w:tcPr>
+          <w:p>
+            <w:pPr>
+              <w:spacing w:before="0" w:after="0"/>
+              <w:jc w:val="center"/>
+            </w:pPr>
+            <w:r>
+              <w:rPr>
+                <w:rFonts w:ascii="Arial" w:hAnsi="Arial" w:eastAsia="MS PGothic"/>
+                <w:b w:val="0"/>
+                <w:sz w:val="19"/>
+              </w:rPr>
+              <w:t>(7)</w:t>
+            </w:r>
+          </w:p>
+        </w:tc>
+        <w:tc>
+          <w:tcPr>
+            <w:tcW w:type="dxa" w:w="4819"/>
+            <w:vAlign w:val="center"/>
+          </w:tcPr>
+          <w:p>
+            <w:pPr>
+              <w:spacing w:before="0" w:after="0"/>
+              <w:jc w:val="center"/>
+            </w:pPr>
+            <w:r>
+              <w:rPr>
+                <w:rFonts w:ascii="Arial" w:hAnsi="Arial" w:eastAsia="MS PGothic"/>
+                <w:b w:val="0"/>
+                <w:sz w:val="21"/>
+              </w:rPr>
+              <w:t>(　　　　　　　　　　　　　　　　)</w:t>
+            </w:r>
+          </w:p>
+        </w:tc>
+        <w:tc>
+          <w:tcPr>
+            <w:tcW w:type="dxa" w:w="454"/>
+            <w:tcBorders>
+              <w:top w:val="none" w:sz="0" w:space="0" w:color="auto"/>
+              <w:left w:val="none" w:sz="0" w:space="0" w:color="auto"/>
+              <w:bottom w:val="none" w:sz="0" w:space="0" w:color="auto"/>
+              <w:right w:val="none" w:sz="0" w:space="0" w:color="auto"/>
+              <w:insideH w:val="none" w:sz="0" w:space="0" w:color="auto"/>
+              <w:insideV w:val="none" w:sz="0" w:space="0" w:color="auto"/>
+            </w:tcBorders>
+          </w:tcPr>
+          <w:p/>
+        </w:tc>
+        <w:tc>
+          <w:tcPr>
+            <w:tcW w:type="dxa" w:w="4819"/>
+            <w:tcBorders>
+              <w:top w:val="none" w:sz="0" w:space="0" w:color="auto"/>
+              <w:left w:val="none" w:sz="0" w:space="0" w:color="auto"/>
+              <w:bottom w:val="none" w:sz="0" w:space="0" w:color="auto"/>
+              <w:right w:val="none" w:sz="0" w:space="0" w:color="auto"/>
+              <w:insideH w:val="none" w:sz="0" w:space="0" w:color="auto"/>
+              <w:insideV w:val="none" w:sz="0" w:space="0" w:color="auto"/>
+            </w:tcBorders>
+          </w:tcPr>
+          <w:p/>
+        </w:tc>
+      </w:tr>
     </w:tbl>
     <w:p>
       <w:pPr>
@@ -1961,7 +1991,7 @@
       </w:tblGrid>
       <w:tr>
         <w:trPr>
-          <w:trHeight w:val="442" w:hRule="exact"/>
+          <w:trHeight w:val="464" w:hRule="exact"/>
         </w:trPr>
         <w:tc>
           <w:tcPr>
@@ -2087,15 +2117,7 @@
     </w:tbl>
     <w:p>
       <w:pPr>
-        <w:spacing w:before="0" w:after="0" w:lineRule="exact" w:line="20"/>
-      </w:pPr>
-      <w:r>
-        <w:br w:type="page"/>
-      </w:r>
-    </w:p>
-    <w:p>
-      <w:pPr>
-        <w:spacing w:before="0" w:after="40" w:lineRule="exact" w:line="260"/>
+        <w:spacing w:before="80" w:after="40" w:lineRule="exact" w:line="260"/>
         <w:jc w:val="left"/>
       </w:pPr>
       <w:r>
@@ -2104,7 +2126,7 @@
           <w:b/>
           <w:sz w:val="21"/>
         </w:rPr>
-        <w:t>４　（思考・判断・表現　12点）</w:t>
+        <w:t>４　（思考・判断・表現　18点）</w:t>
       </w:r>
     </w:p>
     <w:tbl>
@@ -2119,7 +2141,7 @@
       </w:tblGrid>
       <w:tr>
         <w:trPr>
-          <w:trHeight w:val="481" w:hRule="exact"/>
+          <w:trHeight w:val="498" w:hRule="exact"/>
         </w:trPr>
         <w:tc>
           <w:tcPr>
@@ -2144,7 +2166,7 @@
       </w:tr>
       <w:tr>
         <w:trPr>
-          <w:trHeight w:val="481" w:hRule="exact"/>
+          <w:trHeight w:val="498" w:hRule="exact"/>
         </w:trPr>
         <w:tc>
           <w:tcPr>
@@ -2169,7 +2191,7 @@
       </w:tr>
       <w:tr>
         <w:trPr>
-          <w:trHeight w:val="481" w:hRule="exact"/>
+          <w:trHeight w:val="498" w:hRule="exact"/>
         </w:trPr>
         <w:tc>
           <w:tcPr>
@@ -2194,7 +2216,7 @@
       </w:tr>
       <w:tr>
         <w:trPr>
-          <w:trHeight w:val="481" w:hRule="exact"/>
+          <w:trHeight w:val="498" w:hRule="exact"/>
         </w:trPr>
         <w:tc>
           <w:tcPr>
@@ -2219,7 +2241,7 @@
       </w:tr>
       <w:tr>
         <w:trPr>
-          <w:trHeight w:val="481" w:hRule="exact"/>
+          <w:trHeight w:val="498" w:hRule="exact"/>
         </w:trPr>
         <w:tc>
           <w:tcPr>
@@ -2244,7 +2266,7 @@
       </w:tr>
       <w:tr>
         <w:trPr>
-          <w:trHeight w:val="481" w:hRule="exact"/>
+          <w:trHeight w:val="498" w:hRule="exact"/>
         </w:trPr>
         <w:tc>
           <w:tcPr>
@@ -2279,7 +2301,7 @@
           <w:b/>
           <w:sz w:val="21"/>
         </w:rPr>
-        <w:t>５　（思考・判断・表現　10点）</w:t>
+        <w:t>５　（思考・判断・表現　12点）</w:t>
       </w:r>
     </w:p>
     <w:p>
@@ -2293,7 +2315,7 @@
           <w:b w:val="0"/>
           <w:sz w:val="19"/>
         </w:rPr>
-        <w:t>A（1×5=5点）　　　　　　　　　　　　　　B（1×5=5点）</w:t>
+        <w:t>A（2×3=6点）　　　　　　　　　　　　　　　　B（2×3=6点）</w:t>
       </w:r>
     </w:p>
     <w:tbl>
@@ -2309,7 +2331,7 @@
       </w:tblGrid>
       <w:tr>
         <w:trPr>
-          <w:trHeight w:val="453" w:hRule="exact"/>
+          <w:trHeight w:val="538" w:hRule="exact"/>
         </w:trPr>
         <w:tc>
           <w:tcPr>
@@ -2354,7 +2376,7 @@
       </w:tr>
       <w:tr>
         <w:trPr>
-          <w:trHeight w:val="453" w:hRule="exact"/>
+          <w:trHeight w:val="538" w:hRule="exact"/>
         </w:trPr>
         <w:tc>
           <w:tcPr>
@@ -2399,7 +2421,7 @@
       </w:tr>
       <w:tr>
         <w:trPr>
-          <w:trHeight w:val="453" w:hRule="exact"/>
+          <w:trHeight w:val="538" w:hRule="exact"/>
         </w:trPr>
         <w:tc>
           <w:tcPr>
@@ -2442,96 +2464,6 @@
           </w:p>
         </w:tc>
       </w:tr>
-      <w:tr>
-        <w:trPr>
-          <w:trHeight w:val="453" w:hRule="exact"/>
-        </w:trPr>
-        <w:tc>
-          <w:tcPr>
-            <w:tcW w:type="dxa" w:w="5272"/>
-            <w:vAlign w:val="center"/>
-          </w:tcPr>
-          <w:p>
-            <w:pPr>
-              <w:spacing w:before="0" w:after="0"/>
-              <w:jc w:val="left"/>
-            </w:pPr>
-            <w:r>
-              <w:rPr>
-                <w:rFonts w:ascii="Arial" w:hAnsi="Arial" w:eastAsia="MS PGothic"/>
-                <w:b w:val="0"/>
-                <w:sz w:val="21"/>
-              </w:rPr>
-              <w:t>(4)</w:t>
-            </w:r>
-          </w:p>
-        </w:tc>
-        <w:tc>
-          <w:tcPr>
-            <w:tcW w:type="dxa" w:w="5272"/>
-            <w:vAlign w:val="center"/>
-          </w:tcPr>
-          <w:p>
-            <w:pPr>
-              <w:spacing w:before="0" w:after="0"/>
-              <w:jc w:val="left"/>
-            </w:pPr>
-            <w:r>
-              <w:rPr>
-                <w:rFonts w:ascii="Arial" w:hAnsi="Arial" w:eastAsia="MS PGothic"/>
-                <w:b w:val="0"/>
-                <w:sz w:val="21"/>
-              </w:rPr>
-              <w:t>(4)</w:t>
-            </w:r>
-          </w:p>
-        </w:tc>
-      </w:tr>
-      <w:tr>
-        <w:trPr>
-          <w:trHeight w:val="453" w:hRule="exact"/>
-        </w:trPr>
-        <w:tc>
-          <w:tcPr>
-            <w:tcW w:type="dxa" w:w="5272"/>
-            <w:vAlign w:val="center"/>
-          </w:tcPr>
-          <w:p>
-            <w:pPr>
-              <w:spacing w:before="0" w:after="0"/>
-              <w:jc w:val="left"/>
-            </w:pPr>
-            <w:r>
-              <w:rPr>
-                <w:rFonts w:ascii="Arial" w:hAnsi="Arial" w:eastAsia="MS PGothic"/>
-                <w:b w:val="0"/>
-                <w:sz w:val="21"/>
-              </w:rPr>
-              <w:t>(5)</w:t>
-            </w:r>
-          </w:p>
-        </w:tc>
-        <w:tc>
-          <w:tcPr>
-            <w:tcW w:type="dxa" w:w="5272"/>
-            <w:vAlign w:val="center"/>
-          </w:tcPr>
-          <w:p>
-            <w:pPr>
-              <w:spacing w:before="0" w:after="0"/>
-              <w:jc w:val="left"/>
-            </w:pPr>
-            <w:r>
-              <w:rPr>
-                <w:rFonts w:ascii="Arial" w:hAnsi="Arial" w:eastAsia="MS PGothic"/>
-                <w:b w:val="0"/>
-                <w:sz w:val="21"/>
-              </w:rPr>
-              <w:t>(5)</w:t>
-            </w:r>
-          </w:p>
-        </w:tc>
-      </w:tr>
     </w:tbl>
     <w:p>
       <w:pPr>
@@ -2544,7 +2476,7 @@
           <w:b/>
           <w:sz w:val="21"/>
         </w:rPr>
-        <w:t>６　（思考・判断・表現　15点）</w:t>
+        <w:t>６　（思考・判断・表現　10点）</w:t>
       </w:r>
     </w:p>
     <w:p>
@@ -2558,7 +2490,7 @@
           <w:b w:val="0"/>
           <w:sz w:val="19"/>
         </w:rPr>
-        <w:t>問1（1点）・問2（2点）・問5（2点）　各 A〜D から選択</w:t>
+        <w:t>問1（2点）・問2（2点）・問4（1点）</w:t>
       </w:r>
     </w:p>
     <w:tbl>
@@ -2575,11 +2507,11 @@
       </w:tblGrid>
       <w:tr>
         <w:trPr>
-          <w:trHeight w:val="442" w:hRule="exact"/>
+          <w:trHeight w:val="498" w:hRule="exact"/>
         </w:trPr>
         <w:tc>
           <w:tcPr>
-            <w:tcW w:type="dxa" w:w="1814"/>
+            <w:tcW w:type="dxa" w:w="3175"/>
             <w:vAlign w:val="center"/>
           </w:tcPr>
           <w:p>
@@ -2593,13 +2525,13 @@
                 <w:b/>
                 <w:sz w:val="19"/>
               </w:rPr>
-              <w:t>問1（1点）</w:t>
+              <w:t>問1</w:t>
             </w:r>
           </w:p>
         </w:tc>
         <w:tc>
           <w:tcPr>
-            <w:tcW w:type="dxa" w:w="1814"/>
+            <w:tcW w:type="dxa" w:w="5102"/>
             <w:vAlign w:val="center"/>
           </w:tcPr>
           <w:p>
@@ -2613,13 +2545,13 @@
                 <w:b/>
                 <w:sz w:val="19"/>
               </w:rPr>
-              <w:t>問2（2点）</w:t>
+              <w:t>問2　（i〜vから2つ）</w:t>
             </w:r>
           </w:p>
         </w:tc>
         <w:tc>
           <w:tcPr>
-            <w:tcW w:type="dxa" w:w="1814"/>
+            <w:tcW w:type="dxa" w:w="2268"/>
             <w:vAlign w:val="center"/>
           </w:tcPr>
           <w:p>
@@ -2633,7 +2565,7 @@
                 <w:b/>
                 <w:sz w:val="19"/>
               </w:rPr>
-              <w:t>問5（2点）</w:t>
+              <w:t>問4</w:t>
             </w:r>
           </w:p>
         </w:tc>
@@ -2650,141 +2582,7 @@
           <w:b w:val="0"/>
           <w:sz w:val="19"/>
         </w:rPr>
-        <w:t>問3（1×5=5点）　S＝スパルタ　A＝アテネ</w:t>
-      </w:r>
-    </w:p>
-    <w:tbl>
-      <w:tblPr>
-        <w:tblStyle w:val="TableGrid"/>
-        <w:tblW w:type="auto" w:w="0"/>
-        <w:jc w:val="left"/>
-        <w:tblLook w:firstColumn="1" w:firstRow="1" w:lastColumn="0" w:lastRow="0" w:noHBand="0" w:noVBand="1" w:val="04A0"/>
-      </w:tblPr>
-      <w:tblGrid>
-        <w:gridCol w:w="2109"/>
-        <w:gridCol w:w="2109"/>
-        <w:gridCol w:w="2109"/>
-        <w:gridCol w:w="2109"/>
-        <w:gridCol w:w="2109"/>
-      </w:tblGrid>
-      <w:tr>
-        <w:trPr>
-          <w:trHeight w:val="442" w:hRule="exact"/>
-        </w:trPr>
-        <w:tc>
-          <w:tcPr>
-            <w:tcW w:type="dxa" w:w="1361"/>
-            <w:vAlign w:val="center"/>
-          </w:tcPr>
-          <w:p>
-            <w:pPr>
-              <w:spacing w:before="0" w:after="0"/>
-              <w:jc w:val="center"/>
-            </w:pPr>
-            <w:r>
-              <w:rPr>
-                <w:rFonts w:ascii="Arial" w:hAnsi="Arial" w:eastAsia="MS PGothic"/>
-                <w:b w:val="0"/>
-                <w:sz w:val="21"/>
-              </w:rPr>
-              <w:t>(i)</w:t>
-            </w:r>
-          </w:p>
-        </w:tc>
-        <w:tc>
-          <w:tcPr>
-            <w:tcW w:type="dxa" w:w="1361"/>
-            <w:vAlign w:val="center"/>
-          </w:tcPr>
-          <w:p>
-            <w:pPr>
-              <w:spacing w:before="0" w:after="0"/>
-              <w:jc w:val="center"/>
-            </w:pPr>
-            <w:r>
-              <w:rPr>
-                <w:rFonts w:ascii="Arial" w:hAnsi="Arial" w:eastAsia="MS PGothic"/>
-                <w:b w:val="0"/>
-                <w:sz w:val="21"/>
-              </w:rPr>
-              <w:t>(ii)</w:t>
-            </w:r>
-          </w:p>
-        </w:tc>
-        <w:tc>
-          <w:tcPr>
-            <w:tcW w:type="dxa" w:w="1361"/>
-            <w:vAlign w:val="center"/>
-          </w:tcPr>
-          <w:p>
-            <w:pPr>
-              <w:spacing w:before="0" w:after="0"/>
-              <w:jc w:val="center"/>
-            </w:pPr>
-            <w:r>
-              <w:rPr>
-                <w:rFonts w:ascii="Arial" w:hAnsi="Arial" w:eastAsia="MS PGothic"/>
-                <w:b w:val="0"/>
-                <w:sz w:val="21"/>
-              </w:rPr>
-              <w:t>(iii)</w:t>
-            </w:r>
-          </w:p>
-        </w:tc>
-        <w:tc>
-          <w:tcPr>
-            <w:tcW w:type="dxa" w:w="1361"/>
-            <w:vAlign w:val="center"/>
-          </w:tcPr>
-          <w:p>
-            <w:pPr>
-              <w:spacing w:before="0" w:after="0"/>
-              <w:jc w:val="center"/>
-            </w:pPr>
-            <w:r>
-              <w:rPr>
-                <w:rFonts w:ascii="Arial" w:hAnsi="Arial" w:eastAsia="MS PGothic"/>
-                <w:b w:val="0"/>
-                <w:sz w:val="21"/>
-              </w:rPr>
-              <w:t>(iv)</w:t>
-            </w:r>
-          </w:p>
-        </w:tc>
-        <w:tc>
-          <w:tcPr>
-            <w:tcW w:type="dxa" w:w="1361"/>
-            <w:vAlign w:val="center"/>
-          </w:tcPr>
-          <w:p>
-            <w:pPr>
-              <w:spacing w:before="0" w:after="0"/>
-              <w:jc w:val="center"/>
-            </w:pPr>
-            <w:r>
-              <w:rPr>
-                <w:rFonts w:ascii="Arial" w:hAnsi="Arial" w:eastAsia="MS PGothic"/>
-                <w:b w:val="0"/>
-                <w:sz w:val="21"/>
-              </w:rPr>
-              <w:t>(v)</w:t>
-            </w:r>
-          </w:p>
-        </w:tc>
-      </w:tr>
-    </w:tbl>
-    <w:p>
-      <w:pPr>
-        <w:spacing w:before="40" w:after="0" w:lineRule="exact" w:line="240"/>
-        <w:jc w:val="left"/>
-      </w:pPr>
-      <w:r>
-        <w:rPr>
-          <w:rFonts w:ascii="Arial" w:hAnsi="Arial" w:eastAsia="MS PGothic"/>
-          <w:b w:val="0"/>
-          <w:sz w:val="19"/>
-        </w:rPr>
-        <w:t>問4（2点）　スパルタの女性がアテネの女性より「自由」を得られた理由</w:t>
+        <w:t>問3（2点）　スパルタの女性がアテネの女性よりも「自由」を得られていた理由</w:t>
       </w:r>
     </w:p>
     <w:tbl>
@@ -2799,7 +2597,7 @@
       </w:tblGrid>
       <w:tr>
         <w:trPr>
-          <w:trHeight w:val="481" w:hRule="exact"/>
+          <w:trHeight w:val="498" w:hRule="exact"/>
         </w:trPr>
         <w:tc>
           <w:tcPr>
@@ -2823,7 +2621,7 @@
       </w:tr>
       <w:tr>
         <w:trPr>
-          <w:trHeight w:val="481" w:hRule="exact"/>
+          <w:trHeight w:val="498" w:hRule="exact"/>
         </w:trPr>
         <w:tc>
           <w:tcPr>
@@ -2857,7 +2655,7 @@
           <w:b w:val="0"/>
           <w:sz w:val="19"/>
         </w:rPr>
-        <w:t>問6（3点）　下線部(2)の日本語訳</w:t>
+        <w:t>問5（3点）　下線部(2)の日本語訳</w:t>
       </w:r>
     </w:p>
     <w:tbl>
@@ -2872,7 +2670,7 @@
       </w:tblGrid>
       <w:tr>
         <w:trPr>
-          <w:trHeight w:val="481" w:hRule="exact"/>
+          <w:trHeight w:val="498" w:hRule="exact"/>
         </w:trPr>
         <w:tc>
           <w:tcPr>
@@ -2896,176 +2694,7 @@
       </w:tr>
       <w:tr>
         <w:trPr>
-          <w:trHeight w:val="481" w:hRule="exact"/>
-        </w:trPr>
-        <w:tc>
-          <w:tcPr>
-            <w:tcW w:type="dxa" w:w="10545"/>
-            <w:vAlign w:val="center"/>
-          </w:tcPr>
-          <w:p>
-            <w:pPr>
-              <w:spacing w:before="0" w:after="0"/>
-              <w:jc w:val="left"/>
-            </w:pPr>
-            <w:r>
-              <w:rPr>
-                <w:rFonts w:ascii="Arial" w:hAnsi="Arial" w:eastAsia="MS PGothic"/>
-                <w:b w:val="0"/>
-                <w:sz w:val="21"/>
-              </w:rPr>
-            </w:r>
-          </w:p>
-        </w:tc>
-      </w:tr>
-    </w:tbl>
-    <w:p>
-      <w:pPr>
-        <w:spacing w:before="60" w:after="40" w:lineRule="exact" w:line="260"/>
-        <w:jc w:val="left"/>
-      </w:pPr>
-      <w:r>
-        <w:rPr>
-          <w:rFonts w:ascii="Arial" w:hAnsi="Arial" w:eastAsia="MS PGothic"/>
-          <w:b/>
-          <w:sz w:val="21"/>
-        </w:rPr>
-        <w:t>７　（思考・判断・表現　6点）　50語以上</w:t>
-      </w:r>
-    </w:p>
-    <w:tbl>
-      <w:tblPr>
-        <w:tblStyle w:val="TableGrid"/>
-        <w:tblW w:type="auto" w:w="0"/>
-        <w:jc w:val="left"/>
-        <w:tblLook w:firstColumn="1" w:firstRow="1" w:lastColumn="0" w:lastRow="0" w:noHBand="0" w:noVBand="1" w:val="04A0"/>
-      </w:tblPr>
-      <w:tblGrid>
-        <w:gridCol w:w="10546"/>
-      </w:tblGrid>
-      <w:tr>
-        <w:trPr>
-          <w:trHeight w:val="442" w:hRule="exact"/>
-        </w:trPr>
-        <w:tc>
-          <w:tcPr>
-            <w:tcW w:type="dxa" w:w="10545"/>
-            <w:vAlign w:val="center"/>
-          </w:tcPr>
-          <w:p>
-            <w:pPr>
-              <w:spacing w:before="0" w:after="0"/>
-              <w:jc w:val="left"/>
-            </w:pPr>
-            <w:r>
-              <w:rPr>
-                <w:rFonts w:ascii="Arial" w:hAnsi="Arial" w:eastAsia="MS PGothic"/>
-                <w:b w:val="0"/>
-                <w:sz w:val="21"/>
-              </w:rPr>
-            </w:r>
-          </w:p>
-        </w:tc>
-      </w:tr>
-      <w:tr>
-        <w:trPr>
-          <w:trHeight w:val="442" w:hRule="exact"/>
-        </w:trPr>
-        <w:tc>
-          <w:tcPr>
-            <w:tcW w:type="dxa" w:w="10545"/>
-            <w:vAlign w:val="center"/>
-          </w:tcPr>
-          <w:p>
-            <w:pPr>
-              <w:spacing w:before="0" w:after="0"/>
-              <w:jc w:val="left"/>
-            </w:pPr>
-            <w:r>
-              <w:rPr>
-                <w:rFonts w:ascii="Arial" w:hAnsi="Arial" w:eastAsia="MS PGothic"/>
-                <w:b w:val="0"/>
-                <w:sz w:val="21"/>
-              </w:rPr>
-            </w:r>
-          </w:p>
-        </w:tc>
-      </w:tr>
-      <w:tr>
-        <w:trPr>
-          <w:trHeight w:val="442" w:hRule="exact"/>
-        </w:trPr>
-        <w:tc>
-          <w:tcPr>
-            <w:tcW w:type="dxa" w:w="10545"/>
-            <w:vAlign w:val="center"/>
-          </w:tcPr>
-          <w:p>
-            <w:pPr>
-              <w:spacing w:before="0" w:after="0"/>
-              <w:jc w:val="left"/>
-            </w:pPr>
-            <w:r>
-              <w:rPr>
-                <w:rFonts w:ascii="Arial" w:hAnsi="Arial" w:eastAsia="MS PGothic"/>
-                <w:b w:val="0"/>
-                <w:sz w:val="21"/>
-              </w:rPr>
-            </w:r>
-          </w:p>
-        </w:tc>
-      </w:tr>
-      <w:tr>
-        <w:trPr>
-          <w:trHeight w:val="442" w:hRule="exact"/>
-        </w:trPr>
-        <w:tc>
-          <w:tcPr>
-            <w:tcW w:type="dxa" w:w="10545"/>
-            <w:vAlign w:val="center"/>
-          </w:tcPr>
-          <w:p>
-            <w:pPr>
-              <w:spacing w:before="0" w:after="0"/>
-              <w:jc w:val="left"/>
-            </w:pPr>
-            <w:r>
-              <w:rPr>
-                <w:rFonts w:ascii="Arial" w:hAnsi="Arial" w:eastAsia="MS PGothic"/>
-                <w:b w:val="0"/>
-                <w:sz w:val="21"/>
-              </w:rPr>
-            </w:r>
-          </w:p>
-        </w:tc>
-      </w:tr>
-      <w:tr>
-        <w:trPr>
-          <w:trHeight w:val="442" w:hRule="exact"/>
-        </w:trPr>
-        <w:tc>
-          <w:tcPr>
-            <w:tcW w:type="dxa" w:w="10545"/>
-            <w:vAlign w:val="center"/>
-          </w:tcPr>
-          <w:p>
-            <w:pPr>
-              <w:spacing w:before="0" w:after="0"/>
-              <w:jc w:val="left"/>
-            </w:pPr>
-            <w:r>
-              <w:rPr>
-                <w:rFonts w:ascii="Arial" w:hAnsi="Arial" w:eastAsia="MS PGothic"/>
-                <w:b w:val="0"/>
-                <w:sz w:val="21"/>
-              </w:rPr>
-            </w:r>
-          </w:p>
-        </w:tc>
-      </w:tr>
-      <w:tr>
-        <w:trPr>
-          <w:trHeight w:val="442" w:hRule="exact"/>
+          <w:trHeight w:val="498" w:hRule="exact"/>
         </w:trPr>
         <w:tc>
           <w:tcPr>
@@ -3116,7 +2745,7 @@
       </w:tblGrid>
       <w:tr>
         <w:trPr>
-          <w:trHeight w:val="328" w:hRule="exact"/>
+          <w:trHeight w:val="311" w:hRule="exact"/>
         </w:trPr>
         <w:tc>
           <w:tcPr>
@@ -3134,7 +2763,7 @@
                 <w:b/>
                 <w:sz w:val="18"/>
               </w:rPr>
-              <w:t>２・３（知識・技能）　/43</w:t>
+              <w:t>２・３（知識・技能）　/44</w:t>
             </w:r>
           </w:p>
         </w:tc>
@@ -3154,7 +2783,7 @@
                 <w:b/>
                 <w:sz w:val="18"/>
               </w:rPr>
-              <w:t>１・４〜７（思考・判断・表現）　/57</w:t>
+              <w:t>１・４〜７（思考・判断・表現）　/60</w:t>
             </w:r>
           </w:p>
         </w:tc>
@@ -3174,7 +2803,7 @@
                 <w:b/>
                 <w:sz w:val="18"/>
               </w:rPr>
-              <w:t>合計　/100</w:t>
+              <w:t>合計　/104</w:t>
             </w:r>
           </w:p>
         </w:tc>
@@ -3230,6 +2859,495 @@
             <w:pPr>
               <w:spacing w:before="0" w:after="0"/>
               <w:jc w:val="center"/>
+            </w:pPr>
+            <w:r>
+              <w:rPr>
+                <w:rFonts w:ascii="Arial" w:hAnsi="Arial" w:eastAsia="MS PGothic"/>
+                <w:b w:val="0"/>
+                <w:sz w:val="21"/>
+              </w:rPr>
+            </w:r>
+          </w:p>
+        </w:tc>
+      </w:tr>
+    </w:tbl>
+    <w:p>
+      <w:pPr>
+        <w:spacing w:before="0" w:after="0" w:lineRule="exact" w:line="20"/>
+      </w:pPr>
+      <w:r>
+        <w:br w:type="page"/>
+      </w:r>
+    </w:p>
+    <w:tbl>
+      <w:tblPr>
+        <w:tblStyle w:val="TableGrid"/>
+        <w:tblW w:type="auto" w:w="0"/>
+        <w:jc w:val="left"/>
+        <w:tblLook w:firstColumn="1" w:firstRow="1" w:lastColumn="0" w:lastRow="0" w:noHBand="0" w:noVBand="1" w:val="04A0"/>
+      </w:tblPr>
+      <w:tblGrid>
+        <w:gridCol w:w="2636"/>
+        <w:gridCol w:w="2636"/>
+        <w:gridCol w:w="2636"/>
+        <w:gridCol w:w="2636"/>
+      </w:tblGrid>
+      <w:tr>
+        <w:trPr>
+          <w:trHeight w:val="408" w:hRule="exact"/>
+        </w:trPr>
+        <w:tc>
+          <w:tcPr>
+            <w:tcW w:type="dxa" w:w="1134"/>
+            <w:vAlign w:val="center"/>
+          </w:tcPr>
+          <w:p>
+            <w:pPr>
+              <w:spacing w:before="0" w:after="0"/>
+              <w:jc w:val="center"/>
+            </w:pPr>
+            <w:r>
+              <w:rPr>
+                <w:rFonts w:ascii="Arial" w:hAnsi="Arial" w:eastAsia="MS PGothic"/>
+                <w:b/>
+                <w:sz w:val="20"/>
+              </w:rPr>
+              <w:t>Class</w:t>
+            </w:r>
+          </w:p>
+        </w:tc>
+        <w:tc>
+          <w:tcPr>
+            <w:tcW w:type="dxa" w:w="4138"/>
+            <w:gridSpan w:val="3"/>
+          </w:tcPr>
+          <w:p>
+            <w:pPr>
+              <w:spacing w:before="0" w:after="0"/>
+              <w:jc w:val="center"/>
+            </w:pPr>
+            <w:r>
+              <w:rPr>
+                <w:rFonts w:ascii="Arial" w:hAnsi="Arial" w:eastAsia="MS PGothic"/>
+                <w:b/>
+                <w:sz w:val="20"/>
+              </w:rPr>
+              <w:t>No</w:t>
+            </w:r>
+          </w:p>
+        </w:tc>
+      </w:tr>
+    </w:tbl>
+    <w:p>
+      <w:pPr>
+        <w:spacing w:before="40" w:after="40" w:lineRule="exact" w:line="280"/>
+      </w:pPr>
+      <w:r>
+        <w:rPr>
+          <w:rFonts w:ascii="Arial" w:hAnsi="Arial" w:eastAsia="MS PGothic"/>
+          <w:b/>
+          <w:sz w:val="22"/>
+        </w:rPr>
+        <w:t>７　（思考・判断・表現　6点）　Writing: Book Report</w:t>
+      </w:r>
+    </w:p>
+    <w:p>
+      <w:pPr>
+        <w:spacing w:before="0" w:after="40" w:lineRule="exact" w:line="240"/>
+        <w:jc w:val="left"/>
+      </w:pPr>
+      <w:r>
+        <w:rPr>
+          <w:rFonts w:ascii="Arial" w:hAnsi="Arial" w:eastAsia="MS PGothic"/>
+          <w:b w:val="0"/>
+          <w:sz w:val="19"/>
+        </w:rPr>
+        <w:t>Introduce a book you have read recently or a book you like.  (at least 50 words)</w:t>
+      </w:r>
+    </w:p>
+    <w:tbl>
+      <w:tblPr>
+        <w:tblStyle w:val="TableGrid"/>
+        <w:tblW w:type="auto" w:w="0"/>
+        <w:jc w:val="left"/>
+        <w:tblLook w:firstColumn="1" w:firstRow="1" w:lastColumn="0" w:lastRow="0" w:noHBand="0" w:noVBand="1" w:val="04A0"/>
+      </w:tblPr>
+      <w:tblGrid>
+        <w:gridCol w:w="10546"/>
+      </w:tblGrid>
+      <w:tr>
+        <w:trPr>
+          <w:trHeight w:val="850" w:hRule="exact"/>
+        </w:trPr>
+        <w:tc>
+          <w:tcPr>
+            <w:tcW w:type="dxa" w:w="10545"/>
+            <w:vAlign w:val="center"/>
+          </w:tcPr>
+          <w:p>
+            <w:pPr>
+              <w:spacing w:before="0" w:after="0"/>
+              <w:jc w:val="left"/>
+            </w:pPr>
+            <w:r>
+              <w:rPr>
+                <w:rFonts w:ascii="Arial" w:hAnsi="Arial" w:eastAsia="MS PGothic"/>
+                <w:b w:val="0"/>
+                <w:sz w:val="21"/>
+              </w:rPr>
+            </w:r>
+          </w:p>
+        </w:tc>
+      </w:tr>
+      <w:tr>
+        <w:trPr>
+          <w:trHeight w:val="850" w:hRule="exact"/>
+        </w:trPr>
+        <w:tc>
+          <w:tcPr>
+            <w:tcW w:type="dxa" w:w="10545"/>
+            <w:vAlign w:val="center"/>
+          </w:tcPr>
+          <w:p>
+            <w:pPr>
+              <w:spacing w:before="0" w:after="0"/>
+              <w:jc w:val="left"/>
+            </w:pPr>
+            <w:r>
+              <w:rPr>
+                <w:rFonts w:ascii="Arial" w:hAnsi="Arial" w:eastAsia="MS PGothic"/>
+                <w:b w:val="0"/>
+                <w:sz w:val="21"/>
+              </w:rPr>
+            </w:r>
+          </w:p>
+        </w:tc>
+      </w:tr>
+      <w:tr>
+        <w:trPr>
+          <w:trHeight w:val="850" w:hRule="exact"/>
+        </w:trPr>
+        <w:tc>
+          <w:tcPr>
+            <w:tcW w:type="dxa" w:w="10545"/>
+            <w:vAlign w:val="center"/>
+          </w:tcPr>
+          <w:p>
+            <w:pPr>
+              <w:spacing w:before="0" w:after="0"/>
+              <w:jc w:val="left"/>
+            </w:pPr>
+            <w:r>
+              <w:rPr>
+                <w:rFonts w:ascii="Arial" w:hAnsi="Arial" w:eastAsia="MS PGothic"/>
+                <w:b w:val="0"/>
+                <w:sz w:val="21"/>
+              </w:rPr>
+            </w:r>
+          </w:p>
+        </w:tc>
+      </w:tr>
+      <w:tr>
+        <w:trPr>
+          <w:trHeight w:val="850" w:hRule="exact"/>
+        </w:trPr>
+        <w:tc>
+          <w:tcPr>
+            <w:tcW w:type="dxa" w:w="10545"/>
+            <w:vAlign w:val="center"/>
+          </w:tcPr>
+          <w:p>
+            <w:pPr>
+              <w:spacing w:before="0" w:after="0"/>
+              <w:jc w:val="left"/>
+            </w:pPr>
+            <w:r>
+              <w:rPr>
+                <w:rFonts w:ascii="Arial" w:hAnsi="Arial" w:eastAsia="MS PGothic"/>
+                <w:b w:val="0"/>
+                <w:sz w:val="21"/>
+              </w:rPr>
+            </w:r>
+          </w:p>
+        </w:tc>
+      </w:tr>
+      <w:tr>
+        <w:trPr>
+          <w:trHeight w:val="850" w:hRule="exact"/>
+        </w:trPr>
+        <w:tc>
+          <w:tcPr>
+            <w:tcW w:type="dxa" w:w="10545"/>
+            <w:vAlign w:val="center"/>
+          </w:tcPr>
+          <w:p>
+            <w:pPr>
+              <w:spacing w:before="0" w:after="0"/>
+              <w:jc w:val="left"/>
+            </w:pPr>
+            <w:r>
+              <w:rPr>
+                <w:rFonts w:ascii="Arial" w:hAnsi="Arial" w:eastAsia="MS PGothic"/>
+                <w:b w:val="0"/>
+                <w:sz w:val="21"/>
+              </w:rPr>
+            </w:r>
+          </w:p>
+        </w:tc>
+      </w:tr>
+      <w:tr>
+        <w:trPr>
+          <w:trHeight w:val="850" w:hRule="exact"/>
+        </w:trPr>
+        <w:tc>
+          <w:tcPr>
+            <w:tcW w:type="dxa" w:w="10545"/>
+            <w:vAlign w:val="center"/>
+          </w:tcPr>
+          <w:p>
+            <w:pPr>
+              <w:spacing w:before="0" w:after="0"/>
+              <w:jc w:val="left"/>
+            </w:pPr>
+            <w:r>
+              <w:rPr>
+                <w:rFonts w:ascii="Arial" w:hAnsi="Arial" w:eastAsia="MS PGothic"/>
+                <w:b w:val="0"/>
+                <w:sz w:val="21"/>
+              </w:rPr>
+            </w:r>
+          </w:p>
+        </w:tc>
+      </w:tr>
+      <w:tr>
+        <w:trPr>
+          <w:trHeight w:val="850" w:hRule="exact"/>
+        </w:trPr>
+        <w:tc>
+          <w:tcPr>
+            <w:tcW w:type="dxa" w:w="10545"/>
+            <w:vAlign w:val="center"/>
+          </w:tcPr>
+          <w:p>
+            <w:pPr>
+              <w:spacing w:before="0" w:after="0"/>
+              <w:jc w:val="left"/>
+            </w:pPr>
+            <w:r>
+              <w:rPr>
+                <w:rFonts w:ascii="Arial" w:hAnsi="Arial" w:eastAsia="MS PGothic"/>
+                <w:b w:val="0"/>
+                <w:sz w:val="21"/>
+              </w:rPr>
+            </w:r>
+          </w:p>
+        </w:tc>
+      </w:tr>
+      <w:tr>
+        <w:trPr>
+          <w:trHeight w:val="850" w:hRule="exact"/>
+        </w:trPr>
+        <w:tc>
+          <w:tcPr>
+            <w:tcW w:type="dxa" w:w="10545"/>
+            <w:vAlign w:val="center"/>
+          </w:tcPr>
+          <w:p>
+            <w:pPr>
+              <w:spacing w:before="0" w:after="0"/>
+              <w:jc w:val="left"/>
+            </w:pPr>
+            <w:r>
+              <w:rPr>
+                <w:rFonts w:ascii="Arial" w:hAnsi="Arial" w:eastAsia="MS PGothic"/>
+                <w:b w:val="0"/>
+                <w:sz w:val="21"/>
+              </w:rPr>
+            </w:r>
+          </w:p>
+        </w:tc>
+      </w:tr>
+      <w:tr>
+        <w:trPr>
+          <w:trHeight w:val="850" w:hRule="exact"/>
+        </w:trPr>
+        <w:tc>
+          <w:tcPr>
+            <w:tcW w:type="dxa" w:w="10545"/>
+            <w:vAlign w:val="center"/>
+          </w:tcPr>
+          <w:p>
+            <w:pPr>
+              <w:spacing w:before="0" w:after="0"/>
+              <w:jc w:val="left"/>
+            </w:pPr>
+            <w:r>
+              <w:rPr>
+                <w:rFonts w:ascii="Arial" w:hAnsi="Arial" w:eastAsia="MS PGothic"/>
+                <w:b w:val="0"/>
+                <w:sz w:val="21"/>
+              </w:rPr>
+            </w:r>
+          </w:p>
+        </w:tc>
+      </w:tr>
+      <w:tr>
+        <w:trPr>
+          <w:trHeight w:val="850" w:hRule="exact"/>
+        </w:trPr>
+        <w:tc>
+          <w:tcPr>
+            <w:tcW w:type="dxa" w:w="10545"/>
+            <w:vAlign w:val="center"/>
+          </w:tcPr>
+          <w:p>
+            <w:pPr>
+              <w:spacing w:before="0" w:after="0"/>
+              <w:jc w:val="left"/>
+            </w:pPr>
+            <w:r>
+              <w:rPr>
+                <w:rFonts w:ascii="Arial" w:hAnsi="Arial" w:eastAsia="MS PGothic"/>
+                <w:b w:val="0"/>
+                <w:sz w:val="21"/>
+              </w:rPr>
+            </w:r>
+          </w:p>
+        </w:tc>
+      </w:tr>
+      <w:tr>
+        <w:trPr>
+          <w:trHeight w:val="850" w:hRule="exact"/>
+        </w:trPr>
+        <w:tc>
+          <w:tcPr>
+            <w:tcW w:type="dxa" w:w="10545"/>
+            <w:vAlign w:val="center"/>
+          </w:tcPr>
+          <w:p>
+            <w:pPr>
+              <w:spacing w:before="0" w:after="0"/>
+              <w:jc w:val="left"/>
+            </w:pPr>
+            <w:r>
+              <w:rPr>
+                <w:rFonts w:ascii="Arial" w:hAnsi="Arial" w:eastAsia="MS PGothic"/>
+                <w:b w:val="0"/>
+                <w:sz w:val="21"/>
+              </w:rPr>
+            </w:r>
+          </w:p>
+        </w:tc>
+      </w:tr>
+      <w:tr>
+        <w:trPr>
+          <w:trHeight w:val="850" w:hRule="exact"/>
+        </w:trPr>
+        <w:tc>
+          <w:tcPr>
+            <w:tcW w:type="dxa" w:w="10545"/>
+            <w:vAlign w:val="center"/>
+          </w:tcPr>
+          <w:p>
+            <w:pPr>
+              <w:spacing w:before="0" w:after="0"/>
+              <w:jc w:val="left"/>
+            </w:pPr>
+            <w:r>
+              <w:rPr>
+                <w:rFonts w:ascii="Arial" w:hAnsi="Arial" w:eastAsia="MS PGothic"/>
+                <w:b w:val="0"/>
+                <w:sz w:val="21"/>
+              </w:rPr>
+            </w:r>
+          </w:p>
+        </w:tc>
+      </w:tr>
+      <w:tr>
+        <w:trPr>
+          <w:trHeight w:val="850" w:hRule="exact"/>
+        </w:trPr>
+        <w:tc>
+          <w:tcPr>
+            <w:tcW w:type="dxa" w:w="10545"/>
+            <w:vAlign w:val="center"/>
+          </w:tcPr>
+          <w:p>
+            <w:pPr>
+              <w:spacing w:before="0" w:after="0"/>
+              <w:jc w:val="left"/>
+            </w:pPr>
+            <w:r>
+              <w:rPr>
+                <w:rFonts w:ascii="Arial" w:hAnsi="Arial" w:eastAsia="MS PGothic"/>
+                <w:b w:val="0"/>
+                <w:sz w:val="21"/>
+              </w:rPr>
+            </w:r>
+          </w:p>
+        </w:tc>
+      </w:tr>
+      <w:tr>
+        <w:trPr>
+          <w:trHeight w:val="850" w:hRule="exact"/>
+        </w:trPr>
+        <w:tc>
+          <w:tcPr>
+            <w:tcW w:type="dxa" w:w="10545"/>
+            <w:vAlign w:val="center"/>
+          </w:tcPr>
+          <w:p>
+            <w:pPr>
+              <w:spacing w:before="0" w:after="0"/>
+              <w:jc w:val="left"/>
+            </w:pPr>
+            <w:r>
+              <w:rPr>
+                <w:rFonts w:ascii="Arial" w:hAnsi="Arial" w:eastAsia="MS PGothic"/>
+                <w:b w:val="0"/>
+                <w:sz w:val="21"/>
+              </w:rPr>
+            </w:r>
+          </w:p>
+        </w:tc>
+      </w:tr>
+      <w:tr>
+        <w:trPr>
+          <w:trHeight w:val="850" w:hRule="exact"/>
+        </w:trPr>
+        <w:tc>
+          <w:tcPr>
+            <w:tcW w:type="dxa" w:w="10545"/>
+            <w:vAlign w:val="center"/>
+          </w:tcPr>
+          <w:p>
+            <w:pPr>
+              <w:spacing w:before="0" w:after="0"/>
+              <w:jc w:val="left"/>
+            </w:pPr>
+            <w:r>
+              <w:rPr>
+                <w:rFonts w:ascii="Arial" w:hAnsi="Arial" w:eastAsia="MS PGothic"/>
+                <w:b w:val="0"/>
+                <w:sz w:val="21"/>
+              </w:rPr>
+            </w:r>
+          </w:p>
+        </w:tc>
+      </w:tr>
+      <w:tr>
+        <w:trPr>
+          <w:trHeight w:val="850" w:hRule="exact"/>
+        </w:trPr>
+        <w:tc>
+          <w:tcPr>
+            <w:tcW w:type="dxa" w:w="10545"/>
+            <w:vAlign w:val="center"/>
+          </w:tcPr>
+          <w:p>
+            <w:pPr>
+              <w:spacing w:before="0" w:after="0"/>
+              <w:jc w:val="left"/>
             </w:pPr>
             <w:r>
               <w:rPr>

</xml_diff>